<commit_message>
Add VCTK fine-tuning results and update report
- Added VCTK fine-tuning experiment results
- Updated report with migration learning innovation section
- Added checkpoint comparison audio files
- Updated .gitignore to exclude large model files
</commit_message>
<xml_diff>
--- a/《智能语音处理》课程大作业报告.docx
+++ b/《智能语音处理》课程大作业报告.docx
@@ -3185,6 +3185,761 @@
     </w:p>
     <w:p>
       <w:pPr>
+        <w:pStyle w:val="Heading3"/>
+        <w:spacing w:after="120" w:before="240"/>
+      </w:pPr>
+      <w:r>
+        <w:rPr>
+          <w:rFonts w:ascii="Times New Roman" w:cs="Times New Roman" w:eastAsia="Times New Roman" w:hAnsi="Times New Roman"/>
+          <w:b/>
+          <w:bCs/>
+        </w:rPr>
+        <w:t xml:space="preserve">6.2.1  跨数据集迁移学习探索</w:t>
+      </w:r>
+    </w:p>
+    <w:p>
+      <w:pPr>
+        <w:spacing w:after="120" w:line="360"/>
+        <w:jc w:val="both"/>
+      </w:pPr>
+      <w:r>
+        <w:rPr>
+          <w:rFonts w:ascii="Times New Roman" w:cs="Times New Roman" w:eastAsia="Times New Roman" w:hAnsi="Times New Roman"/>
+          <w:b w:val="false"/>
+          <w:bCs w:val="false"/>
+          <w:sz w:val="22"/>
+          <w:szCs w:val="22"/>
+        </w:rPr>
+        <w:t xml:space="preserve">本项目还尝试了一项创新性的迁移学习实验：使用 VCTK 多说话人模型在 LJSpeech 单说话人数据集上进行微调。VCTK 数据集包含 109 个英语说话人的语音数据，而 LJSpeech 仅包含单个女性说话人的语音。这种跨数据集、跨说话人的迁移学习在语音合成领域具有重要的研究意义。</w:t>
+      </w:r>
+    </w:p>
+    <w:p>
+      <w:pPr>
+        <w:spacing w:after="120" w:line="360"/>
+        <w:jc w:val="both"/>
+      </w:pPr>
+      <w:r>
+        <w:rPr>
+          <w:rFonts w:ascii="Times New Roman" w:cs="Times New Roman" w:eastAsia="Times New Roman" w:hAnsi="Times New Roman"/>
+          <w:b w:val="false"/>
+          <w:bCs w:val="false"/>
+          <w:sz w:val="22"/>
+          <w:szCs w:val="22"/>
+        </w:rPr>
+        <w:t xml:space="preserve">实验过程中，我们将 LJSpeech 的所有训练样本映射到 VCTK 数据集中的一个说话人（p225），然后使用 VCTK 预训练模型进行微调。训练过程持续了约 20 小时，完成了 3 个 epoch 的微调。实验结果表明，经过微调后，模型在 STOI（短时客观可懂度）指标上从 0.0821 提升到 0.2185，提升了 166%。同时，音频时长预测的准确性也得到了显著改善，从偏差 6 秒降低到 1 秒以内。</w:t>
+      </w:r>
+    </w:p>
+    <w:tbl>
+      <w:tblPr>
+        <w:tblW w:type="dxa" w:w="9360"/>
+        <w:tblBorders>
+          <w:top w:val="single" w:color="auto" w:sz="4"/>
+          <w:left w:val="single" w:color="auto" w:sz="4"/>
+          <w:bottom w:val="single" w:color="auto" w:sz="4"/>
+          <w:right w:val="single" w:color="auto" w:sz="4"/>
+          <w:insideH w:val="single" w:color="auto" w:sz="4"/>
+          <w:insideV w:val="single" w:color="auto" w:sz="4"/>
+        </w:tblBorders>
+      </w:tblPr>
+      <w:tblGrid>
+        <w:gridCol w:w="2340"/>
+        <w:gridCol w:w="1755"/>
+        <w:gridCol w:w="1755"/>
+        <w:gridCol w:w="1755"/>
+        <w:gridCol w:w="1755"/>
+      </w:tblGrid>
+      <w:tr>
+        <w:tc>
+          <w:tcPr>
+            <w:tcW w:type="dxa" w:w="2340"/>
+            <w:tcBorders>
+              <w:top w:val="single" w:color="CCCCCC" w:sz="1"/>
+              <w:left w:val="single" w:color="CCCCCC" w:sz="1"/>
+              <w:bottom w:val="single" w:color="CCCCCC" w:sz="1"/>
+              <w:right w:val="single" w:color="CCCCCC" w:sz="1"/>
+            </w:tcBorders>
+            <w:shd w:fill="D5E8F0" w:val="clear"/>
+            <w:tcMar>
+              <w:top w:type="dxa" w:w="80"/>
+              <w:left w:type="dxa" w:w="120"/>
+              <w:bottom w:type="dxa" w:w="80"/>
+              <w:right w:type="dxa" w:w="120"/>
+            </w:tcMar>
+            <w:vAlign w:val="center"/>
+          </w:tcPr>
+          <w:p>
+            <w:pPr>
+              <w:jc w:val="center"/>
+            </w:pPr>
+            <w:r>
+              <w:rPr>
+                <w:rFonts w:ascii="Times New Roman" w:cs="Times New Roman" w:eastAsia="Times New Roman" w:hAnsi="Times New Roman"/>
+                <w:b/>
+                <w:bCs/>
+                <w:sz w:val="22"/>
+                <w:szCs w:val="22"/>
+              </w:rPr>
+              <w:t xml:space="preserve">检查点</w:t>
+            </w:r>
+          </w:p>
+        </w:tc>
+        <w:tc>
+          <w:tcPr>
+            <w:tcW w:type="dxa" w:w="1755"/>
+            <w:tcBorders>
+              <w:top w:val="single" w:color="CCCCCC" w:sz="1"/>
+              <w:left w:val="single" w:color="CCCCCC" w:sz="1"/>
+              <w:bottom w:val="single" w:color="CCCCCC" w:sz="1"/>
+              <w:right w:val="single" w:color="CCCCCC" w:sz="1"/>
+            </w:tcBorders>
+            <w:shd w:fill="D5E8F0" w:val="clear"/>
+            <w:tcMar>
+              <w:top w:type="dxa" w:w="80"/>
+              <w:left w:type="dxa" w:w="120"/>
+              <w:bottom w:type="dxa" w:w="80"/>
+              <w:right w:type="dxa" w:w="120"/>
+            </w:tcMar>
+            <w:vAlign w:val="center"/>
+          </w:tcPr>
+          <w:p>
+            <w:pPr>
+              <w:jc w:val="center"/>
+            </w:pPr>
+            <w:r>
+              <w:rPr>
+                <w:rFonts w:ascii="Times New Roman" w:cs="Times New Roman" w:eastAsia="Times New Roman" w:hAnsi="Times New Roman"/>
+                <w:b/>
+                <w:bCs/>
+                <w:sz w:val="22"/>
+                <w:szCs w:val="22"/>
+              </w:rPr>
+              <w:t xml:space="preserve">PESQ</w:t>
+            </w:r>
+          </w:p>
+        </w:tc>
+        <w:tc>
+          <w:tcPr>
+            <w:tcW w:type="dxa" w:w="1755"/>
+            <w:tcBorders>
+              <w:top w:val="single" w:color="CCCCCC" w:sz="1"/>
+              <w:left w:val="single" w:color="CCCCCC" w:sz="1"/>
+              <w:bottom w:val="single" w:color="CCCCCC" w:sz="1"/>
+              <w:right w:val="single" w:color="CCCCCC" w:sz="1"/>
+            </w:tcBorders>
+            <w:shd w:fill="D5E8F0" w:val="clear"/>
+            <w:tcMar>
+              <w:top w:type="dxa" w:w="80"/>
+              <w:left w:type="dxa" w:w="120"/>
+              <w:bottom w:type="dxa" w:w="80"/>
+              <w:right w:type="dxa" w:w="120"/>
+            </w:tcMar>
+            <w:vAlign w:val="center"/>
+          </w:tcPr>
+          <w:p>
+            <w:pPr>
+              <w:jc w:val="center"/>
+            </w:pPr>
+            <w:r>
+              <w:rPr>
+                <w:rFonts w:ascii="Times New Roman" w:cs="Times New Roman" w:eastAsia="Times New Roman" w:hAnsi="Times New Roman"/>
+                <w:b/>
+                <w:bCs/>
+                <w:sz w:val="22"/>
+                <w:szCs w:val="22"/>
+              </w:rPr>
+              <w:t xml:space="preserve">STOI</w:t>
+            </w:r>
+          </w:p>
+        </w:tc>
+        <w:tc>
+          <w:tcPr>
+            <w:tcW w:type="dxa" w:w="1755"/>
+            <w:tcBorders>
+              <w:top w:val="single" w:color="CCCCCC" w:sz="1"/>
+              <w:left w:val="single" w:color="CCCCCC" w:sz="1"/>
+              <w:bottom w:val="single" w:color="CCCCCC" w:sz="1"/>
+              <w:right w:val="single" w:color="CCCCCC" w:sz="1"/>
+            </w:tcBorders>
+            <w:shd w:fill="D5E8F0" w:val="clear"/>
+            <w:tcMar>
+              <w:top w:type="dxa" w:w="80"/>
+              <w:left w:type="dxa" w:w="120"/>
+              <w:bottom w:type="dxa" w:w="80"/>
+              <w:right w:type="dxa" w:w="120"/>
+            </w:tcMar>
+            <w:vAlign w:val="center"/>
+          </w:tcPr>
+          <w:p>
+            <w:pPr>
+              <w:jc w:val="center"/>
+            </w:pPr>
+            <w:r>
+              <w:rPr>
+                <w:rFonts w:ascii="Times New Roman" w:cs="Times New Roman" w:eastAsia="Times New Roman" w:hAnsi="Times New Roman"/>
+                <w:b/>
+                <w:bCs/>
+                <w:sz w:val="22"/>
+                <w:szCs w:val="22"/>
+              </w:rPr>
+              <w:t xml:space="preserve">时长准确性</w:t>
+            </w:r>
+          </w:p>
+        </w:tc>
+        <w:tc>
+          <w:tcPr>
+            <w:tcW w:type="dxa" w:w="1755"/>
+            <w:tcBorders>
+              <w:top w:val="single" w:color="CCCCCC" w:sz="1"/>
+              <w:left w:val="single" w:color="CCCCCC" w:sz="1"/>
+              <w:bottom w:val="single" w:color="CCCCCC" w:sz="1"/>
+              <w:right w:val="single" w:color="CCCCCC" w:sz="1"/>
+            </w:tcBorders>
+            <w:shd w:fill="D5E8F0" w:val="clear"/>
+            <w:tcMar>
+              <w:top w:type="dxa" w:w="80"/>
+              <w:left w:type="dxa" w:w="120"/>
+              <w:bottom w:type="dxa" w:w="80"/>
+              <w:right w:type="dxa" w:w="120"/>
+            </w:tcMar>
+            <w:vAlign w:val="center"/>
+          </w:tcPr>
+          <w:p>
+            <w:pPr>
+              <w:jc w:val="center"/>
+            </w:pPr>
+            <w:r>
+              <w:rPr>
+                <w:rFonts w:ascii="Times New Roman" w:cs="Times New Roman" w:eastAsia="Times New Roman" w:hAnsi="Times New Roman"/>
+                <w:b/>
+                <w:bCs/>
+                <w:sz w:val="22"/>
+                <w:szCs w:val="22"/>
+              </w:rPr>
+              <w:t xml:space="preserve">训练Epoch</w:t>
+            </w:r>
+          </w:p>
+        </w:tc>
+      </w:tr>
+      <w:tr>
+        <w:tc>
+          <w:tcPr>
+            <w:tcW w:type="dxa" w:w="2340"/>
+            <w:tcBorders>
+              <w:top w:val="single" w:color="CCCCCC" w:sz="1"/>
+              <w:left w:val="single" w:color="CCCCCC" w:sz="1"/>
+              <w:bottom w:val="single" w:color="CCCCCC" w:sz="1"/>
+              <w:right w:val="single" w:color="CCCCCC" w:sz="1"/>
+            </w:tcBorders>
+            <w:tcMar>
+              <w:top w:type="dxa" w:w="80"/>
+              <w:left w:type="dxa" w:w="120"/>
+              <w:bottom w:type="dxa" w:w="80"/>
+              <w:right w:type="dxa" w:w="120"/>
+            </w:tcMar>
+            <w:vAlign w:val="center"/>
+          </w:tcPr>
+          <w:p>
+            <w:pPr>
+              <w:jc w:val="center"/>
+            </w:pPr>
+            <w:r>
+              <w:rPr>
+                <w:rFonts w:ascii="Times New Roman" w:cs="Times New Roman" w:eastAsia="Times New Roman" w:hAnsi="Times New Roman"/>
+                <w:b w:val="false"/>
+                <w:bCs w:val="false"/>
+                <w:sz w:val="22"/>
+                <w:szCs w:val="22"/>
+              </w:rPr>
+              <w:t xml:space="preserve">Checkpoint 2000</w:t>
+            </w:r>
+          </w:p>
+        </w:tc>
+        <w:tc>
+          <w:tcPr>
+            <w:tcW w:type="dxa" w:w="1755"/>
+            <w:tcBorders>
+              <w:top w:val="single" w:color="CCCCCC" w:sz="1"/>
+              <w:left w:val="single" w:color="CCCCCC" w:sz="1"/>
+              <w:bottom w:val="single" w:color="CCCCCC" w:sz="1"/>
+              <w:right w:val="single" w:color="CCCCCC" w:sz="1"/>
+            </w:tcBorders>
+            <w:tcMar>
+              <w:top w:type="dxa" w:w="80"/>
+              <w:left w:type="dxa" w:w="120"/>
+              <w:bottom w:type="dxa" w:w="80"/>
+              <w:right w:type="dxa" w:w="120"/>
+            </w:tcMar>
+            <w:vAlign w:val="center"/>
+          </w:tcPr>
+          <w:p>
+            <w:pPr>
+              <w:jc w:val="center"/>
+            </w:pPr>
+            <w:r>
+              <w:rPr>
+                <w:rFonts w:ascii="Times New Roman" w:cs="Times New Roman" w:eastAsia="Times New Roman" w:hAnsi="Times New Roman"/>
+                <w:b w:val="false"/>
+                <w:bCs w:val="false"/>
+                <w:sz w:val="22"/>
+                <w:szCs w:val="22"/>
+              </w:rPr>
+              <w:t xml:space="preserve">1.0488</w:t>
+            </w:r>
+          </w:p>
+        </w:tc>
+        <w:tc>
+          <w:tcPr>
+            <w:tcW w:type="dxa" w:w="1755"/>
+            <w:tcBorders>
+              <w:top w:val="single" w:color="CCCCCC" w:sz="1"/>
+              <w:left w:val="single" w:color="CCCCCC" w:sz="1"/>
+              <w:bottom w:val="single" w:color="CCCCCC" w:sz="1"/>
+              <w:right w:val="single" w:color="CCCCCC" w:sz="1"/>
+            </w:tcBorders>
+            <w:tcMar>
+              <w:top w:type="dxa" w:w="80"/>
+              <w:left w:type="dxa" w:w="120"/>
+              <w:bottom w:type="dxa" w:w="80"/>
+              <w:right w:type="dxa" w:w="120"/>
+            </w:tcMar>
+            <w:vAlign w:val="center"/>
+          </w:tcPr>
+          <w:p>
+            <w:pPr>
+              <w:jc w:val="center"/>
+            </w:pPr>
+            <w:r>
+              <w:rPr>
+                <w:rFonts w:ascii="Times New Roman" w:cs="Times New Roman" w:eastAsia="Times New Roman" w:hAnsi="Times New Roman"/>
+                <w:b w:val="false"/>
+                <w:bCs w:val="false"/>
+                <w:sz w:val="22"/>
+                <w:szCs w:val="22"/>
+              </w:rPr>
+              <w:t xml:space="preserve">0.0821</w:t>
+            </w:r>
+          </w:p>
+        </w:tc>
+        <w:tc>
+          <w:tcPr>
+            <w:tcW w:type="dxa" w:w="1755"/>
+            <w:tcBorders>
+              <w:top w:val="single" w:color="CCCCCC" w:sz="1"/>
+              <w:left w:val="single" w:color="CCCCCC" w:sz="1"/>
+              <w:bottom w:val="single" w:color="CCCCCC" w:sz="1"/>
+              <w:right w:val="single" w:color="CCCCCC" w:sz="1"/>
+            </w:tcBorders>
+            <w:tcMar>
+              <w:top w:type="dxa" w:w="80"/>
+              <w:left w:type="dxa" w:w="120"/>
+              <w:bottom w:type="dxa" w:w="80"/>
+              <w:right w:type="dxa" w:w="120"/>
+            </w:tcMar>
+            <w:vAlign w:val="center"/>
+          </w:tcPr>
+          <w:p>
+            <w:pPr>
+              <w:jc w:val="center"/>
+            </w:pPr>
+            <w:r>
+              <w:rPr>
+                <w:rFonts w:ascii="Times New Roman" w:cs="Times New Roman" w:eastAsia="Times New Roman" w:hAnsi="Times New Roman"/>
+                <w:b w:val="false"/>
+                <w:bCs w:val="false"/>
+                <w:sz w:val="22"/>
+                <w:szCs w:val="22"/>
+              </w:rPr>
+              <w:t xml:space="preserve">差</w:t>
+            </w:r>
+          </w:p>
+        </w:tc>
+        <w:tc>
+          <w:tcPr>
+            <w:tcW w:type="dxa" w:w="1755"/>
+            <w:tcBorders>
+              <w:top w:val="single" w:color="CCCCCC" w:sz="1"/>
+              <w:left w:val="single" w:color="CCCCCC" w:sz="1"/>
+              <w:bottom w:val="single" w:color="CCCCCC" w:sz="1"/>
+              <w:right w:val="single" w:color="CCCCCC" w:sz="1"/>
+            </w:tcBorders>
+            <w:tcMar>
+              <w:top w:type="dxa" w:w="80"/>
+              <w:left w:type="dxa" w:w="120"/>
+              <w:bottom w:type="dxa" w:w="80"/>
+              <w:right w:type="dxa" w:w="120"/>
+            </w:tcMar>
+            <w:vAlign w:val="center"/>
+          </w:tcPr>
+          <w:p>
+            <w:pPr>
+              <w:jc w:val="center"/>
+            </w:pPr>
+            <w:r>
+              <w:rPr>
+                <w:rFonts w:ascii="Times New Roman" w:cs="Times New Roman" w:eastAsia="Times New Roman" w:hAnsi="Times New Roman"/>
+                <w:b w:val="false"/>
+                <w:bCs w:val="false"/>
+                <w:sz w:val="22"/>
+                <w:szCs w:val="22"/>
+              </w:rPr>
+              <w:t xml:space="preserve">1</w:t>
+            </w:r>
+          </w:p>
+        </w:tc>
+      </w:tr>
+      <w:tr>
+        <w:tc>
+          <w:tcPr>
+            <w:tcW w:type="dxa" w:w="2340"/>
+            <w:tcBorders>
+              <w:top w:val="single" w:color="CCCCCC" w:sz="1"/>
+              <w:left w:val="single" w:color="CCCCCC" w:sz="1"/>
+              <w:bottom w:val="single" w:color="CCCCCC" w:sz="1"/>
+              <w:right w:val="single" w:color="CCCCCC" w:sz="1"/>
+            </w:tcBorders>
+            <w:tcMar>
+              <w:top w:type="dxa" w:w="80"/>
+              <w:left w:type="dxa" w:w="120"/>
+              <w:bottom w:type="dxa" w:w="80"/>
+              <w:right w:type="dxa" w:w="120"/>
+            </w:tcMar>
+            <w:vAlign w:val="center"/>
+          </w:tcPr>
+          <w:p>
+            <w:pPr>
+              <w:jc w:val="center"/>
+            </w:pPr>
+            <w:r>
+              <w:rPr>
+                <w:rFonts w:ascii="Times New Roman" w:cs="Times New Roman" w:eastAsia="Times New Roman" w:hAnsi="Times New Roman"/>
+                <w:b w:val="false"/>
+                <w:bCs w:val="false"/>
+                <w:sz w:val="22"/>
+                <w:szCs w:val="22"/>
+              </w:rPr>
+              <w:t xml:space="preserve">Checkpoint 5000</w:t>
+            </w:r>
+          </w:p>
+        </w:tc>
+        <w:tc>
+          <w:tcPr>
+            <w:tcW w:type="dxa" w:w="1755"/>
+            <w:tcBorders>
+              <w:top w:val="single" w:color="CCCCCC" w:sz="1"/>
+              <w:left w:val="single" w:color="CCCCCC" w:sz="1"/>
+              <w:bottom w:val="single" w:color="CCCCCC" w:sz="1"/>
+              <w:right w:val="single" w:color="CCCCCC" w:sz="1"/>
+            </w:tcBorders>
+            <w:tcMar>
+              <w:top w:type="dxa" w:w="80"/>
+              <w:left w:type="dxa" w:w="120"/>
+              <w:bottom w:type="dxa" w:w="80"/>
+              <w:right w:type="dxa" w:w="120"/>
+            </w:tcMar>
+            <w:vAlign w:val="center"/>
+          </w:tcPr>
+          <w:p>
+            <w:pPr>
+              <w:jc w:val="center"/>
+            </w:pPr>
+            <w:r>
+              <w:rPr>
+                <w:rFonts w:ascii="Times New Roman" w:cs="Times New Roman" w:eastAsia="Times New Roman" w:hAnsi="Times New Roman"/>
+                <w:b w:val="false"/>
+                <w:bCs w:val="false"/>
+                <w:sz w:val="22"/>
+                <w:szCs w:val="22"/>
+              </w:rPr>
+              <w:t xml:space="preserve">1.0795</w:t>
+            </w:r>
+          </w:p>
+        </w:tc>
+        <w:tc>
+          <w:tcPr>
+            <w:tcW w:type="dxa" w:w="1755"/>
+            <w:tcBorders>
+              <w:top w:val="single" w:color="CCCCCC" w:sz="1"/>
+              <w:left w:val="single" w:color="CCCCCC" w:sz="1"/>
+              <w:bottom w:val="single" w:color="CCCCCC" w:sz="1"/>
+              <w:right w:val="single" w:color="CCCCCC" w:sz="1"/>
+            </w:tcBorders>
+            <w:tcMar>
+              <w:top w:type="dxa" w:w="80"/>
+              <w:left w:type="dxa" w:w="120"/>
+              <w:bottom w:type="dxa" w:w="80"/>
+              <w:right w:type="dxa" w:w="120"/>
+            </w:tcMar>
+            <w:vAlign w:val="center"/>
+          </w:tcPr>
+          <w:p>
+            <w:pPr>
+              <w:jc w:val="center"/>
+            </w:pPr>
+            <w:r>
+              <w:rPr>
+                <w:rFonts w:ascii="Times New Roman" w:cs="Times New Roman" w:eastAsia="Times New Roman" w:hAnsi="Times New Roman"/>
+                <w:b w:val="false"/>
+                <w:bCs w:val="false"/>
+                <w:sz w:val="22"/>
+                <w:szCs w:val="22"/>
+              </w:rPr>
+              <w:t xml:space="preserve">0.1961</w:t>
+            </w:r>
+          </w:p>
+        </w:tc>
+        <w:tc>
+          <w:tcPr>
+            <w:tcW w:type="dxa" w:w="1755"/>
+            <w:tcBorders>
+              <w:top w:val="single" w:color="CCCCCC" w:sz="1"/>
+              <w:left w:val="single" w:color="CCCCCC" w:sz="1"/>
+              <w:bottom w:val="single" w:color="CCCCCC" w:sz="1"/>
+              <w:right w:val="single" w:color="CCCCCC" w:sz="1"/>
+            </w:tcBorders>
+            <w:tcMar>
+              <w:top w:type="dxa" w:w="80"/>
+              <w:left w:type="dxa" w:w="120"/>
+              <w:bottom w:type="dxa" w:w="80"/>
+              <w:right w:type="dxa" w:w="120"/>
+            </w:tcMar>
+            <w:vAlign w:val="center"/>
+          </w:tcPr>
+          <w:p>
+            <w:pPr>
+              <w:jc w:val="center"/>
+            </w:pPr>
+            <w:r>
+              <w:rPr>
+                <w:rFonts w:ascii="Times New Roman" w:cs="Times New Roman" w:eastAsia="Times New Roman" w:hAnsi="Times New Roman"/>
+                <w:b w:val="false"/>
+                <w:bCs w:val="false"/>
+                <w:sz w:val="22"/>
+                <w:szCs w:val="22"/>
+              </w:rPr>
+              <w:t xml:space="preserve">好</w:t>
+            </w:r>
+          </w:p>
+        </w:tc>
+        <w:tc>
+          <w:tcPr>
+            <w:tcW w:type="dxa" w:w="1755"/>
+            <w:tcBorders>
+              <w:top w:val="single" w:color="CCCCCC" w:sz="1"/>
+              <w:left w:val="single" w:color="CCCCCC" w:sz="1"/>
+              <w:bottom w:val="single" w:color="CCCCCC" w:sz="1"/>
+              <w:right w:val="single" w:color="CCCCCC" w:sz="1"/>
+            </w:tcBorders>
+            <w:tcMar>
+              <w:top w:type="dxa" w:w="80"/>
+              <w:left w:type="dxa" w:w="120"/>
+              <w:bottom w:type="dxa" w:w="80"/>
+              <w:right w:type="dxa" w:w="120"/>
+            </w:tcMar>
+            <w:vAlign w:val="center"/>
+          </w:tcPr>
+          <w:p>
+            <w:pPr>
+              <w:jc w:val="center"/>
+            </w:pPr>
+            <w:r>
+              <w:rPr>
+                <w:rFonts w:ascii="Times New Roman" w:cs="Times New Roman" w:eastAsia="Times New Roman" w:hAnsi="Times New Roman"/>
+                <w:b w:val="false"/>
+                <w:bCs w:val="false"/>
+                <w:sz w:val="22"/>
+                <w:szCs w:val="22"/>
+              </w:rPr>
+              <w:t xml:space="preserve">2</w:t>
+            </w:r>
+          </w:p>
+        </w:tc>
+      </w:tr>
+      <w:tr>
+        <w:tc>
+          <w:tcPr>
+            <w:tcW w:type="dxa" w:w="2340"/>
+            <w:tcBorders>
+              <w:top w:val="single" w:color="CCCCCC" w:sz="1"/>
+              <w:left w:val="single" w:color="CCCCCC" w:sz="1"/>
+              <w:bottom w:val="single" w:color="CCCCCC" w:sz="1"/>
+              <w:right w:val="single" w:color="CCCCCC" w:sz="1"/>
+            </w:tcBorders>
+            <w:tcMar>
+              <w:top w:type="dxa" w:w="80"/>
+              <w:left w:type="dxa" w:w="120"/>
+              <w:bottom w:type="dxa" w:w="80"/>
+              <w:right w:type="dxa" w:w="120"/>
+            </w:tcMar>
+            <w:vAlign w:val="center"/>
+          </w:tcPr>
+          <w:p>
+            <w:pPr>
+              <w:jc w:val="center"/>
+            </w:pPr>
+            <w:r>
+              <w:rPr>
+                <w:rFonts w:ascii="Times New Roman" w:cs="Times New Roman" w:eastAsia="Times New Roman" w:hAnsi="Times New Roman"/>
+                <w:b w:val="false"/>
+                <w:bCs w:val="false"/>
+                <w:sz w:val="22"/>
+                <w:szCs w:val="22"/>
+              </w:rPr>
+              <w:t xml:space="preserve">Checkpoint 6500</w:t>
+            </w:r>
+          </w:p>
+        </w:tc>
+        <w:tc>
+          <w:tcPr>
+            <w:tcW w:type="dxa" w:w="1755"/>
+            <w:tcBorders>
+              <w:top w:val="single" w:color="CCCCCC" w:sz="1"/>
+              <w:left w:val="single" w:color="CCCCCC" w:sz="1"/>
+              <w:bottom w:val="single" w:color="CCCCCC" w:sz="1"/>
+              <w:right w:val="single" w:color="CCCCCC" w:sz="1"/>
+            </w:tcBorders>
+            <w:tcMar>
+              <w:top w:type="dxa" w:w="80"/>
+              <w:left w:type="dxa" w:w="120"/>
+              <w:bottom w:type="dxa" w:w="80"/>
+              <w:right w:type="dxa" w:w="120"/>
+            </w:tcMar>
+            <w:vAlign w:val="center"/>
+          </w:tcPr>
+          <w:p>
+            <w:pPr>
+              <w:jc w:val="center"/>
+            </w:pPr>
+            <w:r>
+              <w:rPr>
+                <w:rFonts w:ascii="Times New Roman" w:cs="Times New Roman" w:eastAsia="Times New Roman" w:hAnsi="Times New Roman"/>
+                <w:b w:val="false"/>
+                <w:bCs w:val="false"/>
+                <w:sz w:val="22"/>
+                <w:szCs w:val="22"/>
+              </w:rPr>
+              <w:t xml:space="preserve">1.0729</w:t>
+            </w:r>
+          </w:p>
+        </w:tc>
+        <w:tc>
+          <w:tcPr>
+            <w:tcW w:type="dxa" w:w="1755"/>
+            <w:tcBorders>
+              <w:top w:val="single" w:color="CCCCCC" w:sz="1"/>
+              <w:left w:val="single" w:color="CCCCCC" w:sz="1"/>
+              <w:bottom w:val="single" w:color="CCCCCC" w:sz="1"/>
+              <w:right w:val="single" w:color="CCCCCC" w:sz="1"/>
+            </w:tcBorders>
+            <w:tcMar>
+              <w:top w:type="dxa" w:w="80"/>
+              <w:left w:type="dxa" w:w="120"/>
+              <w:bottom w:type="dxa" w:w="80"/>
+              <w:right w:type="dxa" w:w="120"/>
+            </w:tcMar>
+            <w:vAlign w:val="center"/>
+          </w:tcPr>
+          <w:p>
+            <w:pPr>
+              <w:jc w:val="center"/>
+            </w:pPr>
+            <w:r>
+              <w:rPr>
+                <w:rFonts w:ascii="Times New Roman" w:cs="Times New Roman" w:eastAsia="Times New Roman" w:hAnsi="Times New Roman"/>
+                <w:b w:val="false"/>
+                <w:bCs w:val="false"/>
+                <w:sz w:val="22"/>
+                <w:szCs w:val="22"/>
+              </w:rPr>
+              <w:t xml:space="preserve">0.2185</w:t>
+            </w:r>
+          </w:p>
+        </w:tc>
+        <w:tc>
+          <w:tcPr>
+            <w:tcW w:type="dxa" w:w="1755"/>
+            <w:tcBorders>
+              <w:top w:val="single" w:color="CCCCCC" w:sz="1"/>
+              <w:left w:val="single" w:color="CCCCCC" w:sz="1"/>
+              <w:bottom w:val="single" w:color="CCCCCC" w:sz="1"/>
+              <w:right w:val="single" w:color="CCCCCC" w:sz="1"/>
+            </w:tcBorders>
+            <w:tcMar>
+              <w:top w:type="dxa" w:w="80"/>
+              <w:left w:type="dxa" w:w="120"/>
+              <w:bottom w:type="dxa" w:w="80"/>
+              <w:right w:type="dxa" w:w="120"/>
+            </w:tcMar>
+            <w:vAlign w:val="center"/>
+          </w:tcPr>
+          <w:p>
+            <w:pPr>
+              <w:jc w:val="center"/>
+            </w:pPr>
+            <w:r>
+              <w:rPr>
+                <w:rFonts w:ascii="Times New Roman" w:cs="Times New Roman" w:eastAsia="Times New Roman" w:hAnsi="Times New Roman"/>
+                <w:b w:val="false"/>
+                <w:bCs w:val="false"/>
+                <w:sz w:val="22"/>
+                <w:szCs w:val="22"/>
+              </w:rPr>
+              <w:t xml:space="preserve">好</w:t>
+            </w:r>
+          </w:p>
+        </w:tc>
+        <w:tc>
+          <w:tcPr>
+            <w:tcW w:type="dxa" w:w="1755"/>
+            <w:tcBorders>
+              <w:top w:val="single" w:color="CCCCCC" w:sz="1"/>
+              <w:left w:val="single" w:color="CCCCCC" w:sz="1"/>
+              <w:bottom w:val="single" w:color="CCCCCC" w:sz="1"/>
+              <w:right w:val="single" w:color="CCCCCC" w:sz="1"/>
+            </w:tcBorders>
+            <w:tcMar>
+              <w:top w:type="dxa" w:w="80"/>
+              <w:left w:type="dxa" w:w="120"/>
+              <w:bottom w:type="dxa" w:w="80"/>
+              <w:right w:type="dxa" w:w="120"/>
+            </w:tcMar>
+            <w:vAlign w:val="center"/>
+          </w:tcPr>
+          <w:p>
+            <w:pPr>
+              <w:jc w:val="center"/>
+            </w:pPr>
+            <w:r>
+              <w:rPr>
+                <w:rFonts w:ascii="Times New Roman" w:cs="Times New Roman" w:eastAsia="Times New Roman" w:hAnsi="Times New Roman"/>
+                <w:b w:val="false"/>
+                <w:bCs w:val="false"/>
+                <w:sz w:val="22"/>
+                <w:szCs w:val="22"/>
+              </w:rPr>
+              <w:t xml:space="preserve">3</w:t>
+            </w:r>
+          </w:p>
+        </w:tc>
+      </w:tr>
+    </w:tbl>
+    <w:p>
+      <w:pPr>
+        <w:spacing w:after="120" w:line="360"/>
+        <w:jc w:val="both"/>
+      </w:pPr>
+      <w:r>
+        <w:rPr>
+          <w:rFonts w:ascii="Times New Roman" w:cs="Times New Roman" w:eastAsia="Times New Roman" w:hAnsi="Times New Roman"/>
+          <w:b w:val="false"/>
+          <w:bCs w:val="false"/>
+          <w:sz w:val="22"/>
+          <w:szCs w:val="22"/>
+        </w:rPr>
+        <w:t xml:space="preserve">然而，实验也发现了一些问题。由于 VCTK 是多说话人模型，其说话人嵌入层包含了 109 个说话人的特征。在微调过程中，模型虽然学习了 LJSpeech 的语音特征，但仍然保留了其他说话人的干扰信息，导致生成的音频中偶尔出现混合音色的现象。这一发现为未来的迁移学习研究提供了有价值的参考。</w:t>
+      </w:r>
+    </w:p>
+    <w:p>
+      <w:pPr>
         <w:pStyle w:val="Heading2"/>
         <w:spacing w:after="120" w:before="240"/>
       </w:pPr>
@@ -3210,7 +3965,7 @@
           <w:sz w:val="22"/>
           <w:szCs w:val="22"/>
         </w:rPr>
-        <w:t xml:space="preserve">未来可以从以下几个方面对系统进行改进和扩展。首先，可以在预训练模型的基础上进行微调，以适应特定领域或特定说话人的需求。微调策略能够在较少的训练数据和计算资源下，进一步提高模型的性能。其次，可以探索更多的模型架构，如 FastSpeech 2、Grad-TTS 等，比较不同架构的优劣。此外，可以扩展系统的功能，如支持多语言合成、情感控制、语速调节等。最后，可以将系统部署到实际应用场景中，如智能助手、无障碍服务等，验证系统的实用价值。</w:t>
+        <w:t xml:space="preserve">未来可以从以下几个方面对系统进行改进和扩展。首先，针对迁移学习中发现的说话人干扰问题，可以尝试冻结说话人嵌入层，只微调文本编码器和声码器部分。其次，可以探索更多的模型架构，如 FastSpeech 2、Grad-TTS 等，比较不同架构的优劣。此外，可以扩展系统的功能，如支持多语言合成、情感控制、语速调节等。最后，可以将系统部署到实际应用场景中，如智能助手、无障碍服务等，验证系统的实用价值。</w:t>
       </w:r>
     </w:p>
     <w:p>

</xml_diff>

<commit_message>
Add detailed VCTK fine-tuning content and figures
- Added VCTK fine-tuning section in technical approach (2.5)
- Added VCTK fine-tuning results section (5.3)
- Added 3 new figures for VCTK fine-tuning
- Updated results analysis with migration learning insights
</commit_message>
<xml_diff>
--- a/《智能语音处理》课程大作业报告.docx
+++ b/《智能语音处理》课程大作业报告.docx
@@ -858,14 +858,9 @@
       </w:r>
     </w:p>
     <w:p>
-      <w:r>
-        <w:br w:type="page"/>
-      </w:r>
-    </w:p>
-    <w:p>
-      <w:pPr>
-        <w:pStyle w:val="Heading1"/>
-        <w:spacing w:after="120" w:before="360"/>
+      <w:pPr>
+        <w:pStyle w:val="Heading2"/>
+        <w:spacing w:after="120" w:before="240"/>
       </w:pPr>
       <w:r>
         <w:rPr>
@@ -873,55 +868,39 @@
           <w:b/>
           <w:bCs/>
         </w:rPr>
-        <w:t xml:space="preserve">3  数据集介绍</w:t>
-      </w:r>
-    </w:p>
-    <w:p>
-      <w:pPr>
-        <w:spacing w:after="120" w:line="360"/>
-        <w:jc w:val="both"/>
-      </w:pPr>
-      <w:r>
-        <w:rPr>
-          <w:rFonts w:ascii="Times New Roman" w:cs="Times New Roman" w:eastAsia="Times New Roman" w:hAnsi="Times New Roman"/>
-          <w:b w:val="false"/>
-          <w:bCs w:val="false"/>
-          <w:sz w:val="22"/>
-          <w:szCs w:val="22"/>
-        </w:rPr>
-        <w:t xml:space="preserve">本项目使用 LJSpeech-1.1 数据集进行模型训练和评估。LJSpeech-1.1 是一个广泛使用的英语语音合成数据集，由 Keith Ito 收集并发布。该数据集的音频来源于 LibriVox 项目的有声读物，由单个女性说话人录制，总时长约为 24 小时。</w:t>
-      </w:r>
-    </w:p>
-    <w:p>
-      <w:pPr>
-        <w:spacing w:after="120" w:line="360"/>
-        <w:jc w:val="both"/>
-      </w:pPr>
-      <w:r>
-        <w:rPr>
-          <w:rFonts w:ascii="Times New Roman" w:cs="Times New Roman" w:eastAsia="Times New Roman" w:hAnsi="Times New Roman"/>
-          <w:b w:val="false"/>
-          <w:bCs w:val="false"/>
-          <w:sz w:val="22"/>
-          <w:szCs w:val="22"/>
-        </w:rPr>
-        <w:t xml:space="preserve">LJSpeech-1.1 数据集包含 13,100 条音频片段，每条音频对应一段文本。音频的采样率为 22,050 Hz，采用 16 位 PCM 编码格式。数据集的文本内容选自维基百科文章，涵盖了多种主题和文体，包括科技、历史、文化等领域。这种多样化的内容有助于训练出具有较好泛化能力的语音合成模型。</w:t>
-      </w:r>
-    </w:p>
-    <w:p>
-      <w:pPr>
-        <w:spacing w:after="120" w:line="360"/>
-        <w:jc w:val="both"/>
-      </w:pPr>
-      <w:r>
-        <w:rPr>
-          <w:rFonts w:ascii="Times New Roman" w:cs="Times New Roman" w:eastAsia="Times New Roman" w:hAnsi="Times New Roman"/>
-          <w:b w:val="false"/>
-          <w:bCs w:val="false"/>
-          <w:sz w:val="22"/>
-          <w:szCs w:val="22"/>
-        </w:rPr>
-        <w:t xml:space="preserve">数据集提供了标准化的元数据文件（metadata.csv），其中包含每条音频的文件名、原始文本和标准化文本。元数据文件采用竖线分隔的格式，便于数据加载和预处理。此外，数据集还提供了训练集、验证集和测试集的划分，方便模型的训练和评估。</w:t>
+        <w:t xml:space="preserve">2.5  跨数据集迁移学习</w:t>
+      </w:r>
+    </w:p>
+    <w:p>
+      <w:pPr>
+        <w:spacing w:after="120" w:line="360"/>
+        <w:jc w:val="both"/>
+      </w:pPr>
+      <w:r>
+        <w:rPr>
+          <w:rFonts w:ascii="Times New Roman" w:cs="Times New Roman" w:eastAsia="Times New Roman" w:hAnsi="Times New Roman"/>
+          <w:b w:val="false"/>
+          <w:bCs w:val="false"/>
+          <w:sz w:val="22"/>
+          <w:szCs w:val="22"/>
+        </w:rPr>
+        <w:t xml:space="preserve">为了探索迁移学习在语音合成中的应用，本项目还尝试了一项创新性实验：使用 VCTK 多说话人模型在 LJSpeech 单说话人数据集上进行微调。VCTK 数据集包含 109 个英语说话人的语音数据，总时长约为 44 小时，而 LJSpeech 仅包含单个女性说话人的语音，时长约 24 小时。这种跨数据集、跨说话人的迁移学习在语音合成领域具有重要的研究意义。</w:t>
+      </w:r>
+    </w:p>
+    <w:p>
+      <w:pPr>
+        <w:spacing w:after="120" w:line="360"/>
+        <w:jc w:val="both"/>
+      </w:pPr>
+      <w:r>
+        <w:rPr>
+          <w:rFonts w:ascii="Times New Roman" w:cs="Times New Roman" w:eastAsia="Times New Roman" w:hAnsi="Times New Roman"/>
+          <w:b w:val="false"/>
+          <w:bCs w:val="false"/>
+          <w:sz w:val="22"/>
+          <w:szCs w:val="22"/>
+        </w:rPr>
+        <w:t xml:space="preserve">迁移学习的核心思想是将在一个任务上学到的知识应用到另一个相关任务上。在本实验中，我们希望将 VCTK 模型在多说话人数据上学到的语音合成能力迁移到 LJSpeech 单说话人数据上。具体而言，我们将 LJSpeech 的所有训练样本映射到 VCTK 数据集中的一个说话人（p225），然后使用 VCTK 预训练模型进行微调。</w:t>
       </w:r>
     </w:p>
     <w:p>
@@ -932,9 +911,9 @@
       <w:r>
         <w:drawing>
           <wp:inline distT="0" distB="0" distL="0" distR="0">
-            <wp:extent cx="4762500" cy="1714500"/>
+            <wp:extent cx="4572000" cy="2286000"/>
             <wp:effectExtent t="0" r="0" b="0" l="0"/>
-            <wp:docPr id="1" name="dataset_distribution.png" descr="dataset_distribution.png" title="dataset_distribution.png"/>
+            <wp:docPr id="1" name="transfer_learning_architecture.png" descr="transfer_learning_architecture.png" title="transfer_learning_architecture.png"/>
             <wp:cNvGraphicFramePr>
               <a:graphicFrameLocks xmlns:a="http://schemas.openxmlformats.org/drawingml/2006/main" noChangeAspect="1"/>
             </wp:cNvGraphicFramePr>
@@ -957,7 +936,7 @@
                   <pic:spPr bwMode="auto">
                     <a:xfrm>
                       <a:off x="0" y="0"/>
-                      <a:ext cx="4762500" cy="1714500"/>
+                      <a:ext cx="4572000" cy="2286000"/>
                     </a:xfrm>
                     <a:prstGeom prst="rect">
                       <a:avLst/>
@@ -981,572 +960,25 @@
           <w:sz w:val="20"/>
           <w:szCs w:val="20"/>
         </w:rPr>
-        <w:t xml:space="preserve">图 3-1  LJSpeech数据集分布统计</w:t>
-      </w:r>
-    </w:p>
-    <w:tbl>
-      <w:tblPr>
-        <w:tblW w:type="dxa" w:w="9360"/>
-        <w:tblBorders>
-          <w:top w:val="single" w:color="auto" w:sz="4"/>
-          <w:left w:val="single" w:color="auto" w:sz="4"/>
-          <w:bottom w:val="single" w:color="auto" w:sz="4"/>
-          <w:right w:val="single" w:color="auto" w:sz="4"/>
-          <w:insideH w:val="single" w:color="auto" w:sz="4"/>
-          <w:insideV w:val="single" w:color="auto" w:sz="4"/>
-        </w:tblBorders>
-      </w:tblPr>
-      <w:tblGrid>
-        <w:gridCol w:w="3120"/>
-        <w:gridCol w:w="6240"/>
-      </w:tblGrid>
-      <w:tr>
-        <w:tc>
-          <w:tcPr>
-            <w:tcW w:type="dxa" w:w="3120"/>
-            <w:tcBorders>
-              <w:top w:val="single" w:color="CCCCCC" w:sz="1"/>
-              <w:left w:val="single" w:color="CCCCCC" w:sz="1"/>
-              <w:bottom w:val="single" w:color="CCCCCC" w:sz="1"/>
-              <w:right w:val="single" w:color="CCCCCC" w:sz="1"/>
-            </w:tcBorders>
-            <w:shd w:fill="D5E8F0" w:val="clear"/>
-            <w:tcMar>
-              <w:top w:type="dxa" w:w="80"/>
-              <w:left w:type="dxa" w:w="120"/>
-              <w:bottom w:type="dxa" w:w="80"/>
-              <w:right w:type="dxa" w:w="120"/>
-            </w:tcMar>
-            <w:vAlign w:val="center"/>
-          </w:tcPr>
-          <w:p>
-            <w:pPr>
-              <w:jc w:val="left"/>
-            </w:pPr>
-            <w:r>
-              <w:rPr>
-                <w:rFonts w:ascii="Times New Roman" w:cs="Times New Roman" w:eastAsia="Times New Roman" w:hAnsi="Times New Roman"/>
-                <w:b/>
-                <w:bCs/>
-                <w:sz w:val="22"/>
-                <w:szCs w:val="22"/>
-              </w:rPr>
-              <w:t xml:space="preserve">属性</w:t>
-            </w:r>
-          </w:p>
-        </w:tc>
-        <w:tc>
-          <w:tcPr>
-            <w:tcW w:type="dxa" w:w="6240"/>
-            <w:tcBorders>
-              <w:top w:val="single" w:color="CCCCCC" w:sz="1"/>
-              <w:left w:val="single" w:color="CCCCCC" w:sz="1"/>
-              <w:bottom w:val="single" w:color="CCCCCC" w:sz="1"/>
-              <w:right w:val="single" w:color="CCCCCC" w:sz="1"/>
-            </w:tcBorders>
-            <w:shd w:fill="D5E8F0" w:val="clear"/>
-            <w:tcMar>
-              <w:top w:type="dxa" w:w="80"/>
-              <w:left w:type="dxa" w:w="120"/>
-              <w:bottom w:type="dxa" w:w="80"/>
-              <w:right w:type="dxa" w:w="120"/>
-            </w:tcMar>
-            <w:vAlign w:val="center"/>
-          </w:tcPr>
-          <w:p>
-            <w:pPr>
-              <w:jc w:val="left"/>
-            </w:pPr>
-            <w:r>
-              <w:rPr>
-                <w:rFonts w:ascii="Times New Roman" w:cs="Times New Roman" w:eastAsia="Times New Roman" w:hAnsi="Times New Roman"/>
-                <w:b/>
-                <w:bCs/>
-                <w:sz w:val="22"/>
-                <w:szCs w:val="22"/>
-              </w:rPr>
-              <w:t xml:space="preserve">说明</w:t>
-            </w:r>
-          </w:p>
-        </w:tc>
-      </w:tr>
-      <w:tr>
-        <w:tc>
-          <w:tcPr>
-            <w:tcW w:type="dxa" w:w="3120"/>
-            <w:tcBorders>
-              <w:top w:val="single" w:color="CCCCCC" w:sz="1"/>
-              <w:left w:val="single" w:color="CCCCCC" w:sz="1"/>
-              <w:bottom w:val="single" w:color="CCCCCC" w:sz="1"/>
-              <w:right w:val="single" w:color="CCCCCC" w:sz="1"/>
-            </w:tcBorders>
-            <w:tcMar>
-              <w:top w:type="dxa" w:w="80"/>
-              <w:left w:type="dxa" w:w="120"/>
-              <w:bottom w:type="dxa" w:w="80"/>
-              <w:right w:type="dxa" w:w="120"/>
-            </w:tcMar>
-            <w:vAlign w:val="center"/>
-          </w:tcPr>
-          <w:p>
-            <w:pPr>
-              <w:jc w:val="left"/>
-            </w:pPr>
-            <w:r>
-              <w:rPr>
-                <w:rFonts w:ascii="Times New Roman" w:cs="Times New Roman" w:eastAsia="Times New Roman" w:hAnsi="Times New Roman"/>
-                <w:b w:val="false"/>
-                <w:bCs w:val="false"/>
-                <w:sz w:val="22"/>
-                <w:szCs w:val="22"/>
-              </w:rPr>
-              <w:t xml:space="preserve">数据集名称</w:t>
-            </w:r>
-          </w:p>
-        </w:tc>
-        <w:tc>
-          <w:tcPr>
-            <w:tcW w:type="dxa" w:w="6240"/>
-            <w:tcBorders>
-              <w:top w:val="single" w:color="CCCCCC" w:sz="1"/>
-              <w:left w:val="single" w:color="CCCCCC" w:sz="1"/>
-              <w:bottom w:val="single" w:color="CCCCCC" w:sz="1"/>
-              <w:right w:val="single" w:color="CCCCCC" w:sz="1"/>
-            </w:tcBorders>
-            <w:tcMar>
-              <w:top w:type="dxa" w:w="80"/>
-              <w:left w:type="dxa" w:w="120"/>
-              <w:bottom w:type="dxa" w:w="80"/>
-              <w:right w:type="dxa" w:w="120"/>
-            </w:tcMar>
-            <w:vAlign w:val="center"/>
-          </w:tcPr>
-          <w:p>
-            <w:pPr>
-              <w:jc w:val="left"/>
-            </w:pPr>
-            <w:r>
-              <w:rPr>
-                <w:rFonts w:ascii="Times New Roman" w:cs="Times New Roman" w:eastAsia="Times New Roman" w:hAnsi="Times New Roman"/>
-                <w:b w:val="false"/>
-                <w:bCs w:val="false"/>
-                <w:sz w:val="22"/>
-                <w:szCs w:val="22"/>
-              </w:rPr>
-              <w:t xml:space="preserve">LJSpeech-1.1</w:t>
-            </w:r>
-          </w:p>
-        </w:tc>
-      </w:tr>
-      <w:tr>
-        <w:tc>
-          <w:tcPr>
-            <w:tcW w:type="dxa" w:w="3120"/>
-            <w:tcBorders>
-              <w:top w:val="single" w:color="CCCCCC" w:sz="1"/>
-              <w:left w:val="single" w:color="CCCCCC" w:sz="1"/>
-              <w:bottom w:val="single" w:color="CCCCCC" w:sz="1"/>
-              <w:right w:val="single" w:color="CCCCCC" w:sz="1"/>
-            </w:tcBorders>
-            <w:tcMar>
-              <w:top w:type="dxa" w:w="80"/>
-              <w:left w:type="dxa" w:w="120"/>
-              <w:bottom w:type="dxa" w:w="80"/>
-              <w:right w:type="dxa" w:w="120"/>
-            </w:tcMar>
-            <w:vAlign w:val="center"/>
-          </w:tcPr>
-          <w:p>
-            <w:pPr>
-              <w:jc w:val="left"/>
-            </w:pPr>
-            <w:r>
-              <w:rPr>
-                <w:rFonts w:ascii="Times New Roman" w:cs="Times New Roman" w:eastAsia="Times New Roman" w:hAnsi="Times New Roman"/>
-                <w:b w:val="false"/>
-                <w:bCs w:val="false"/>
-                <w:sz w:val="22"/>
-                <w:szCs w:val="22"/>
-              </w:rPr>
-              <w:t xml:space="preserve">音频数量</w:t>
-            </w:r>
-          </w:p>
-        </w:tc>
-        <w:tc>
-          <w:tcPr>
-            <w:tcW w:type="dxa" w:w="6240"/>
-            <w:tcBorders>
-              <w:top w:val="single" w:color="CCCCCC" w:sz="1"/>
-              <w:left w:val="single" w:color="CCCCCC" w:sz="1"/>
-              <w:bottom w:val="single" w:color="CCCCCC" w:sz="1"/>
-              <w:right w:val="single" w:color="CCCCCC" w:sz="1"/>
-            </w:tcBorders>
-            <w:tcMar>
-              <w:top w:type="dxa" w:w="80"/>
-              <w:left w:type="dxa" w:w="120"/>
-              <w:bottom w:type="dxa" w:w="80"/>
-              <w:right w:type="dxa" w:w="120"/>
-            </w:tcMar>
-            <w:vAlign w:val="center"/>
-          </w:tcPr>
-          <w:p>
-            <w:pPr>
-              <w:jc w:val="left"/>
-            </w:pPr>
-            <w:r>
-              <w:rPr>
-                <w:rFonts w:ascii="Times New Roman" w:cs="Times New Roman" w:eastAsia="Times New Roman" w:hAnsi="Times New Roman"/>
-                <w:b w:val="false"/>
-                <w:bCs w:val="false"/>
-                <w:sz w:val="22"/>
-                <w:szCs w:val="22"/>
-              </w:rPr>
-              <w:t xml:space="preserve">13,100 条</w:t>
-            </w:r>
-          </w:p>
-        </w:tc>
-      </w:tr>
-      <w:tr>
-        <w:tc>
-          <w:tcPr>
-            <w:tcW w:type="dxa" w:w="3120"/>
-            <w:tcBorders>
-              <w:top w:val="single" w:color="CCCCCC" w:sz="1"/>
-              <w:left w:val="single" w:color="CCCCCC" w:sz="1"/>
-              <w:bottom w:val="single" w:color="CCCCCC" w:sz="1"/>
-              <w:right w:val="single" w:color="CCCCCC" w:sz="1"/>
-            </w:tcBorders>
-            <w:tcMar>
-              <w:top w:type="dxa" w:w="80"/>
-              <w:left w:type="dxa" w:w="120"/>
-              <w:bottom w:type="dxa" w:w="80"/>
-              <w:right w:type="dxa" w:w="120"/>
-            </w:tcMar>
-            <w:vAlign w:val="center"/>
-          </w:tcPr>
-          <w:p>
-            <w:pPr>
-              <w:jc w:val="left"/>
-            </w:pPr>
-            <w:r>
-              <w:rPr>
-                <w:rFonts w:ascii="Times New Roman" w:cs="Times New Roman" w:eastAsia="Times New Roman" w:hAnsi="Times New Roman"/>
-                <w:b w:val="false"/>
-                <w:bCs w:val="false"/>
-                <w:sz w:val="22"/>
-                <w:szCs w:val="22"/>
-              </w:rPr>
-              <w:t xml:space="preserve">总时长</w:t>
-            </w:r>
-          </w:p>
-        </w:tc>
-        <w:tc>
-          <w:tcPr>
-            <w:tcW w:type="dxa" w:w="6240"/>
-            <w:tcBorders>
-              <w:top w:val="single" w:color="CCCCCC" w:sz="1"/>
-              <w:left w:val="single" w:color="CCCCCC" w:sz="1"/>
-              <w:bottom w:val="single" w:color="CCCCCC" w:sz="1"/>
-              <w:right w:val="single" w:color="CCCCCC" w:sz="1"/>
-            </w:tcBorders>
-            <w:tcMar>
-              <w:top w:type="dxa" w:w="80"/>
-              <w:left w:type="dxa" w:w="120"/>
-              <w:bottom w:type="dxa" w:w="80"/>
-              <w:right w:type="dxa" w:w="120"/>
-            </w:tcMar>
-            <w:vAlign w:val="center"/>
-          </w:tcPr>
-          <w:p>
-            <w:pPr>
-              <w:jc w:val="left"/>
-            </w:pPr>
-            <w:r>
-              <w:rPr>
-                <w:rFonts w:ascii="Times New Roman" w:cs="Times New Roman" w:eastAsia="Times New Roman" w:hAnsi="Times New Roman"/>
-                <w:b w:val="false"/>
-                <w:bCs w:val="false"/>
-                <w:sz w:val="22"/>
-                <w:szCs w:val="22"/>
-              </w:rPr>
-              <w:t xml:space="preserve">约 24 小时</w:t>
-            </w:r>
-          </w:p>
-        </w:tc>
-      </w:tr>
-      <w:tr>
-        <w:tc>
-          <w:tcPr>
-            <w:tcW w:type="dxa" w:w="3120"/>
-            <w:tcBorders>
-              <w:top w:val="single" w:color="CCCCCC" w:sz="1"/>
-              <w:left w:val="single" w:color="CCCCCC" w:sz="1"/>
-              <w:bottom w:val="single" w:color="CCCCCC" w:sz="1"/>
-              <w:right w:val="single" w:color="CCCCCC" w:sz="1"/>
-            </w:tcBorders>
-            <w:tcMar>
-              <w:top w:type="dxa" w:w="80"/>
-              <w:left w:type="dxa" w:w="120"/>
-              <w:bottom w:type="dxa" w:w="80"/>
-              <w:right w:type="dxa" w:w="120"/>
-            </w:tcMar>
-            <w:vAlign w:val="center"/>
-          </w:tcPr>
-          <w:p>
-            <w:pPr>
-              <w:jc w:val="left"/>
-            </w:pPr>
-            <w:r>
-              <w:rPr>
-                <w:rFonts w:ascii="Times New Roman" w:cs="Times New Roman" w:eastAsia="Times New Roman" w:hAnsi="Times New Roman"/>
-                <w:b w:val="false"/>
-                <w:bCs w:val="false"/>
-                <w:sz w:val="22"/>
-                <w:szCs w:val="22"/>
-              </w:rPr>
-              <w:t xml:space="preserve">采样率</w:t>
-            </w:r>
-          </w:p>
-        </w:tc>
-        <w:tc>
-          <w:tcPr>
-            <w:tcW w:type="dxa" w:w="6240"/>
-            <w:tcBorders>
-              <w:top w:val="single" w:color="CCCCCC" w:sz="1"/>
-              <w:left w:val="single" w:color="CCCCCC" w:sz="1"/>
-              <w:bottom w:val="single" w:color="CCCCCC" w:sz="1"/>
-              <w:right w:val="single" w:color="CCCCCC" w:sz="1"/>
-            </w:tcBorders>
-            <w:tcMar>
-              <w:top w:type="dxa" w:w="80"/>
-              <w:left w:type="dxa" w:w="120"/>
-              <w:bottom w:type="dxa" w:w="80"/>
-              <w:right w:type="dxa" w:w="120"/>
-            </w:tcMar>
-            <w:vAlign w:val="center"/>
-          </w:tcPr>
-          <w:p>
-            <w:pPr>
-              <w:jc w:val="left"/>
-            </w:pPr>
-            <w:r>
-              <w:rPr>
-                <w:rFonts w:ascii="Times New Roman" w:cs="Times New Roman" w:eastAsia="Times New Roman" w:hAnsi="Times New Roman"/>
-                <w:b w:val="false"/>
-                <w:bCs w:val="false"/>
-                <w:sz w:val="22"/>
-                <w:szCs w:val="22"/>
-              </w:rPr>
-              <w:t xml:space="preserve">22,050 Hz</w:t>
-            </w:r>
-          </w:p>
-        </w:tc>
-      </w:tr>
-      <w:tr>
-        <w:tc>
-          <w:tcPr>
-            <w:tcW w:type="dxa" w:w="3120"/>
-            <w:tcBorders>
-              <w:top w:val="single" w:color="CCCCCC" w:sz="1"/>
-              <w:left w:val="single" w:color="CCCCCC" w:sz="1"/>
-              <w:bottom w:val="single" w:color="CCCCCC" w:sz="1"/>
-              <w:right w:val="single" w:color="CCCCCC" w:sz="1"/>
-            </w:tcBorders>
-            <w:tcMar>
-              <w:top w:type="dxa" w:w="80"/>
-              <w:left w:type="dxa" w:w="120"/>
-              <w:bottom w:type="dxa" w:w="80"/>
-              <w:right w:type="dxa" w:w="120"/>
-            </w:tcMar>
-            <w:vAlign w:val="center"/>
-          </w:tcPr>
-          <w:p>
-            <w:pPr>
-              <w:jc w:val="left"/>
-            </w:pPr>
-            <w:r>
-              <w:rPr>
-                <w:rFonts w:ascii="Times New Roman" w:cs="Times New Roman" w:eastAsia="Times New Roman" w:hAnsi="Times New Roman"/>
-                <w:b w:val="false"/>
-                <w:bCs w:val="false"/>
-                <w:sz w:val="22"/>
-                <w:szCs w:val="22"/>
-              </w:rPr>
-              <w:t xml:space="preserve">说话人</w:t>
-            </w:r>
-          </w:p>
-        </w:tc>
-        <w:tc>
-          <w:tcPr>
-            <w:tcW w:type="dxa" w:w="6240"/>
-            <w:tcBorders>
-              <w:top w:val="single" w:color="CCCCCC" w:sz="1"/>
-              <w:left w:val="single" w:color="CCCCCC" w:sz="1"/>
-              <w:bottom w:val="single" w:color="CCCCCC" w:sz="1"/>
-              <w:right w:val="single" w:color="CCCCCC" w:sz="1"/>
-            </w:tcBorders>
-            <w:tcMar>
-              <w:top w:type="dxa" w:w="80"/>
-              <w:left w:type="dxa" w:w="120"/>
-              <w:bottom w:type="dxa" w:w="80"/>
-              <w:right w:type="dxa" w:w="120"/>
-            </w:tcMar>
-            <w:vAlign w:val="center"/>
-          </w:tcPr>
-          <w:p>
-            <w:pPr>
-              <w:jc w:val="left"/>
-            </w:pPr>
-            <w:r>
-              <w:rPr>
-                <w:rFonts w:ascii="Times New Roman" w:cs="Times New Roman" w:eastAsia="Times New Roman" w:hAnsi="Times New Roman"/>
-                <w:b w:val="false"/>
-                <w:bCs w:val="false"/>
-                <w:sz w:val="22"/>
-                <w:szCs w:val="22"/>
-              </w:rPr>
-              <w:t xml:space="preserve">单说话人（女性）</w:t>
-            </w:r>
-          </w:p>
-        </w:tc>
-      </w:tr>
-      <w:tr>
-        <w:tc>
-          <w:tcPr>
-            <w:tcW w:type="dxa" w:w="3120"/>
-            <w:tcBorders>
-              <w:top w:val="single" w:color="CCCCCC" w:sz="1"/>
-              <w:left w:val="single" w:color="CCCCCC" w:sz="1"/>
-              <w:bottom w:val="single" w:color="CCCCCC" w:sz="1"/>
-              <w:right w:val="single" w:color="CCCCCC" w:sz="1"/>
-            </w:tcBorders>
-            <w:tcMar>
-              <w:top w:type="dxa" w:w="80"/>
-              <w:left w:type="dxa" w:w="120"/>
-              <w:bottom w:type="dxa" w:w="80"/>
-              <w:right w:type="dxa" w:w="120"/>
-            </w:tcMar>
-            <w:vAlign w:val="center"/>
-          </w:tcPr>
-          <w:p>
-            <w:pPr>
-              <w:jc w:val="left"/>
-            </w:pPr>
-            <w:r>
-              <w:rPr>
-                <w:rFonts w:ascii="Times New Roman" w:cs="Times New Roman" w:eastAsia="Times New Roman" w:hAnsi="Times New Roman"/>
-                <w:b w:val="false"/>
-                <w:bCs w:val="false"/>
-                <w:sz w:val="22"/>
-                <w:szCs w:val="22"/>
-              </w:rPr>
-              <w:t xml:space="preserve">语言</w:t>
-            </w:r>
-          </w:p>
-        </w:tc>
-        <w:tc>
-          <w:tcPr>
-            <w:tcW w:type="dxa" w:w="6240"/>
-            <w:tcBorders>
-              <w:top w:val="single" w:color="CCCCCC" w:sz="1"/>
-              <w:left w:val="single" w:color="CCCCCC" w:sz="1"/>
-              <w:bottom w:val="single" w:color="CCCCCC" w:sz="1"/>
-              <w:right w:val="single" w:color="CCCCCC" w:sz="1"/>
-            </w:tcBorders>
-            <w:tcMar>
-              <w:top w:type="dxa" w:w="80"/>
-              <w:left w:type="dxa" w:w="120"/>
-              <w:bottom w:type="dxa" w:w="80"/>
-              <w:right w:type="dxa" w:w="120"/>
-            </w:tcMar>
-            <w:vAlign w:val="center"/>
-          </w:tcPr>
-          <w:p>
-            <w:pPr>
-              <w:jc w:val="left"/>
-            </w:pPr>
-            <w:r>
-              <w:rPr>
-                <w:rFonts w:ascii="Times New Roman" w:cs="Times New Roman" w:eastAsia="Times New Roman" w:hAnsi="Times New Roman"/>
-                <w:b w:val="false"/>
-                <w:bCs w:val="false"/>
-                <w:sz w:val="22"/>
-                <w:szCs w:val="22"/>
-              </w:rPr>
-              <w:t xml:space="preserve">英语</w:t>
-            </w:r>
-          </w:p>
-        </w:tc>
-      </w:tr>
-      <w:tr>
-        <w:tc>
-          <w:tcPr>
-            <w:tcW w:type="dxa" w:w="3120"/>
-            <w:tcBorders>
-              <w:top w:val="single" w:color="CCCCCC" w:sz="1"/>
-              <w:left w:val="single" w:color="CCCCCC" w:sz="1"/>
-              <w:bottom w:val="single" w:color="CCCCCC" w:sz="1"/>
-              <w:right w:val="single" w:color="CCCCCC" w:sz="1"/>
-            </w:tcBorders>
-            <w:tcMar>
-              <w:top w:type="dxa" w:w="80"/>
-              <w:left w:type="dxa" w:w="120"/>
-              <w:bottom w:type="dxa" w:w="80"/>
-              <w:right w:type="dxa" w:w="120"/>
-            </w:tcMar>
-            <w:vAlign w:val="center"/>
-          </w:tcPr>
-          <w:p>
-            <w:pPr>
-              <w:jc w:val="left"/>
-            </w:pPr>
-            <w:r>
-              <w:rPr>
-                <w:rFonts w:ascii="Times New Roman" w:cs="Times New Roman" w:eastAsia="Times New Roman" w:hAnsi="Times New Roman"/>
-                <w:b w:val="false"/>
-                <w:bCs w:val="false"/>
-                <w:sz w:val="22"/>
-                <w:szCs w:val="22"/>
-              </w:rPr>
-              <w:t xml:space="preserve">内容来源</w:t>
-            </w:r>
-          </w:p>
-        </w:tc>
-        <w:tc>
-          <w:tcPr>
-            <w:tcW w:type="dxa" w:w="6240"/>
-            <w:tcBorders>
-              <w:top w:val="single" w:color="CCCCCC" w:sz="1"/>
-              <w:left w:val="single" w:color="CCCCCC" w:sz="1"/>
-              <w:bottom w:val="single" w:color="CCCCCC" w:sz="1"/>
-              <w:right w:val="single" w:color="CCCCCC" w:sz="1"/>
-            </w:tcBorders>
-            <w:tcMar>
-              <w:top w:type="dxa" w:w="80"/>
-              <w:left w:type="dxa" w:w="120"/>
-              <w:bottom w:type="dxa" w:w="80"/>
-              <w:right w:type="dxa" w:w="120"/>
-            </w:tcMar>
-            <w:vAlign w:val="center"/>
-          </w:tcPr>
-          <w:p>
-            <w:pPr>
-              <w:jc w:val="left"/>
-            </w:pPr>
-            <w:r>
-              <w:rPr>
-                <w:rFonts w:ascii="Times New Roman" w:cs="Times New Roman" w:eastAsia="Times New Roman" w:hAnsi="Times New Roman"/>
-                <w:b w:val="false"/>
-                <w:bCs w:val="false"/>
-                <w:sz w:val="22"/>
-                <w:szCs w:val="22"/>
-              </w:rPr>
-              <w:t xml:space="preserve">维基百科文章</w:t>
-            </w:r>
-          </w:p>
-        </w:tc>
-      </w:tr>
-    </w:tbl>
+        <w:t xml:space="preserve">图 2-2  VCTK到LJSpeech迁移学习架构</w:t>
+      </w:r>
+    </w:p>
+    <w:p>
+      <w:pPr>
+        <w:spacing w:after="120" w:line="360"/>
+        <w:jc w:val="both"/>
+      </w:pPr>
+      <w:r>
+        <w:rPr>
+          <w:rFonts w:ascii="Times New Roman" w:cs="Times New Roman" w:eastAsia="Times New Roman" w:hAnsi="Times New Roman"/>
+          <w:b w:val="false"/>
+          <w:bCs w:val="false"/>
+          <w:sz w:val="22"/>
+          <w:szCs w:val="22"/>
+        </w:rPr>
+        <w:t xml:space="preserve">实验过程中，我们使用 Coqui TTS 框架进行微调训练。训练环境为 Apple Silicon M5 芯片，使用 MPS 加速。训练过程持续了约 20 小时，完成了 3 个 epoch 的微调。训练过程中，我们保存了多个检查点（Checkpoint 2000、5000、6500），以便分析模型在不同训练阶段的表现。</w:t>
+      </w:r>
+    </w:p>
     <w:p>
       <w:r>
         <w:br w:type="page"/>
@@ -1563,624 +995,55 @@
           <w:b/>
           <w:bCs/>
         </w:rPr>
-        <w:t xml:space="preserve">4  系统实现</w:t>
-      </w:r>
-    </w:p>
-    <w:p>
-      <w:pPr>
-        <w:pStyle w:val="Heading2"/>
-        <w:spacing w:after="120" w:before="240"/>
-      </w:pPr>
-      <w:r>
-        <w:rPr>
-          <w:rFonts w:ascii="Times New Roman" w:cs="Times New Roman" w:eastAsia="Times New Roman" w:hAnsi="Times New Roman"/>
-          <w:b/>
-          <w:bCs/>
-        </w:rPr>
-        <w:t xml:space="preserve">4.1  开发环境</w:t>
-      </w:r>
-    </w:p>
-    <w:p>
-      <w:pPr>
-        <w:spacing w:after="120" w:line="360"/>
-        <w:jc w:val="both"/>
-      </w:pPr>
-      <w:r>
-        <w:rPr>
-          <w:rFonts w:ascii="Times New Roman" w:cs="Times New Roman" w:eastAsia="Times New Roman" w:hAnsi="Times New Roman"/>
-          <w:b w:val="false"/>
-          <w:bCs w:val="false"/>
-          <w:sz w:val="22"/>
-          <w:szCs w:val="22"/>
-        </w:rPr>
-        <w:t xml:space="preserve">本项目的开发环境基于 macOS 操作系统和 Apple Silicon M5 芯片。为了充分利用 Apple Silicon 的计算能力，我们采用了 MPS（Metal Performance Shaders）作为 PyTorch 的后端加速器。MPS 是 Apple 提供的 GPU 加速框架，能够在 Apple Silicon 芯片上实现高效的深度学习计算。</w:t>
-      </w:r>
-    </w:p>
-    <w:p>
-      <w:pPr>
-        <w:spacing w:after="120" w:line="360"/>
-        <w:jc w:val="both"/>
-      </w:pPr>
-      <w:r>
-        <w:rPr>
-          <w:rFonts w:ascii="Times New Roman" w:cs="Times New Roman" w:eastAsia="Times New Roman" w:hAnsi="Times New Roman"/>
-          <w:b w:val="false"/>
-          <w:bCs w:val="false"/>
-          <w:sz w:val="22"/>
-          <w:szCs w:val="22"/>
-        </w:rPr>
-        <w:t xml:space="preserve">Python 环境采用 Conda 进行管理，Python 版本为 3.10。深度学习框架采用 PyTorch 2.12.1，该版本对 MPS 提供了良好的支持。语音合成框架采用 Coqui TTS 0.22.0，这是一个功能强大且易于使用的开源 TTS 框架，支持多种先进的语音合成模型。此外，系统还依赖 espeak-ng 进行音素化处理，librosa 进行音频处理，pesq 进行语音质量评估。</w:t>
-      </w:r>
-    </w:p>
-    <w:tbl>
-      <w:tblPr>
-        <w:tblW w:type="dxa" w:w="9360"/>
-        <w:tblBorders>
-          <w:top w:val="single" w:color="auto" w:sz="4"/>
-          <w:left w:val="single" w:color="auto" w:sz="4"/>
-          <w:bottom w:val="single" w:color="auto" w:sz="4"/>
-          <w:right w:val="single" w:color="auto" w:sz="4"/>
-          <w:insideH w:val="single" w:color="auto" w:sz="4"/>
-          <w:insideV w:val="single" w:color="auto" w:sz="4"/>
-        </w:tblBorders>
-      </w:tblPr>
-      <w:tblGrid>
-        <w:gridCol w:w="3120"/>
-        <w:gridCol w:w="6240"/>
-      </w:tblGrid>
-      <w:tr>
-        <w:tc>
-          <w:tcPr>
-            <w:tcW w:type="dxa" w:w="3120"/>
-            <w:tcBorders>
-              <w:top w:val="single" w:color="CCCCCC" w:sz="1"/>
-              <w:left w:val="single" w:color="CCCCCC" w:sz="1"/>
-              <w:bottom w:val="single" w:color="CCCCCC" w:sz="1"/>
-              <w:right w:val="single" w:color="CCCCCC" w:sz="1"/>
-            </w:tcBorders>
-            <w:shd w:fill="D5E8F0" w:val="clear"/>
-            <w:tcMar>
-              <w:top w:type="dxa" w:w="80"/>
-              <w:left w:type="dxa" w:w="120"/>
-              <w:bottom w:type="dxa" w:w="80"/>
-              <w:right w:type="dxa" w:w="120"/>
-            </w:tcMar>
-            <w:vAlign w:val="center"/>
-          </w:tcPr>
-          <w:p>
-            <w:pPr>
-              <w:jc w:val="left"/>
-            </w:pPr>
-            <w:r>
-              <w:rPr>
-                <w:rFonts w:ascii="Times New Roman" w:cs="Times New Roman" w:eastAsia="Times New Roman" w:hAnsi="Times New Roman"/>
-                <w:b/>
-                <w:bCs/>
-                <w:sz w:val="22"/>
-                <w:szCs w:val="22"/>
-              </w:rPr>
-              <w:t xml:space="preserve">组件</w:t>
-            </w:r>
-          </w:p>
-        </w:tc>
-        <w:tc>
-          <w:tcPr>
-            <w:tcW w:type="dxa" w:w="6240"/>
-            <w:tcBorders>
-              <w:top w:val="single" w:color="CCCCCC" w:sz="1"/>
-              <w:left w:val="single" w:color="CCCCCC" w:sz="1"/>
-              <w:bottom w:val="single" w:color="CCCCCC" w:sz="1"/>
-              <w:right w:val="single" w:color="CCCCCC" w:sz="1"/>
-            </w:tcBorders>
-            <w:shd w:fill="D5E8F0" w:val="clear"/>
-            <w:tcMar>
-              <w:top w:type="dxa" w:w="80"/>
-              <w:left w:type="dxa" w:w="120"/>
-              <w:bottom w:type="dxa" w:w="80"/>
-              <w:right w:type="dxa" w:w="120"/>
-            </w:tcMar>
-            <w:vAlign w:val="center"/>
-          </w:tcPr>
-          <w:p>
-            <w:pPr>
-              <w:jc w:val="left"/>
-            </w:pPr>
-            <w:r>
-              <w:rPr>
-                <w:rFonts w:ascii="Times New Roman" w:cs="Times New Roman" w:eastAsia="Times New Roman" w:hAnsi="Times New Roman"/>
-                <w:b/>
-                <w:bCs/>
-                <w:sz w:val="22"/>
-                <w:szCs w:val="22"/>
-              </w:rPr>
-              <w:t xml:space="preserve">版本/配置</w:t>
-            </w:r>
-          </w:p>
-        </w:tc>
-      </w:tr>
-      <w:tr>
-        <w:tc>
-          <w:tcPr>
-            <w:tcW w:type="dxa" w:w="3120"/>
-            <w:tcBorders>
-              <w:top w:val="single" w:color="CCCCCC" w:sz="1"/>
-              <w:left w:val="single" w:color="CCCCCC" w:sz="1"/>
-              <w:bottom w:val="single" w:color="CCCCCC" w:sz="1"/>
-              <w:right w:val="single" w:color="CCCCCC" w:sz="1"/>
-            </w:tcBorders>
-            <w:tcMar>
-              <w:top w:type="dxa" w:w="80"/>
-              <w:left w:type="dxa" w:w="120"/>
-              <w:bottom w:type="dxa" w:w="80"/>
-              <w:right w:type="dxa" w:w="120"/>
-            </w:tcMar>
-            <w:vAlign w:val="center"/>
-          </w:tcPr>
-          <w:p>
-            <w:pPr>
-              <w:jc w:val="left"/>
-            </w:pPr>
-            <w:r>
-              <w:rPr>
-                <w:rFonts w:ascii="Times New Roman" w:cs="Times New Roman" w:eastAsia="Times New Roman" w:hAnsi="Times New Roman"/>
-                <w:b w:val="false"/>
-                <w:bCs w:val="false"/>
-                <w:sz w:val="22"/>
-                <w:szCs w:val="22"/>
-              </w:rPr>
-              <w:t xml:space="preserve">操作系统</w:t>
-            </w:r>
-          </w:p>
-        </w:tc>
-        <w:tc>
-          <w:tcPr>
-            <w:tcW w:type="dxa" w:w="6240"/>
-            <w:tcBorders>
-              <w:top w:val="single" w:color="CCCCCC" w:sz="1"/>
-              <w:left w:val="single" w:color="CCCCCC" w:sz="1"/>
-              <w:bottom w:val="single" w:color="CCCCCC" w:sz="1"/>
-              <w:right w:val="single" w:color="CCCCCC" w:sz="1"/>
-            </w:tcBorders>
-            <w:tcMar>
-              <w:top w:type="dxa" w:w="80"/>
-              <w:left w:type="dxa" w:w="120"/>
-              <w:bottom w:type="dxa" w:w="80"/>
-              <w:right w:type="dxa" w:w="120"/>
-            </w:tcMar>
-            <w:vAlign w:val="center"/>
-          </w:tcPr>
-          <w:p>
-            <w:pPr>
-              <w:jc w:val="left"/>
-            </w:pPr>
-            <w:r>
-              <w:rPr>
-                <w:rFonts w:ascii="Times New Roman" w:cs="Times New Roman" w:eastAsia="Times New Roman" w:hAnsi="Times New Roman"/>
-                <w:b w:val="false"/>
-                <w:bCs w:val="false"/>
-                <w:sz w:val="22"/>
-                <w:szCs w:val="22"/>
-              </w:rPr>
-              <w:t xml:space="preserve">macOS (Apple M5)</w:t>
-            </w:r>
-          </w:p>
-        </w:tc>
-      </w:tr>
-      <w:tr>
-        <w:tc>
-          <w:tcPr>
-            <w:tcW w:type="dxa" w:w="3120"/>
-            <w:tcBorders>
-              <w:top w:val="single" w:color="CCCCCC" w:sz="1"/>
-              <w:left w:val="single" w:color="CCCCCC" w:sz="1"/>
-              <w:bottom w:val="single" w:color="CCCCCC" w:sz="1"/>
-              <w:right w:val="single" w:color="CCCCCC" w:sz="1"/>
-            </w:tcBorders>
-            <w:tcMar>
-              <w:top w:type="dxa" w:w="80"/>
-              <w:left w:type="dxa" w:w="120"/>
-              <w:bottom w:type="dxa" w:w="80"/>
-              <w:right w:type="dxa" w:w="120"/>
-            </w:tcMar>
-            <w:vAlign w:val="center"/>
-          </w:tcPr>
-          <w:p>
-            <w:pPr>
-              <w:jc w:val="left"/>
-            </w:pPr>
-            <w:r>
-              <w:rPr>
-                <w:rFonts w:ascii="Times New Roman" w:cs="Times New Roman" w:eastAsia="Times New Roman" w:hAnsi="Times New Roman"/>
-                <w:b w:val="false"/>
-                <w:bCs w:val="false"/>
-                <w:sz w:val="22"/>
-                <w:szCs w:val="22"/>
-              </w:rPr>
-              <w:t xml:space="preserve">加速后端</w:t>
-            </w:r>
-          </w:p>
-        </w:tc>
-        <w:tc>
-          <w:tcPr>
-            <w:tcW w:type="dxa" w:w="6240"/>
-            <w:tcBorders>
-              <w:top w:val="single" w:color="CCCCCC" w:sz="1"/>
-              <w:left w:val="single" w:color="CCCCCC" w:sz="1"/>
-              <w:bottom w:val="single" w:color="CCCCCC" w:sz="1"/>
-              <w:right w:val="single" w:color="CCCCCC" w:sz="1"/>
-            </w:tcBorders>
-            <w:tcMar>
-              <w:top w:type="dxa" w:w="80"/>
-              <w:left w:type="dxa" w:w="120"/>
-              <w:bottom w:type="dxa" w:w="80"/>
-              <w:right w:type="dxa" w:w="120"/>
-            </w:tcMar>
-            <w:vAlign w:val="center"/>
-          </w:tcPr>
-          <w:p>
-            <w:pPr>
-              <w:jc w:val="left"/>
-            </w:pPr>
-            <w:r>
-              <w:rPr>
-                <w:rFonts w:ascii="Times New Roman" w:cs="Times New Roman" w:eastAsia="Times New Roman" w:hAnsi="Times New Roman"/>
-                <w:b w:val="false"/>
-                <w:bCs w:val="false"/>
-                <w:sz w:val="22"/>
-                <w:szCs w:val="22"/>
-              </w:rPr>
-              <w:t xml:space="preserve">MPS (Metal Performance Shaders)</w:t>
-            </w:r>
-          </w:p>
-        </w:tc>
-      </w:tr>
-      <w:tr>
-        <w:tc>
-          <w:tcPr>
-            <w:tcW w:type="dxa" w:w="3120"/>
-            <w:tcBorders>
-              <w:top w:val="single" w:color="CCCCCC" w:sz="1"/>
-              <w:left w:val="single" w:color="CCCCCC" w:sz="1"/>
-              <w:bottom w:val="single" w:color="CCCCCC" w:sz="1"/>
-              <w:right w:val="single" w:color="CCCCCC" w:sz="1"/>
-            </w:tcBorders>
-            <w:tcMar>
-              <w:top w:type="dxa" w:w="80"/>
-              <w:left w:type="dxa" w:w="120"/>
-              <w:bottom w:type="dxa" w:w="80"/>
-              <w:right w:type="dxa" w:w="120"/>
-            </w:tcMar>
-            <w:vAlign w:val="center"/>
-          </w:tcPr>
-          <w:p>
-            <w:pPr>
-              <w:jc w:val="left"/>
-            </w:pPr>
-            <w:r>
-              <w:rPr>
-                <w:rFonts w:ascii="Times New Roman" w:cs="Times New Roman" w:eastAsia="Times New Roman" w:hAnsi="Times New Roman"/>
-                <w:b w:val="false"/>
-                <w:bCs w:val="false"/>
-                <w:sz w:val="22"/>
-                <w:szCs w:val="22"/>
-              </w:rPr>
-              <w:t xml:space="preserve">Python 版本</w:t>
-            </w:r>
-          </w:p>
-        </w:tc>
-        <w:tc>
-          <w:tcPr>
-            <w:tcW w:type="dxa" w:w="6240"/>
-            <w:tcBorders>
-              <w:top w:val="single" w:color="CCCCCC" w:sz="1"/>
-              <w:left w:val="single" w:color="CCCCCC" w:sz="1"/>
-              <w:bottom w:val="single" w:color="CCCCCC" w:sz="1"/>
-              <w:right w:val="single" w:color="CCCCCC" w:sz="1"/>
-            </w:tcBorders>
-            <w:tcMar>
-              <w:top w:type="dxa" w:w="80"/>
-              <w:left w:type="dxa" w:w="120"/>
-              <w:bottom w:type="dxa" w:w="80"/>
-              <w:right w:type="dxa" w:w="120"/>
-            </w:tcMar>
-            <w:vAlign w:val="center"/>
-          </w:tcPr>
-          <w:p>
-            <w:pPr>
-              <w:jc w:val="left"/>
-            </w:pPr>
-            <w:r>
-              <w:rPr>
-                <w:rFonts w:ascii="Times New Roman" w:cs="Times New Roman" w:eastAsia="Times New Roman" w:hAnsi="Times New Roman"/>
-                <w:b w:val="false"/>
-                <w:bCs w:val="false"/>
-                <w:sz w:val="22"/>
-                <w:szCs w:val="22"/>
-              </w:rPr>
-              <w:t xml:space="preserve">3.10</w:t>
-            </w:r>
-          </w:p>
-        </w:tc>
-      </w:tr>
-      <w:tr>
-        <w:tc>
-          <w:tcPr>
-            <w:tcW w:type="dxa" w:w="3120"/>
-            <w:tcBorders>
-              <w:top w:val="single" w:color="CCCCCC" w:sz="1"/>
-              <w:left w:val="single" w:color="CCCCCC" w:sz="1"/>
-              <w:bottom w:val="single" w:color="CCCCCC" w:sz="1"/>
-              <w:right w:val="single" w:color="CCCCCC" w:sz="1"/>
-            </w:tcBorders>
-            <w:tcMar>
-              <w:top w:type="dxa" w:w="80"/>
-              <w:left w:type="dxa" w:w="120"/>
-              <w:bottom w:type="dxa" w:w="80"/>
-              <w:right w:type="dxa" w:w="120"/>
-            </w:tcMar>
-            <w:vAlign w:val="center"/>
-          </w:tcPr>
-          <w:p>
-            <w:pPr>
-              <w:jc w:val="left"/>
-            </w:pPr>
-            <w:r>
-              <w:rPr>
-                <w:rFonts w:ascii="Times New Roman" w:cs="Times New Roman" w:eastAsia="Times New Roman" w:hAnsi="Times New Roman"/>
-                <w:b w:val="false"/>
-                <w:bCs w:val="false"/>
-                <w:sz w:val="22"/>
-                <w:szCs w:val="22"/>
-              </w:rPr>
-              <w:t xml:space="preserve">PyTorch 版本</w:t>
-            </w:r>
-          </w:p>
-        </w:tc>
-        <w:tc>
-          <w:tcPr>
-            <w:tcW w:type="dxa" w:w="6240"/>
-            <w:tcBorders>
-              <w:top w:val="single" w:color="CCCCCC" w:sz="1"/>
-              <w:left w:val="single" w:color="CCCCCC" w:sz="1"/>
-              <w:bottom w:val="single" w:color="CCCCCC" w:sz="1"/>
-              <w:right w:val="single" w:color="CCCCCC" w:sz="1"/>
-            </w:tcBorders>
-            <w:tcMar>
-              <w:top w:type="dxa" w:w="80"/>
-              <w:left w:type="dxa" w:w="120"/>
-              <w:bottom w:type="dxa" w:w="80"/>
-              <w:right w:type="dxa" w:w="120"/>
-            </w:tcMar>
-            <w:vAlign w:val="center"/>
-          </w:tcPr>
-          <w:p>
-            <w:pPr>
-              <w:jc w:val="left"/>
-            </w:pPr>
-            <w:r>
-              <w:rPr>
-                <w:rFonts w:ascii="Times New Roman" w:cs="Times New Roman" w:eastAsia="Times New Roman" w:hAnsi="Times New Roman"/>
-                <w:b w:val="false"/>
-                <w:bCs w:val="false"/>
-                <w:sz w:val="22"/>
-                <w:szCs w:val="22"/>
-              </w:rPr>
-              <w:t xml:space="preserve">2.12.1</w:t>
-            </w:r>
-          </w:p>
-        </w:tc>
-      </w:tr>
-      <w:tr>
-        <w:tc>
-          <w:tcPr>
-            <w:tcW w:type="dxa" w:w="3120"/>
-            <w:tcBorders>
-              <w:top w:val="single" w:color="CCCCCC" w:sz="1"/>
-              <w:left w:val="single" w:color="CCCCCC" w:sz="1"/>
-              <w:bottom w:val="single" w:color="CCCCCC" w:sz="1"/>
-              <w:right w:val="single" w:color="CCCCCC" w:sz="1"/>
-            </w:tcBorders>
-            <w:tcMar>
-              <w:top w:type="dxa" w:w="80"/>
-              <w:left w:type="dxa" w:w="120"/>
-              <w:bottom w:type="dxa" w:w="80"/>
-              <w:right w:type="dxa" w:w="120"/>
-            </w:tcMar>
-            <w:vAlign w:val="center"/>
-          </w:tcPr>
-          <w:p>
-            <w:pPr>
-              <w:jc w:val="left"/>
-            </w:pPr>
-            <w:r>
-              <w:rPr>
-                <w:rFonts w:ascii="Times New Roman" w:cs="Times New Roman" w:eastAsia="Times New Roman" w:hAnsi="Times New Roman"/>
-                <w:b w:val="false"/>
-                <w:bCs w:val="false"/>
-                <w:sz w:val="22"/>
-                <w:szCs w:val="22"/>
-              </w:rPr>
-              <w:t xml:space="preserve">Coqui TTS 版本</w:t>
-            </w:r>
-          </w:p>
-        </w:tc>
-        <w:tc>
-          <w:tcPr>
-            <w:tcW w:type="dxa" w:w="6240"/>
-            <w:tcBorders>
-              <w:top w:val="single" w:color="CCCCCC" w:sz="1"/>
-              <w:left w:val="single" w:color="CCCCCC" w:sz="1"/>
-              <w:bottom w:val="single" w:color="CCCCCC" w:sz="1"/>
-              <w:right w:val="single" w:color="CCCCCC" w:sz="1"/>
-            </w:tcBorders>
-            <w:tcMar>
-              <w:top w:type="dxa" w:w="80"/>
-              <w:left w:type="dxa" w:w="120"/>
-              <w:bottom w:type="dxa" w:w="80"/>
-              <w:right w:type="dxa" w:w="120"/>
-            </w:tcMar>
-            <w:vAlign w:val="center"/>
-          </w:tcPr>
-          <w:p>
-            <w:pPr>
-              <w:jc w:val="left"/>
-            </w:pPr>
-            <w:r>
-              <w:rPr>
-                <w:rFonts w:ascii="Times New Roman" w:cs="Times New Roman" w:eastAsia="Times New Roman" w:hAnsi="Times New Roman"/>
-                <w:b w:val="false"/>
-                <w:bCs w:val="false"/>
-                <w:sz w:val="22"/>
-                <w:szCs w:val="22"/>
-              </w:rPr>
-              <w:t xml:space="preserve">0.22.0</w:t>
-            </w:r>
-          </w:p>
-        </w:tc>
-      </w:tr>
-      <w:tr>
-        <w:tc>
-          <w:tcPr>
-            <w:tcW w:type="dxa" w:w="3120"/>
-            <w:tcBorders>
-              <w:top w:val="single" w:color="CCCCCC" w:sz="1"/>
-              <w:left w:val="single" w:color="CCCCCC" w:sz="1"/>
-              <w:bottom w:val="single" w:color="CCCCCC" w:sz="1"/>
-              <w:right w:val="single" w:color="CCCCCC" w:sz="1"/>
-            </w:tcBorders>
-            <w:tcMar>
-              <w:top w:type="dxa" w:w="80"/>
-              <w:left w:type="dxa" w:w="120"/>
-              <w:bottom w:type="dxa" w:w="80"/>
-              <w:right w:type="dxa" w:w="120"/>
-            </w:tcMar>
-            <w:vAlign w:val="center"/>
-          </w:tcPr>
-          <w:p>
-            <w:pPr>
-              <w:jc w:val="left"/>
-            </w:pPr>
-            <w:r>
-              <w:rPr>
-                <w:rFonts w:ascii="Times New Roman" w:cs="Times New Roman" w:eastAsia="Times New Roman" w:hAnsi="Times New Roman"/>
-                <w:b w:val="false"/>
-                <w:bCs w:val="false"/>
-                <w:sz w:val="22"/>
-                <w:szCs w:val="22"/>
-              </w:rPr>
-              <w:t xml:space="preserve">espeak-ng 版本</w:t>
-            </w:r>
-          </w:p>
-        </w:tc>
-        <w:tc>
-          <w:tcPr>
-            <w:tcW w:type="dxa" w:w="6240"/>
-            <w:tcBorders>
-              <w:top w:val="single" w:color="CCCCCC" w:sz="1"/>
-              <w:left w:val="single" w:color="CCCCCC" w:sz="1"/>
-              <w:bottom w:val="single" w:color="CCCCCC" w:sz="1"/>
-              <w:right w:val="single" w:color="CCCCCC" w:sz="1"/>
-            </w:tcBorders>
-            <w:tcMar>
-              <w:top w:type="dxa" w:w="80"/>
-              <w:left w:type="dxa" w:w="120"/>
-              <w:bottom w:type="dxa" w:w="80"/>
-              <w:right w:type="dxa" w:w="120"/>
-            </w:tcMar>
-            <w:vAlign w:val="center"/>
-          </w:tcPr>
-          <w:p>
-            <w:pPr>
-              <w:jc w:val="left"/>
-            </w:pPr>
-            <w:r>
-              <w:rPr>
-                <w:rFonts w:ascii="Times New Roman" w:cs="Times New Roman" w:eastAsia="Times New Roman" w:hAnsi="Times New Roman"/>
-                <w:b w:val="false"/>
-                <w:bCs w:val="false"/>
-                <w:sz w:val="22"/>
-                <w:szCs w:val="22"/>
-              </w:rPr>
-              <w:t xml:space="preserve">1.52.0</w:t>
-            </w:r>
-          </w:p>
-        </w:tc>
-      </w:tr>
-    </w:tbl>
-    <w:p>
-      <w:pPr>
-        <w:pStyle w:val="Heading2"/>
-        <w:spacing w:after="120" w:before="240"/>
-      </w:pPr>
-      <w:r>
-        <w:rPr>
-          <w:rFonts w:ascii="Times New Roman" w:cs="Times New Roman" w:eastAsia="Times New Roman" w:hAnsi="Times New Roman"/>
-          <w:b/>
-          <w:bCs/>
-        </w:rPr>
-        <w:t xml:space="preserve">4.2  模型配置</w:t>
-      </w:r>
-    </w:p>
-    <w:p>
-      <w:pPr>
-        <w:spacing w:after="120" w:line="360"/>
-        <w:jc w:val="both"/>
-      </w:pPr>
-      <w:r>
-        <w:rPr>
-          <w:rFonts w:ascii="Times New Roman" w:cs="Times New Roman" w:eastAsia="Times New Roman" w:hAnsi="Times New Roman"/>
-          <w:b w:val="false"/>
-          <w:bCs w:val="false"/>
-          <w:sz w:val="22"/>
-          <w:szCs w:val="22"/>
-        </w:rPr>
-        <w:t xml:space="preserve">本项目使用 Coqui TTS 框架提供的预训练 VITS 模型。该模型在 LJSpeech 数据集上进行了充分的训练，能够生成高质量的英语语音。模型的主要配置参数如下：音频采样率为 22,050 Hz，FFT 大小为 1024，窗长为 1024，帧移为 256，Mel 频带数为 80。文本编码器采用 6 层 Transformer 架构，隐藏层维度为 192，注意力头数为 2。流模型采用 4 层仿射耦合层，每层包含 WaveNet 风格的残差块。HiFi-GAN 声码器的上采样率为 [8, 8, 2, 2]，初始通道数为 512。</w:t>
-      </w:r>
-    </w:p>
-    <w:p>
-      <w:pPr>
-        <w:spacing w:after="120" w:line="360"/>
-        <w:jc w:val="both"/>
-      </w:pPr>
-      <w:r>
-        <w:rPr>
-          <w:rFonts w:ascii="Times New Roman" w:cs="Times New Roman" w:eastAsia="Times New Roman" w:hAnsi="Times New Roman"/>
-          <w:b w:val="false"/>
-          <w:bCs w:val="false"/>
-          <w:sz w:val="22"/>
-          <w:szCs w:val="22"/>
-        </w:rPr>
-        <w:t xml:space="preserve">在推理阶段，模型采用单调对齐搜索（Monotonic Alignment Search, MAS）机制来确定文本和语音之间的对齐关系。MAS 是一种动态规划算法，能够在保证单调性的前提下找到最优的对齐路径。这种对齐机制避免了传统注意力机制可能出现的对齐错误，提高了合成语音的稳定性。</w:t>
-      </w:r>
-    </w:p>
-    <w:p>
-      <w:pPr>
-        <w:pStyle w:val="Heading2"/>
-        <w:spacing w:after="120" w:before="240"/>
-      </w:pPr>
-      <w:r>
-        <w:rPr>
-          <w:rFonts w:ascii="Times New Roman" w:cs="Times New Roman" w:eastAsia="Times New Roman" w:hAnsi="Times New Roman"/>
-          <w:b/>
-          <w:bCs/>
-        </w:rPr>
-        <w:t xml:space="preserve">4.3  推理流程</w:t>
-      </w:r>
-    </w:p>
-    <w:p>
-      <w:pPr>
-        <w:spacing w:after="120" w:line="360"/>
-        <w:jc w:val="both"/>
-      </w:pPr>
-      <w:r>
-        <w:rPr>
-          <w:rFonts w:ascii="Times New Roman" w:cs="Times New Roman" w:eastAsia="Times New Roman" w:hAnsi="Times New Roman"/>
-          <w:b w:val="false"/>
-          <w:bCs w:val="false"/>
-          <w:sz w:val="22"/>
-          <w:szCs w:val="22"/>
-        </w:rPr>
-        <w:t xml:space="preserve">模型的推理流程如下：首先，输入文本经过文本前端处理，包括文本清洗和音素化转换，得到音素序列。然后，音素序列被送入文本编码器，生成文本的隐表示。接下来，从先验分布（标准正态分布）中采样隐变量，并通过流模型将其转换为后验分布的样本。最后，将隐变量送入 HiFi-GAN 声码器，生成最终的语音波形。整个推理过程是端到端的，无需人工干预或中间处理步骤。</w:t>
+        <w:t xml:space="preserve">3  数据集介绍</w:t>
+      </w:r>
+    </w:p>
+    <w:p>
+      <w:pPr>
+        <w:spacing w:after="120" w:line="360"/>
+        <w:jc w:val="both"/>
+      </w:pPr>
+      <w:r>
+        <w:rPr>
+          <w:rFonts w:ascii="Times New Roman" w:cs="Times New Roman" w:eastAsia="Times New Roman" w:hAnsi="Times New Roman"/>
+          <w:b w:val="false"/>
+          <w:bCs w:val="false"/>
+          <w:sz w:val="22"/>
+          <w:szCs w:val="22"/>
+        </w:rPr>
+        <w:t xml:space="preserve">本项目使用 LJSpeech-1.1 数据集进行模型训练和评估。LJSpeech-1.1 是一个广泛使用的英语语音合成数据集，由 Keith Ito 收集并发布。该数据集的音频来源于 LibriVox 项目的有声读物，由单个女性说话人录制，总时长约为 24 小时。</w:t>
+      </w:r>
+    </w:p>
+    <w:p>
+      <w:pPr>
+        <w:spacing w:after="120" w:line="360"/>
+        <w:jc w:val="both"/>
+      </w:pPr>
+      <w:r>
+        <w:rPr>
+          <w:rFonts w:ascii="Times New Roman" w:cs="Times New Roman" w:eastAsia="Times New Roman" w:hAnsi="Times New Roman"/>
+          <w:b w:val="false"/>
+          <w:bCs w:val="false"/>
+          <w:sz w:val="22"/>
+          <w:szCs w:val="22"/>
+        </w:rPr>
+        <w:t xml:space="preserve">LJSpeech-1.1 数据集包含 13,100 条音频片段，每条音频对应一段文本。音频的采样率为 22,050 Hz，采用 16 位 PCM 编码格式。数据集的文本内容选自维基百科文章，涵盖了多种主题和文体，包括科技、历史、文化等领域。这种多样化的内容有助于训练出具有较好泛化能力的语音合成模型。</w:t>
+      </w:r>
+    </w:p>
+    <w:p>
+      <w:pPr>
+        <w:spacing w:after="120" w:line="360"/>
+        <w:jc w:val="both"/>
+      </w:pPr>
+      <w:r>
+        <w:rPr>
+          <w:rFonts w:ascii="Times New Roman" w:cs="Times New Roman" w:eastAsia="Times New Roman" w:hAnsi="Times New Roman"/>
+          <w:b w:val="false"/>
+          <w:bCs w:val="false"/>
+          <w:sz w:val="22"/>
+          <w:szCs w:val="22"/>
+        </w:rPr>
+        <w:t xml:space="preserve">数据集提供了标准化的元数据文件（metadata.csv），其中包含每条音频的文件名、原始文本和标准化文本。元数据文件采用竖线分隔的格式，便于数据加载和预处理。此外，数据集还提供了训练集、验证集和测试集的划分，方便模型的训练和评估。</w:t>
       </w:r>
     </w:p>
     <w:p>
@@ -2191,9 +1054,9 @@
       <w:r>
         <w:drawing>
           <wp:inline distT="0" distB="0" distL="0" distR="0">
-            <wp:extent cx="4572000" cy="3048000"/>
+            <wp:extent cx="4762500" cy="1714500"/>
             <wp:effectExtent t="0" r="0" b="0" l="0"/>
-            <wp:docPr id="1" name="waveform_mel.png" descr="waveform_mel.png" title="waveform_mel.png"/>
+            <wp:docPr id="1" name="dataset_distribution.png" descr="dataset_distribution.png" title="dataset_distribution.png"/>
             <wp:cNvGraphicFramePr>
               <a:graphicFrameLocks xmlns:a="http://schemas.openxmlformats.org/drawingml/2006/main" noChangeAspect="1"/>
             </wp:cNvGraphicFramePr>
@@ -2216,7 +1079,7 @@
                   <pic:spPr bwMode="auto">
                     <a:xfrm>
                       <a:off x="0" y="0"/>
-                      <a:ext cx="4572000" cy="3048000"/>
+                      <a:ext cx="4762500" cy="1714500"/>
                     </a:xfrm>
                     <a:prstGeom prst="rect">
                       <a:avLst/>
@@ -2240,25 +1103,572 @@
           <w:sz w:val="20"/>
           <w:szCs w:val="20"/>
         </w:rPr>
-        <w:t xml:space="preserve">图 4-1  合成语音波形图与Mel频谱图</w:t>
-      </w:r>
-    </w:p>
-    <w:p>
-      <w:pPr>
-        <w:spacing w:after="120" w:line="360"/>
-        <w:jc w:val="both"/>
-      </w:pPr>
-      <w:r>
-        <w:rPr>
-          <w:rFonts w:ascii="Times New Roman" w:cs="Times New Roman" w:eastAsia="Times New Roman" w:hAnsi="Times New Roman"/>
-          <w:b w:val="false"/>
-          <w:bCs w:val="false"/>
-          <w:sz w:val="22"/>
-          <w:szCs w:val="22"/>
-        </w:rPr>
-        <w:t xml:space="preserve">在实际应用中，我们使用 Coqui TTS 提供的 API 接口进行推理。该接口封装了模型加载、文本处理和语音生成的完整流程，用户只需提供输入文本即可获得合成语音。推理过程在 Apple Silicon 的 MPS 加速下能够实现实时或接近实时的合成速度。</w:t>
-      </w:r>
-    </w:p>
+        <w:t xml:space="preserve">图 3-1  LJSpeech数据集分布统计</w:t>
+      </w:r>
+    </w:p>
+    <w:tbl>
+      <w:tblPr>
+        <w:tblW w:type="dxa" w:w="9360"/>
+        <w:tblBorders>
+          <w:top w:val="single" w:color="auto" w:sz="4"/>
+          <w:left w:val="single" w:color="auto" w:sz="4"/>
+          <w:bottom w:val="single" w:color="auto" w:sz="4"/>
+          <w:right w:val="single" w:color="auto" w:sz="4"/>
+          <w:insideH w:val="single" w:color="auto" w:sz="4"/>
+          <w:insideV w:val="single" w:color="auto" w:sz="4"/>
+        </w:tblBorders>
+      </w:tblPr>
+      <w:tblGrid>
+        <w:gridCol w:w="3120"/>
+        <w:gridCol w:w="6240"/>
+      </w:tblGrid>
+      <w:tr>
+        <w:tc>
+          <w:tcPr>
+            <w:tcW w:type="dxa" w:w="3120"/>
+            <w:tcBorders>
+              <w:top w:val="single" w:color="CCCCCC" w:sz="1"/>
+              <w:left w:val="single" w:color="CCCCCC" w:sz="1"/>
+              <w:bottom w:val="single" w:color="CCCCCC" w:sz="1"/>
+              <w:right w:val="single" w:color="CCCCCC" w:sz="1"/>
+            </w:tcBorders>
+            <w:shd w:fill="D5E8F0" w:val="clear"/>
+            <w:tcMar>
+              <w:top w:type="dxa" w:w="80"/>
+              <w:left w:type="dxa" w:w="120"/>
+              <w:bottom w:type="dxa" w:w="80"/>
+              <w:right w:type="dxa" w:w="120"/>
+            </w:tcMar>
+            <w:vAlign w:val="center"/>
+          </w:tcPr>
+          <w:p>
+            <w:pPr>
+              <w:jc w:val="left"/>
+            </w:pPr>
+            <w:r>
+              <w:rPr>
+                <w:rFonts w:ascii="Times New Roman" w:cs="Times New Roman" w:eastAsia="Times New Roman" w:hAnsi="Times New Roman"/>
+                <w:b/>
+                <w:bCs/>
+                <w:sz w:val="22"/>
+                <w:szCs w:val="22"/>
+              </w:rPr>
+              <w:t xml:space="preserve">属性</w:t>
+            </w:r>
+          </w:p>
+        </w:tc>
+        <w:tc>
+          <w:tcPr>
+            <w:tcW w:type="dxa" w:w="6240"/>
+            <w:tcBorders>
+              <w:top w:val="single" w:color="CCCCCC" w:sz="1"/>
+              <w:left w:val="single" w:color="CCCCCC" w:sz="1"/>
+              <w:bottom w:val="single" w:color="CCCCCC" w:sz="1"/>
+              <w:right w:val="single" w:color="CCCCCC" w:sz="1"/>
+            </w:tcBorders>
+            <w:shd w:fill="D5E8F0" w:val="clear"/>
+            <w:tcMar>
+              <w:top w:type="dxa" w:w="80"/>
+              <w:left w:type="dxa" w:w="120"/>
+              <w:bottom w:type="dxa" w:w="80"/>
+              <w:right w:type="dxa" w:w="120"/>
+            </w:tcMar>
+            <w:vAlign w:val="center"/>
+          </w:tcPr>
+          <w:p>
+            <w:pPr>
+              <w:jc w:val="left"/>
+            </w:pPr>
+            <w:r>
+              <w:rPr>
+                <w:rFonts w:ascii="Times New Roman" w:cs="Times New Roman" w:eastAsia="Times New Roman" w:hAnsi="Times New Roman"/>
+                <w:b/>
+                <w:bCs/>
+                <w:sz w:val="22"/>
+                <w:szCs w:val="22"/>
+              </w:rPr>
+              <w:t xml:space="preserve">说明</w:t>
+            </w:r>
+          </w:p>
+        </w:tc>
+      </w:tr>
+      <w:tr>
+        <w:tc>
+          <w:tcPr>
+            <w:tcW w:type="dxa" w:w="3120"/>
+            <w:tcBorders>
+              <w:top w:val="single" w:color="CCCCCC" w:sz="1"/>
+              <w:left w:val="single" w:color="CCCCCC" w:sz="1"/>
+              <w:bottom w:val="single" w:color="CCCCCC" w:sz="1"/>
+              <w:right w:val="single" w:color="CCCCCC" w:sz="1"/>
+            </w:tcBorders>
+            <w:tcMar>
+              <w:top w:type="dxa" w:w="80"/>
+              <w:left w:type="dxa" w:w="120"/>
+              <w:bottom w:type="dxa" w:w="80"/>
+              <w:right w:type="dxa" w:w="120"/>
+            </w:tcMar>
+            <w:vAlign w:val="center"/>
+          </w:tcPr>
+          <w:p>
+            <w:pPr>
+              <w:jc w:val="left"/>
+            </w:pPr>
+            <w:r>
+              <w:rPr>
+                <w:rFonts w:ascii="Times New Roman" w:cs="Times New Roman" w:eastAsia="Times New Roman" w:hAnsi="Times New Roman"/>
+                <w:b w:val="false"/>
+                <w:bCs w:val="false"/>
+                <w:sz w:val="22"/>
+                <w:szCs w:val="22"/>
+              </w:rPr>
+              <w:t xml:space="preserve">数据集名称</w:t>
+            </w:r>
+          </w:p>
+        </w:tc>
+        <w:tc>
+          <w:tcPr>
+            <w:tcW w:type="dxa" w:w="6240"/>
+            <w:tcBorders>
+              <w:top w:val="single" w:color="CCCCCC" w:sz="1"/>
+              <w:left w:val="single" w:color="CCCCCC" w:sz="1"/>
+              <w:bottom w:val="single" w:color="CCCCCC" w:sz="1"/>
+              <w:right w:val="single" w:color="CCCCCC" w:sz="1"/>
+            </w:tcBorders>
+            <w:tcMar>
+              <w:top w:type="dxa" w:w="80"/>
+              <w:left w:type="dxa" w:w="120"/>
+              <w:bottom w:type="dxa" w:w="80"/>
+              <w:right w:type="dxa" w:w="120"/>
+            </w:tcMar>
+            <w:vAlign w:val="center"/>
+          </w:tcPr>
+          <w:p>
+            <w:pPr>
+              <w:jc w:val="left"/>
+            </w:pPr>
+            <w:r>
+              <w:rPr>
+                <w:rFonts w:ascii="Times New Roman" w:cs="Times New Roman" w:eastAsia="Times New Roman" w:hAnsi="Times New Roman"/>
+                <w:b w:val="false"/>
+                <w:bCs w:val="false"/>
+                <w:sz w:val="22"/>
+                <w:szCs w:val="22"/>
+              </w:rPr>
+              <w:t xml:space="preserve">LJSpeech-1.1</w:t>
+            </w:r>
+          </w:p>
+        </w:tc>
+      </w:tr>
+      <w:tr>
+        <w:tc>
+          <w:tcPr>
+            <w:tcW w:type="dxa" w:w="3120"/>
+            <w:tcBorders>
+              <w:top w:val="single" w:color="CCCCCC" w:sz="1"/>
+              <w:left w:val="single" w:color="CCCCCC" w:sz="1"/>
+              <w:bottom w:val="single" w:color="CCCCCC" w:sz="1"/>
+              <w:right w:val="single" w:color="CCCCCC" w:sz="1"/>
+            </w:tcBorders>
+            <w:tcMar>
+              <w:top w:type="dxa" w:w="80"/>
+              <w:left w:type="dxa" w:w="120"/>
+              <w:bottom w:type="dxa" w:w="80"/>
+              <w:right w:type="dxa" w:w="120"/>
+            </w:tcMar>
+            <w:vAlign w:val="center"/>
+          </w:tcPr>
+          <w:p>
+            <w:pPr>
+              <w:jc w:val="left"/>
+            </w:pPr>
+            <w:r>
+              <w:rPr>
+                <w:rFonts w:ascii="Times New Roman" w:cs="Times New Roman" w:eastAsia="Times New Roman" w:hAnsi="Times New Roman"/>
+                <w:b w:val="false"/>
+                <w:bCs w:val="false"/>
+                <w:sz w:val="22"/>
+                <w:szCs w:val="22"/>
+              </w:rPr>
+              <w:t xml:space="preserve">音频数量</w:t>
+            </w:r>
+          </w:p>
+        </w:tc>
+        <w:tc>
+          <w:tcPr>
+            <w:tcW w:type="dxa" w:w="6240"/>
+            <w:tcBorders>
+              <w:top w:val="single" w:color="CCCCCC" w:sz="1"/>
+              <w:left w:val="single" w:color="CCCCCC" w:sz="1"/>
+              <w:bottom w:val="single" w:color="CCCCCC" w:sz="1"/>
+              <w:right w:val="single" w:color="CCCCCC" w:sz="1"/>
+            </w:tcBorders>
+            <w:tcMar>
+              <w:top w:type="dxa" w:w="80"/>
+              <w:left w:type="dxa" w:w="120"/>
+              <w:bottom w:type="dxa" w:w="80"/>
+              <w:right w:type="dxa" w:w="120"/>
+            </w:tcMar>
+            <w:vAlign w:val="center"/>
+          </w:tcPr>
+          <w:p>
+            <w:pPr>
+              <w:jc w:val="left"/>
+            </w:pPr>
+            <w:r>
+              <w:rPr>
+                <w:rFonts w:ascii="Times New Roman" w:cs="Times New Roman" w:eastAsia="Times New Roman" w:hAnsi="Times New Roman"/>
+                <w:b w:val="false"/>
+                <w:bCs w:val="false"/>
+                <w:sz w:val="22"/>
+                <w:szCs w:val="22"/>
+              </w:rPr>
+              <w:t xml:space="preserve">13,100 条</w:t>
+            </w:r>
+          </w:p>
+        </w:tc>
+      </w:tr>
+      <w:tr>
+        <w:tc>
+          <w:tcPr>
+            <w:tcW w:type="dxa" w:w="3120"/>
+            <w:tcBorders>
+              <w:top w:val="single" w:color="CCCCCC" w:sz="1"/>
+              <w:left w:val="single" w:color="CCCCCC" w:sz="1"/>
+              <w:bottom w:val="single" w:color="CCCCCC" w:sz="1"/>
+              <w:right w:val="single" w:color="CCCCCC" w:sz="1"/>
+            </w:tcBorders>
+            <w:tcMar>
+              <w:top w:type="dxa" w:w="80"/>
+              <w:left w:type="dxa" w:w="120"/>
+              <w:bottom w:type="dxa" w:w="80"/>
+              <w:right w:type="dxa" w:w="120"/>
+            </w:tcMar>
+            <w:vAlign w:val="center"/>
+          </w:tcPr>
+          <w:p>
+            <w:pPr>
+              <w:jc w:val="left"/>
+            </w:pPr>
+            <w:r>
+              <w:rPr>
+                <w:rFonts w:ascii="Times New Roman" w:cs="Times New Roman" w:eastAsia="Times New Roman" w:hAnsi="Times New Roman"/>
+                <w:b w:val="false"/>
+                <w:bCs w:val="false"/>
+                <w:sz w:val="22"/>
+                <w:szCs w:val="22"/>
+              </w:rPr>
+              <w:t xml:space="preserve">总时长</w:t>
+            </w:r>
+          </w:p>
+        </w:tc>
+        <w:tc>
+          <w:tcPr>
+            <w:tcW w:type="dxa" w:w="6240"/>
+            <w:tcBorders>
+              <w:top w:val="single" w:color="CCCCCC" w:sz="1"/>
+              <w:left w:val="single" w:color="CCCCCC" w:sz="1"/>
+              <w:bottom w:val="single" w:color="CCCCCC" w:sz="1"/>
+              <w:right w:val="single" w:color="CCCCCC" w:sz="1"/>
+            </w:tcBorders>
+            <w:tcMar>
+              <w:top w:type="dxa" w:w="80"/>
+              <w:left w:type="dxa" w:w="120"/>
+              <w:bottom w:type="dxa" w:w="80"/>
+              <w:right w:type="dxa" w:w="120"/>
+            </w:tcMar>
+            <w:vAlign w:val="center"/>
+          </w:tcPr>
+          <w:p>
+            <w:pPr>
+              <w:jc w:val="left"/>
+            </w:pPr>
+            <w:r>
+              <w:rPr>
+                <w:rFonts w:ascii="Times New Roman" w:cs="Times New Roman" w:eastAsia="Times New Roman" w:hAnsi="Times New Roman"/>
+                <w:b w:val="false"/>
+                <w:bCs w:val="false"/>
+                <w:sz w:val="22"/>
+                <w:szCs w:val="22"/>
+              </w:rPr>
+              <w:t xml:space="preserve">约 24 小时</w:t>
+            </w:r>
+          </w:p>
+        </w:tc>
+      </w:tr>
+      <w:tr>
+        <w:tc>
+          <w:tcPr>
+            <w:tcW w:type="dxa" w:w="3120"/>
+            <w:tcBorders>
+              <w:top w:val="single" w:color="CCCCCC" w:sz="1"/>
+              <w:left w:val="single" w:color="CCCCCC" w:sz="1"/>
+              <w:bottom w:val="single" w:color="CCCCCC" w:sz="1"/>
+              <w:right w:val="single" w:color="CCCCCC" w:sz="1"/>
+            </w:tcBorders>
+            <w:tcMar>
+              <w:top w:type="dxa" w:w="80"/>
+              <w:left w:type="dxa" w:w="120"/>
+              <w:bottom w:type="dxa" w:w="80"/>
+              <w:right w:type="dxa" w:w="120"/>
+            </w:tcMar>
+            <w:vAlign w:val="center"/>
+          </w:tcPr>
+          <w:p>
+            <w:pPr>
+              <w:jc w:val="left"/>
+            </w:pPr>
+            <w:r>
+              <w:rPr>
+                <w:rFonts w:ascii="Times New Roman" w:cs="Times New Roman" w:eastAsia="Times New Roman" w:hAnsi="Times New Roman"/>
+                <w:b w:val="false"/>
+                <w:bCs w:val="false"/>
+                <w:sz w:val="22"/>
+                <w:szCs w:val="22"/>
+              </w:rPr>
+              <w:t xml:space="preserve">采样率</w:t>
+            </w:r>
+          </w:p>
+        </w:tc>
+        <w:tc>
+          <w:tcPr>
+            <w:tcW w:type="dxa" w:w="6240"/>
+            <w:tcBorders>
+              <w:top w:val="single" w:color="CCCCCC" w:sz="1"/>
+              <w:left w:val="single" w:color="CCCCCC" w:sz="1"/>
+              <w:bottom w:val="single" w:color="CCCCCC" w:sz="1"/>
+              <w:right w:val="single" w:color="CCCCCC" w:sz="1"/>
+            </w:tcBorders>
+            <w:tcMar>
+              <w:top w:type="dxa" w:w="80"/>
+              <w:left w:type="dxa" w:w="120"/>
+              <w:bottom w:type="dxa" w:w="80"/>
+              <w:right w:type="dxa" w:w="120"/>
+            </w:tcMar>
+            <w:vAlign w:val="center"/>
+          </w:tcPr>
+          <w:p>
+            <w:pPr>
+              <w:jc w:val="left"/>
+            </w:pPr>
+            <w:r>
+              <w:rPr>
+                <w:rFonts w:ascii="Times New Roman" w:cs="Times New Roman" w:eastAsia="Times New Roman" w:hAnsi="Times New Roman"/>
+                <w:b w:val="false"/>
+                <w:bCs w:val="false"/>
+                <w:sz w:val="22"/>
+                <w:szCs w:val="22"/>
+              </w:rPr>
+              <w:t xml:space="preserve">22,050 Hz</w:t>
+            </w:r>
+          </w:p>
+        </w:tc>
+      </w:tr>
+      <w:tr>
+        <w:tc>
+          <w:tcPr>
+            <w:tcW w:type="dxa" w:w="3120"/>
+            <w:tcBorders>
+              <w:top w:val="single" w:color="CCCCCC" w:sz="1"/>
+              <w:left w:val="single" w:color="CCCCCC" w:sz="1"/>
+              <w:bottom w:val="single" w:color="CCCCCC" w:sz="1"/>
+              <w:right w:val="single" w:color="CCCCCC" w:sz="1"/>
+            </w:tcBorders>
+            <w:tcMar>
+              <w:top w:type="dxa" w:w="80"/>
+              <w:left w:type="dxa" w:w="120"/>
+              <w:bottom w:type="dxa" w:w="80"/>
+              <w:right w:type="dxa" w:w="120"/>
+            </w:tcMar>
+            <w:vAlign w:val="center"/>
+          </w:tcPr>
+          <w:p>
+            <w:pPr>
+              <w:jc w:val="left"/>
+            </w:pPr>
+            <w:r>
+              <w:rPr>
+                <w:rFonts w:ascii="Times New Roman" w:cs="Times New Roman" w:eastAsia="Times New Roman" w:hAnsi="Times New Roman"/>
+                <w:b w:val="false"/>
+                <w:bCs w:val="false"/>
+                <w:sz w:val="22"/>
+                <w:szCs w:val="22"/>
+              </w:rPr>
+              <w:t xml:space="preserve">说话人</w:t>
+            </w:r>
+          </w:p>
+        </w:tc>
+        <w:tc>
+          <w:tcPr>
+            <w:tcW w:type="dxa" w:w="6240"/>
+            <w:tcBorders>
+              <w:top w:val="single" w:color="CCCCCC" w:sz="1"/>
+              <w:left w:val="single" w:color="CCCCCC" w:sz="1"/>
+              <w:bottom w:val="single" w:color="CCCCCC" w:sz="1"/>
+              <w:right w:val="single" w:color="CCCCCC" w:sz="1"/>
+            </w:tcBorders>
+            <w:tcMar>
+              <w:top w:type="dxa" w:w="80"/>
+              <w:left w:type="dxa" w:w="120"/>
+              <w:bottom w:type="dxa" w:w="80"/>
+              <w:right w:type="dxa" w:w="120"/>
+            </w:tcMar>
+            <w:vAlign w:val="center"/>
+          </w:tcPr>
+          <w:p>
+            <w:pPr>
+              <w:jc w:val="left"/>
+            </w:pPr>
+            <w:r>
+              <w:rPr>
+                <w:rFonts w:ascii="Times New Roman" w:cs="Times New Roman" w:eastAsia="Times New Roman" w:hAnsi="Times New Roman"/>
+                <w:b w:val="false"/>
+                <w:bCs w:val="false"/>
+                <w:sz w:val="22"/>
+                <w:szCs w:val="22"/>
+              </w:rPr>
+              <w:t xml:space="preserve">单说话人（女性）</w:t>
+            </w:r>
+          </w:p>
+        </w:tc>
+      </w:tr>
+      <w:tr>
+        <w:tc>
+          <w:tcPr>
+            <w:tcW w:type="dxa" w:w="3120"/>
+            <w:tcBorders>
+              <w:top w:val="single" w:color="CCCCCC" w:sz="1"/>
+              <w:left w:val="single" w:color="CCCCCC" w:sz="1"/>
+              <w:bottom w:val="single" w:color="CCCCCC" w:sz="1"/>
+              <w:right w:val="single" w:color="CCCCCC" w:sz="1"/>
+            </w:tcBorders>
+            <w:tcMar>
+              <w:top w:type="dxa" w:w="80"/>
+              <w:left w:type="dxa" w:w="120"/>
+              <w:bottom w:type="dxa" w:w="80"/>
+              <w:right w:type="dxa" w:w="120"/>
+            </w:tcMar>
+            <w:vAlign w:val="center"/>
+          </w:tcPr>
+          <w:p>
+            <w:pPr>
+              <w:jc w:val="left"/>
+            </w:pPr>
+            <w:r>
+              <w:rPr>
+                <w:rFonts w:ascii="Times New Roman" w:cs="Times New Roman" w:eastAsia="Times New Roman" w:hAnsi="Times New Roman"/>
+                <w:b w:val="false"/>
+                <w:bCs w:val="false"/>
+                <w:sz w:val="22"/>
+                <w:szCs w:val="22"/>
+              </w:rPr>
+              <w:t xml:space="preserve">语言</w:t>
+            </w:r>
+          </w:p>
+        </w:tc>
+        <w:tc>
+          <w:tcPr>
+            <w:tcW w:type="dxa" w:w="6240"/>
+            <w:tcBorders>
+              <w:top w:val="single" w:color="CCCCCC" w:sz="1"/>
+              <w:left w:val="single" w:color="CCCCCC" w:sz="1"/>
+              <w:bottom w:val="single" w:color="CCCCCC" w:sz="1"/>
+              <w:right w:val="single" w:color="CCCCCC" w:sz="1"/>
+            </w:tcBorders>
+            <w:tcMar>
+              <w:top w:type="dxa" w:w="80"/>
+              <w:left w:type="dxa" w:w="120"/>
+              <w:bottom w:type="dxa" w:w="80"/>
+              <w:right w:type="dxa" w:w="120"/>
+            </w:tcMar>
+            <w:vAlign w:val="center"/>
+          </w:tcPr>
+          <w:p>
+            <w:pPr>
+              <w:jc w:val="left"/>
+            </w:pPr>
+            <w:r>
+              <w:rPr>
+                <w:rFonts w:ascii="Times New Roman" w:cs="Times New Roman" w:eastAsia="Times New Roman" w:hAnsi="Times New Roman"/>
+                <w:b w:val="false"/>
+                <w:bCs w:val="false"/>
+                <w:sz w:val="22"/>
+                <w:szCs w:val="22"/>
+              </w:rPr>
+              <w:t xml:space="preserve">英语</w:t>
+            </w:r>
+          </w:p>
+        </w:tc>
+      </w:tr>
+      <w:tr>
+        <w:tc>
+          <w:tcPr>
+            <w:tcW w:type="dxa" w:w="3120"/>
+            <w:tcBorders>
+              <w:top w:val="single" w:color="CCCCCC" w:sz="1"/>
+              <w:left w:val="single" w:color="CCCCCC" w:sz="1"/>
+              <w:bottom w:val="single" w:color="CCCCCC" w:sz="1"/>
+              <w:right w:val="single" w:color="CCCCCC" w:sz="1"/>
+            </w:tcBorders>
+            <w:tcMar>
+              <w:top w:type="dxa" w:w="80"/>
+              <w:left w:type="dxa" w:w="120"/>
+              <w:bottom w:type="dxa" w:w="80"/>
+              <w:right w:type="dxa" w:w="120"/>
+            </w:tcMar>
+            <w:vAlign w:val="center"/>
+          </w:tcPr>
+          <w:p>
+            <w:pPr>
+              <w:jc w:val="left"/>
+            </w:pPr>
+            <w:r>
+              <w:rPr>
+                <w:rFonts w:ascii="Times New Roman" w:cs="Times New Roman" w:eastAsia="Times New Roman" w:hAnsi="Times New Roman"/>
+                <w:b w:val="false"/>
+                <w:bCs w:val="false"/>
+                <w:sz w:val="22"/>
+                <w:szCs w:val="22"/>
+              </w:rPr>
+              <w:t xml:space="preserve">内容来源</w:t>
+            </w:r>
+          </w:p>
+        </w:tc>
+        <w:tc>
+          <w:tcPr>
+            <w:tcW w:type="dxa" w:w="6240"/>
+            <w:tcBorders>
+              <w:top w:val="single" w:color="CCCCCC" w:sz="1"/>
+              <w:left w:val="single" w:color="CCCCCC" w:sz="1"/>
+              <w:bottom w:val="single" w:color="CCCCCC" w:sz="1"/>
+              <w:right w:val="single" w:color="CCCCCC" w:sz="1"/>
+            </w:tcBorders>
+            <w:tcMar>
+              <w:top w:type="dxa" w:w="80"/>
+              <w:left w:type="dxa" w:w="120"/>
+              <w:bottom w:type="dxa" w:w="80"/>
+              <w:right w:type="dxa" w:w="120"/>
+            </w:tcMar>
+            <w:vAlign w:val="center"/>
+          </w:tcPr>
+          <w:p>
+            <w:pPr>
+              <w:jc w:val="left"/>
+            </w:pPr>
+            <w:r>
+              <w:rPr>
+                <w:rFonts w:ascii="Times New Roman" w:cs="Times New Roman" w:eastAsia="Times New Roman" w:hAnsi="Times New Roman"/>
+                <w:b w:val="false"/>
+                <w:bCs w:val="false"/>
+                <w:sz w:val="22"/>
+                <w:szCs w:val="22"/>
+              </w:rPr>
+              <w:t xml:space="preserve">维基百科文章</w:t>
+            </w:r>
+          </w:p>
+        </w:tc>
+      </w:tr>
+    </w:tbl>
     <w:p>
       <w:r>
         <w:br w:type="page"/>
@@ -2275,7 +1685,7 @@
           <w:b/>
           <w:bCs/>
         </w:rPr>
-        <w:t xml:space="preserve">5  实验结果与分析</w:t>
+        <w:t xml:space="preserve">4  系统实现</w:t>
       </w:r>
     </w:p>
     <w:p>
@@ -2289,57 +1699,536 @@
           <w:b/>
           <w:bCs/>
         </w:rPr>
-        <w:t xml:space="preserve">5.1  评估指标</w:t>
-      </w:r>
-    </w:p>
-    <w:p>
-      <w:pPr>
-        <w:spacing w:after="120" w:line="360"/>
-        <w:jc w:val="both"/>
-      </w:pPr>
-      <w:r>
-        <w:rPr>
-          <w:rFonts w:ascii="Times New Roman" w:cs="Times New Roman" w:eastAsia="Times New Roman" w:hAnsi="Times New Roman"/>
-          <w:b w:val="false"/>
-          <w:bCs w:val="false"/>
-          <w:sz w:val="22"/>
-          <w:szCs w:val="22"/>
-        </w:rPr>
-        <w:t xml:space="preserve">本项目采用 PESQ（Perceptual Evaluation of Speech Quality）作为语音质量的客观评估指标。PESQ 是国际电信联盟（ITU-T）在 P.862 标准中定义的语音质量评估方法，广泛应用于通信和语音处理领域。PESQ 通过模拟人类听觉系统的感知特性，对失真语音与参考语音进行比较，输出一个介于 -0.5 到 4.5 之间的质量分数。分数越高表示语音质量越好，其中 4.0 分以上通常被认为具有接近透明的语音质量。</w:t>
-      </w:r>
-    </w:p>
-    <w:p>
-      <w:pPr>
-        <w:spacing w:after="120" w:line="360"/>
-        <w:jc w:val="both"/>
-      </w:pPr>
-      <w:r>
-        <w:rPr>
-          <w:rFonts w:ascii="Times New Roman" w:cs="Times New Roman" w:eastAsia="Times New Roman" w:hAnsi="Times New Roman"/>
-          <w:b w:val="false"/>
-          <w:bCs w:val="false"/>
-          <w:sz w:val="22"/>
-          <w:szCs w:val="22"/>
-        </w:rPr>
-        <w:t xml:space="preserve">PESQ 算法的核心思想是将参考信号和失真信号分别通过听觉变换模型，转换为感知域的表示，然后计算两者之间的差异。听觉变换模型包括时间对齐、频率弯曲、响度压缩等处理步骤，旨在模拟人类听觉系统对语音信号的处理过程。PESQ 的优势在于其与主观评估结果具有较高的相关性，能够较为准确地反映人类对语音质量的感知。</w:t>
-      </w:r>
-    </w:p>
-    <w:p>
-      <w:pPr>
-        <w:spacing w:after="120" w:line="360"/>
-        <w:jc w:val="both"/>
-      </w:pPr>
-      <w:r>
-        <w:rPr>
-          <w:rFonts w:ascii="Times New Roman" w:cs="Times New Roman" w:eastAsia="Times New Roman" w:hAnsi="Times New Roman"/>
-          <w:b w:val="false"/>
-          <w:bCs w:val="false"/>
-          <w:sz w:val="22"/>
-          <w:szCs w:val="22"/>
-        </w:rPr>
-        <w:t xml:space="preserve">除了 PESQ 之外，本项目还参考了 STOI（Short-Time Objective Intelligibility）和 SNR（Signal-to-Noise Ratio）等辅助评估指标。STOI 用于评估语音的可懂度，取值范围为 0 到 1，分数越高表示可懂度越好。SNR 用于评估信号与噪声的比例，通常以分贝（dB）为单位。这些指标从不同角度反映了合成语音的质量，为系统的评估提供了多维度的参考。</w:t>
-      </w:r>
-    </w:p>
+        <w:t xml:space="preserve">4.1  开发环境</w:t>
+      </w:r>
+    </w:p>
+    <w:p>
+      <w:pPr>
+        <w:spacing w:after="120" w:line="360"/>
+        <w:jc w:val="both"/>
+      </w:pPr>
+      <w:r>
+        <w:rPr>
+          <w:rFonts w:ascii="Times New Roman" w:cs="Times New Roman" w:eastAsia="Times New Roman" w:hAnsi="Times New Roman"/>
+          <w:b w:val="false"/>
+          <w:bCs w:val="false"/>
+          <w:sz w:val="22"/>
+          <w:szCs w:val="22"/>
+        </w:rPr>
+        <w:t xml:space="preserve">本项目的开发环境基于 macOS 操作系统和 Apple Silicon M5 芯片。为了充分利用 Apple Silicon 的计算能力，我们采用了 MPS（Metal Performance Shaders）作为 PyTorch 的后端加速器。MPS 是 Apple 提供的 GPU 加速框架，能够在 Apple Silicon 芯片上实现高效的深度学习计算。</w:t>
+      </w:r>
+    </w:p>
+    <w:p>
+      <w:pPr>
+        <w:spacing w:after="120" w:line="360"/>
+        <w:jc w:val="both"/>
+      </w:pPr>
+      <w:r>
+        <w:rPr>
+          <w:rFonts w:ascii="Times New Roman" w:cs="Times New Roman" w:eastAsia="Times New Roman" w:hAnsi="Times New Roman"/>
+          <w:b w:val="false"/>
+          <w:bCs w:val="false"/>
+          <w:sz w:val="22"/>
+          <w:szCs w:val="22"/>
+        </w:rPr>
+        <w:t xml:space="preserve">Python 环境采用 Conda 进行管理，Python 版本为 3.10。深度学习框架采用 PyTorch 2.12.1，该版本对 MPS 提供了良好的支持。语音合成框架采用 Coqui TTS 0.22.0，这是一个功能强大且易于使用的开源 TTS 框架，支持多种先进的语音合成模型。此外，系统还依赖 espeak-ng 进行音素化处理，librosa 进行音频处理，pesq 进行语音质量评估。</w:t>
+      </w:r>
+    </w:p>
+    <w:tbl>
+      <w:tblPr>
+        <w:tblW w:type="dxa" w:w="9360"/>
+        <w:tblBorders>
+          <w:top w:val="single" w:color="auto" w:sz="4"/>
+          <w:left w:val="single" w:color="auto" w:sz="4"/>
+          <w:bottom w:val="single" w:color="auto" w:sz="4"/>
+          <w:right w:val="single" w:color="auto" w:sz="4"/>
+          <w:insideH w:val="single" w:color="auto" w:sz="4"/>
+          <w:insideV w:val="single" w:color="auto" w:sz="4"/>
+        </w:tblBorders>
+      </w:tblPr>
+      <w:tblGrid>
+        <w:gridCol w:w="3120"/>
+        <w:gridCol w:w="6240"/>
+      </w:tblGrid>
+      <w:tr>
+        <w:tc>
+          <w:tcPr>
+            <w:tcW w:type="dxa" w:w="3120"/>
+            <w:tcBorders>
+              <w:top w:val="single" w:color="CCCCCC" w:sz="1"/>
+              <w:left w:val="single" w:color="CCCCCC" w:sz="1"/>
+              <w:bottom w:val="single" w:color="CCCCCC" w:sz="1"/>
+              <w:right w:val="single" w:color="CCCCCC" w:sz="1"/>
+            </w:tcBorders>
+            <w:shd w:fill="D5E8F0" w:val="clear"/>
+            <w:tcMar>
+              <w:top w:type="dxa" w:w="80"/>
+              <w:left w:type="dxa" w:w="120"/>
+              <w:bottom w:type="dxa" w:w="80"/>
+              <w:right w:type="dxa" w:w="120"/>
+            </w:tcMar>
+            <w:vAlign w:val="center"/>
+          </w:tcPr>
+          <w:p>
+            <w:pPr>
+              <w:jc w:val="left"/>
+            </w:pPr>
+            <w:r>
+              <w:rPr>
+                <w:rFonts w:ascii="Times New Roman" w:cs="Times New Roman" w:eastAsia="Times New Roman" w:hAnsi="Times New Roman"/>
+                <w:b/>
+                <w:bCs/>
+                <w:sz w:val="22"/>
+                <w:szCs w:val="22"/>
+              </w:rPr>
+              <w:t xml:space="preserve">组件</w:t>
+            </w:r>
+          </w:p>
+        </w:tc>
+        <w:tc>
+          <w:tcPr>
+            <w:tcW w:type="dxa" w:w="6240"/>
+            <w:tcBorders>
+              <w:top w:val="single" w:color="CCCCCC" w:sz="1"/>
+              <w:left w:val="single" w:color="CCCCCC" w:sz="1"/>
+              <w:bottom w:val="single" w:color="CCCCCC" w:sz="1"/>
+              <w:right w:val="single" w:color="CCCCCC" w:sz="1"/>
+            </w:tcBorders>
+            <w:shd w:fill="D5E8F0" w:val="clear"/>
+            <w:tcMar>
+              <w:top w:type="dxa" w:w="80"/>
+              <w:left w:type="dxa" w:w="120"/>
+              <w:bottom w:type="dxa" w:w="80"/>
+              <w:right w:type="dxa" w:w="120"/>
+            </w:tcMar>
+            <w:vAlign w:val="center"/>
+          </w:tcPr>
+          <w:p>
+            <w:pPr>
+              <w:jc w:val="left"/>
+            </w:pPr>
+            <w:r>
+              <w:rPr>
+                <w:rFonts w:ascii="Times New Roman" w:cs="Times New Roman" w:eastAsia="Times New Roman" w:hAnsi="Times New Roman"/>
+                <w:b/>
+                <w:bCs/>
+                <w:sz w:val="22"/>
+                <w:szCs w:val="22"/>
+              </w:rPr>
+              <w:t xml:space="preserve">版本/配置</w:t>
+            </w:r>
+          </w:p>
+        </w:tc>
+      </w:tr>
+      <w:tr>
+        <w:tc>
+          <w:tcPr>
+            <w:tcW w:type="dxa" w:w="3120"/>
+            <w:tcBorders>
+              <w:top w:val="single" w:color="CCCCCC" w:sz="1"/>
+              <w:left w:val="single" w:color="CCCCCC" w:sz="1"/>
+              <w:bottom w:val="single" w:color="CCCCCC" w:sz="1"/>
+              <w:right w:val="single" w:color="CCCCCC" w:sz="1"/>
+            </w:tcBorders>
+            <w:tcMar>
+              <w:top w:type="dxa" w:w="80"/>
+              <w:left w:type="dxa" w:w="120"/>
+              <w:bottom w:type="dxa" w:w="80"/>
+              <w:right w:type="dxa" w:w="120"/>
+            </w:tcMar>
+            <w:vAlign w:val="center"/>
+          </w:tcPr>
+          <w:p>
+            <w:pPr>
+              <w:jc w:val="left"/>
+            </w:pPr>
+            <w:r>
+              <w:rPr>
+                <w:rFonts w:ascii="Times New Roman" w:cs="Times New Roman" w:eastAsia="Times New Roman" w:hAnsi="Times New Roman"/>
+                <w:b w:val="false"/>
+                <w:bCs w:val="false"/>
+                <w:sz w:val="22"/>
+                <w:szCs w:val="22"/>
+              </w:rPr>
+              <w:t xml:space="preserve">操作系统</w:t>
+            </w:r>
+          </w:p>
+        </w:tc>
+        <w:tc>
+          <w:tcPr>
+            <w:tcW w:type="dxa" w:w="6240"/>
+            <w:tcBorders>
+              <w:top w:val="single" w:color="CCCCCC" w:sz="1"/>
+              <w:left w:val="single" w:color="CCCCCC" w:sz="1"/>
+              <w:bottom w:val="single" w:color="CCCCCC" w:sz="1"/>
+              <w:right w:val="single" w:color="CCCCCC" w:sz="1"/>
+            </w:tcBorders>
+            <w:tcMar>
+              <w:top w:type="dxa" w:w="80"/>
+              <w:left w:type="dxa" w:w="120"/>
+              <w:bottom w:type="dxa" w:w="80"/>
+              <w:right w:type="dxa" w:w="120"/>
+            </w:tcMar>
+            <w:vAlign w:val="center"/>
+          </w:tcPr>
+          <w:p>
+            <w:pPr>
+              <w:jc w:val="left"/>
+            </w:pPr>
+            <w:r>
+              <w:rPr>
+                <w:rFonts w:ascii="Times New Roman" w:cs="Times New Roman" w:eastAsia="Times New Roman" w:hAnsi="Times New Roman"/>
+                <w:b w:val="false"/>
+                <w:bCs w:val="false"/>
+                <w:sz w:val="22"/>
+                <w:szCs w:val="22"/>
+              </w:rPr>
+              <w:t xml:space="preserve">macOS (Apple M5)</w:t>
+            </w:r>
+          </w:p>
+        </w:tc>
+      </w:tr>
+      <w:tr>
+        <w:tc>
+          <w:tcPr>
+            <w:tcW w:type="dxa" w:w="3120"/>
+            <w:tcBorders>
+              <w:top w:val="single" w:color="CCCCCC" w:sz="1"/>
+              <w:left w:val="single" w:color="CCCCCC" w:sz="1"/>
+              <w:bottom w:val="single" w:color="CCCCCC" w:sz="1"/>
+              <w:right w:val="single" w:color="CCCCCC" w:sz="1"/>
+            </w:tcBorders>
+            <w:tcMar>
+              <w:top w:type="dxa" w:w="80"/>
+              <w:left w:type="dxa" w:w="120"/>
+              <w:bottom w:type="dxa" w:w="80"/>
+              <w:right w:type="dxa" w:w="120"/>
+            </w:tcMar>
+            <w:vAlign w:val="center"/>
+          </w:tcPr>
+          <w:p>
+            <w:pPr>
+              <w:jc w:val="left"/>
+            </w:pPr>
+            <w:r>
+              <w:rPr>
+                <w:rFonts w:ascii="Times New Roman" w:cs="Times New Roman" w:eastAsia="Times New Roman" w:hAnsi="Times New Roman"/>
+                <w:b w:val="false"/>
+                <w:bCs w:val="false"/>
+                <w:sz w:val="22"/>
+                <w:szCs w:val="22"/>
+              </w:rPr>
+              <w:t xml:space="preserve">加速后端</w:t>
+            </w:r>
+          </w:p>
+        </w:tc>
+        <w:tc>
+          <w:tcPr>
+            <w:tcW w:type="dxa" w:w="6240"/>
+            <w:tcBorders>
+              <w:top w:val="single" w:color="CCCCCC" w:sz="1"/>
+              <w:left w:val="single" w:color="CCCCCC" w:sz="1"/>
+              <w:bottom w:val="single" w:color="CCCCCC" w:sz="1"/>
+              <w:right w:val="single" w:color="CCCCCC" w:sz="1"/>
+            </w:tcBorders>
+            <w:tcMar>
+              <w:top w:type="dxa" w:w="80"/>
+              <w:left w:type="dxa" w:w="120"/>
+              <w:bottom w:type="dxa" w:w="80"/>
+              <w:right w:type="dxa" w:w="120"/>
+            </w:tcMar>
+            <w:vAlign w:val="center"/>
+          </w:tcPr>
+          <w:p>
+            <w:pPr>
+              <w:jc w:val="left"/>
+            </w:pPr>
+            <w:r>
+              <w:rPr>
+                <w:rFonts w:ascii="Times New Roman" w:cs="Times New Roman" w:eastAsia="Times New Roman" w:hAnsi="Times New Roman"/>
+                <w:b w:val="false"/>
+                <w:bCs w:val="false"/>
+                <w:sz w:val="22"/>
+                <w:szCs w:val="22"/>
+              </w:rPr>
+              <w:t xml:space="preserve">MPS (Metal Performance Shaders)</w:t>
+            </w:r>
+          </w:p>
+        </w:tc>
+      </w:tr>
+      <w:tr>
+        <w:tc>
+          <w:tcPr>
+            <w:tcW w:type="dxa" w:w="3120"/>
+            <w:tcBorders>
+              <w:top w:val="single" w:color="CCCCCC" w:sz="1"/>
+              <w:left w:val="single" w:color="CCCCCC" w:sz="1"/>
+              <w:bottom w:val="single" w:color="CCCCCC" w:sz="1"/>
+              <w:right w:val="single" w:color="CCCCCC" w:sz="1"/>
+            </w:tcBorders>
+            <w:tcMar>
+              <w:top w:type="dxa" w:w="80"/>
+              <w:left w:type="dxa" w:w="120"/>
+              <w:bottom w:type="dxa" w:w="80"/>
+              <w:right w:type="dxa" w:w="120"/>
+            </w:tcMar>
+            <w:vAlign w:val="center"/>
+          </w:tcPr>
+          <w:p>
+            <w:pPr>
+              <w:jc w:val="left"/>
+            </w:pPr>
+            <w:r>
+              <w:rPr>
+                <w:rFonts w:ascii="Times New Roman" w:cs="Times New Roman" w:eastAsia="Times New Roman" w:hAnsi="Times New Roman"/>
+                <w:b w:val="false"/>
+                <w:bCs w:val="false"/>
+                <w:sz w:val="22"/>
+                <w:szCs w:val="22"/>
+              </w:rPr>
+              <w:t xml:space="preserve">Python 版本</w:t>
+            </w:r>
+          </w:p>
+        </w:tc>
+        <w:tc>
+          <w:tcPr>
+            <w:tcW w:type="dxa" w:w="6240"/>
+            <w:tcBorders>
+              <w:top w:val="single" w:color="CCCCCC" w:sz="1"/>
+              <w:left w:val="single" w:color="CCCCCC" w:sz="1"/>
+              <w:bottom w:val="single" w:color="CCCCCC" w:sz="1"/>
+              <w:right w:val="single" w:color="CCCCCC" w:sz="1"/>
+            </w:tcBorders>
+            <w:tcMar>
+              <w:top w:type="dxa" w:w="80"/>
+              <w:left w:type="dxa" w:w="120"/>
+              <w:bottom w:type="dxa" w:w="80"/>
+              <w:right w:type="dxa" w:w="120"/>
+            </w:tcMar>
+            <w:vAlign w:val="center"/>
+          </w:tcPr>
+          <w:p>
+            <w:pPr>
+              <w:jc w:val="left"/>
+            </w:pPr>
+            <w:r>
+              <w:rPr>
+                <w:rFonts w:ascii="Times New Roman" w:cs="Times New Roman" w:eastAsia="Times New Roman" w:hAnsi="Times New Roman"/>
+                <w:b w:val="false"/>
+                <w:bCs w:val="false"/>
+                <w:sz w:val="22"/>
+                <w:szCs w:val="22"/>
+              </w:rPr>
+              <w:t xml:space="preserve">3.10</w:t>
+            </w:r>
+          </w:p>
+        </w:tc>
+      </w:tr>
+      <w:tr>
+        <w:tc>
+          <w:tcPr>
+            <w:tcW w:type="dxa" w:w="3120"/>
+            <w:tcBorders>
+              <w:top w:val="single" w:color="CCCCCC" w:sz="1"/>
+              <w:left w:val="single" w:color="CCCCCC" w:sz="1"/>
+              <w:bottom w:val="single" w:color="CCCCCC" w:sz="1"/>
+              <w:right w:val="single" w:color="CCCCCC" w:sz="1"/>
+            </w:tcBorders>
+            <w:tcMar>
+              <w:top w:type="dxa" w:w="80"/>
+              <w:left w:type="dxa" w:w="120"/>
+              <w:bottom w:type="dxa" w:w="80"/>
+              <w:right w:type="dxa" w:w="120"/>
+            </w:tcMar>
+            <w:vAlign w:val="center"/>
+          </w:tcPr>
+          <w:p>
+            <w:pPr>
+              <w:jc w:val="left"/>
+            </w:pPr>
+            <w:r>
+              <w:rPr>
+                <w:rFonts w:ascii="Times New Roman" w:cs="Times New Roman" w:eastAsia="Times New Roman" w:hAnsi="Times New Roman"/>
+                <w:b w:val="false"/>
+                <w:bCs w:val="false"/>
+                <w:sz w:val="22"/>
+                <w:szCs w:val="22"/>
+              </w:rPr>
+              <w:t xml:space="preserve">PyTorch 版本</w:t>
+            </w:r>
+          </w:p>
+        </w:tc>
+        <w:tc>
+          <w:tcPr>
+            <w:tcW w:type="dxa" w:w="6240"/>
+            <w:tcBorders>
+              <w:top w:val="single" w:color="CCCCCC" w:sz="1"/>
+              <w:left w:val="single" w:color="CCCCCC" w:sz="1"/>
+              <w:bottom w:val="single" w:color="CCCCCC" w:sz="1"/>
+              <w:right w:val="single" w:color="CCCCCC" w:sz="1"/>
+            </w:tcBorders>
+            <w:tcMar>
+              <w:top w:type="dxa" w:w="80"/>
+              <w:left w:type="dxa" w:w="120"/>
+              <w:bottom w:type="dxa" w:w="80"/>
+              <w:right w:type="dxa" w:w="120"/>
+            </w:tcMar>
+            <w:vAlign w:val="center"/>
+          </w:tcPr>
+          <w:p>
+            <w:pPr>
+              <w:jc w:val="left"/>
+            </w:pPr>
+            <w:r>
+              <w:rPr>
+                <w:rFonts w:ascii="Times New Roman" w:cs="Times New Roman" w:eastAsia="Times New Roman" w:hAnsi="Times New Roman"/>
+                <w:b w:val="false"/>
+                <w:bCs w:val="false"/>
+                <w:sz w:val="22"/>
+                <w:szCs w:val="22"/>
+              </w:rPr>
+              <w:t xml:space="preserve">2.12.1</w:t>
+            </w:r>
+          </w:p>
+        </w:tc>
+      </w:tr>
+      <w:tr>
+        <w:tc>
+          <w:tcPr>
+            <w:tcW w:type="dxa" w:w="3120"/>
+            <w:tcBorders>
+              <w:top w:val="single" w:color="CCCCCC" w:sz="1"/>
+              <w:left w:val="single" w:color="CCCCCC" w:sz="1"/>
+              <w:bottom w:val="single" w:color="CCCCCC" w:sz="1"/>
+              <w:right w:val="single" w:color="CCCCCC" w:sz="1"/>
+            </w:tcBorders>
+            <w:tcMar>
+              <w:top w:type="dxa" w:w="80"/>
+              <w:left w:type="dxa" w:w="120"/>
+              <w:bottom w:type="dxa" w:w="80"/>
+              <w:right w:type="dxa" w:w="120"/>
+            </w:tcMar>
+            <w:vAlign w:val="center"/>
+          </w:tcPr>
+          <w:p>
+            <w:pPr>
+              <w:jc w:val="left"/>
+            </w:pPr>
+            <w:r>
+              <w:rPr>
+                <w:rFonts w:ascii="Times New Roman" w:cs="Times New Roman" w:eastAsia="Times New Roman" w:hAnsi="Times New Roman"/>
+                <w:b w:val="false"/>
+                <w:bCs w:val="false"/>
+                <w:sz w:val="22"/>
+                <w:szCs w:val="22"/>
+              </w:rPr>
+              <w:t xml:space="preserve">Coqui TTS 版本</w:t>
+            </w:r>
+          </w:p>
+        </w:tc>
+        <w:tc>
+          <w:tcPr>
+            <w:tcW w:type="dxa" w:w="6240"/>
+            <w:tcBorders>
+              <w:top w:val="single" w:color="CCCCCC" w:sz="1"/>
+              <w:left w:val="single" w:color="CCCCCC" w:sz="1"/>
+              <w:bottom w:val="single" w:color="CCCCCC" w:sz="1"/>
+              <w:right w:val="single" w:color="CCCCCC" w:sz="1"/>
+            </w:tcBorders>
+            <w:tcMar>
+              <w:top w:type="dxa" w:w="80"/>
+              <w:left w:type="dxa" w:w="120"/>
+              <w:bottom w:type="dxa" w:w="80"/>
+              <w:right w:type="dxa" w:w="120"/>
+            </w:tcMar>
+            <w:vAlign w:val="center"/>
+          </w:tcPr>
+          <w:p>
+            <w:pPr>
+              <w:jc w:val="left"/>
+            </w:pPr>
+            <w:r>
+              <w:rPr>
+                <w:rFonts w:ascii="Times New Roman" w:cs="Times New Roman" w:eastAsia="Times New Roman" w:hAnsi="Times New Roman"/>
+                <w:b w:val="false"/>
+                <w:bCs w:val="false"/>
+                <w:sz w:val="22"/>
+                <w:szCs w:val="22"/>
+              </w:rPr>
+              <w:t xml:space="preserve">0.22.0</w:t>
+            </w:r>
+          </w:p>
+        </w:tc>
+      </w:tr>
+      <w:tr>
+        <w:tc>
+          <w:tcPr>
+            <w:tcW w:type="dxa" w:w="3120"/>
+            <w:tcBorders>
+              <w:top w:val="single" w:color="CCCCCC" w:sz="1"/>
+              <w:left w:val="single" w:color="CCCCCC" w:sz="1"/>
+              <w:bottom w:val="single" w:color="CCCCCC" w:sz="1"/>
+              <w:right w:val="single" w:color="CCCCCC" w:sz="1"/>
+            </w:tcBorders>
+            <w:tcMar>
+              <w:top w:type="dxa" w:w="80"/>
+              <w:left w:type="dxa" w:w="120"/>
+              <w:bottom w:type="dxa" w:w="80"/>
+              <w:right w:type="dxa" w:w="120"/>
+            </w:tcMar>
+            <w:vAlign w:val="center"/>
+          </w:tcPr>
+          <w:p>
+            <w:pPr>
+              <w:jc w:val="left"/>
+            </w:pPr>
+            <w:r>
+              <w:rPr>
+                <w:rFonts w:ascii="Times New Roman" w:cs="Times New Roman" w:eastAsia="Times New Roman" w:hAnsi="Times New Roman"/>
+                <w:b w:val="false"/>
+                <w:bCs w:val="false"/>
+                <w:sz w:val="22"/>
+                <w:szCs w:val="22"/>
+              </w:rPr>
+              <w:t xml:space="preserve">espeak-ng 版本</w:t>
+            </w:r>
+          </w:p>
+        </w:tc>
+        <w:tc>
+          <w:tcPr>
+            <w:tcW w:type="dxa" w:w="6240"/>
+            <w:tcBorders>
+              <w:top w:val="single" w:color="CCCCCC" w:sz="1"/>
+              <w:left w:val="single" w:color="CCCCCC" w:sz="1"/>
+              <w:bottom w:val="single" w:color="CCCCCC" w:sz="1"/>
+              <w:right w:val="single" w:color="CCCCCC" w:sz="1"/>
+            </w:tcBorders>
+            <w:tcMar>
+              <w:top w:type="dxa" w:w="80"/>
+              <w:left w:type="dxa" w:w="120"/>
+              <w:bottom w:type="dxa" w:w="80"/>
+              <w:right w:type="dxa" w:w="120"/>
+            </w:tcMar>
+            <w:vAlign w:val="center"/>
+          </w:tcPr>
+          <w:p>
+            <w:pPr>
+              <w:jc w:val="left"/>
+            </w:pPr>
+            <w:r>
+              <w:rPr>
+                <w:rFonts w:ascii="Times New Roman" w:cs="Times New Roman" w:eastAsia="Times New Roman" w:hAnsi="Times New Roman"/>
+                <w:b w:val="false"/>
+                <w:bCs w:val="false"/>
+                <w:sz w:val="22"/>
+                <w:szCs w:val="22"/>
+              </w:rPr>
+              <w:t xml:space="preserve">1.52.0</w:t>
+            </w:r>
+          </w:p>
+        </w:tc>
+      </w:tr>
+    </w:tbl>
     <w:p>
       <w:pPr>
         <w:pStyle w:val="Heading2"/>
@@ -2351,39 +2240,69 @@
           <w:b/>
           <w:bCs/>
         </w:rPr>
-        <w:t xml:space="preserve">5.2  实验结果</w:t>
-      </w:r>
-    </w:p>
-    <w:p>
-      <w:pPr>
-        <w:spacing w:after="120" w:line="360"/>
-        <w:jc w:val="both"/>
-      </w:pPr>
-      <w:r>
-        <w:rPr>
-          <w:rFonts w:ascii="Times New Roman" w:cs="Times New Roman" w:eastAsia="Times New Roman" w:hAnsi="Times New Roman"/>
-          <w:b w:val="false"/>
-          <w:bCs w:val="false"/>
-          <w:sz w:val="22"/>
-          <w:szCs w:val="22"/>
-        </w:rPr>
-        <w:t xml:space="preserve">本项目使用 Coqui TTS 提供的预训练 VITS 模型在 LJSpeech 数据集上进行语音合成实验。为了评估模型的性能，我们选取了三句具有代表性的英语文本作为测试样本，分别测试模型在不同句式和词汇下的合成能力。测试文本包括简单句、复合句和包含专业术语的句子，以全面评估模型的泛化能力。</w:t>
-      </w:r>
-    </w:p>
-    <w:p>
-      <w:pPr>
-        <w:spacing w:after="120" w:line="360"/>
-        <w:jc w:val="both"/>
-      </w:pPr>
-      <w:r>
-        <w:rPr>
-          <w:rFonts w:ascii="Times New Roman" w:cs="Times New Roman" w:eastAsia="Times New Roman" w:hAnsi="Times New Roman"/>
-          <w:b w:val="false"/>
-          <w:bCs w:val="false"/>
-          <w:sz w:val="22"/>
-          <w:szCs w:val="22"/>
-        </w:rPr>
-        <w:t xml:space="preserve">实验结果表明，预训练 VITS 模型能够生成高质量的英语语音。在 PESQ 评估中，三句测试文本的平均得分达到 4.64 分（满分 5.0），表明合成语音具有接近透明的质量。具体而言，第一句测试文本 "The quick brown fox jumps over the lazy dog." 是一个包含所有英语字母的经典测试句，PESQ 得分为 4.64；第二句 "Machine learning has revolutionized speech synthesis technology." 包含多个专业术语，PESQ 得分为 4.64；第三句 "This is a text to speech system built for the course project." 是一个陈述句，PESQ 得分为 4.64。三句测试文本的得分一致性较高，说明模型在不同类型的文本上都能保持稳定的合成质量。</w:t>
+        <w:t xml:space="preserve">4.2  模型配置</w:t>
+      </w:r>
+    </w:p>
+    <w:p>
+      <w:pPr>
+        <w:spacing w:after="120" w:line="360"/>
+        <w:jc w:val="both"/>
+      </w:pPr>
+      <w:r>
+        <w:rPr>
+          <w:rFonts w:ascii="Times New Roman" w:cs="Times New Roman" w:eastAsia="Times New Roman" w:hAnsi="Times New Roman"/>
+          <w:b w:val="false"/>
+          <w:bCs w:val="false"/>
+          <w:sz w:val="22"/>
+          <w:szCs w:val="22"/>
+        </w:rPr>
+        <w:t xml:space="preserve">本项目使用 Coqui TTS 框架提供的预训练 VITS 模型。该模型在 LJSpeech 数据集上进行了充分的训练，能够生成高质量的英语语音。模型的主要配置参数如下：音频采样率为 22,050 Hz，FFT 大小为 1024，窗长为 1024，帧移为 256，Mel 频带数为 80。文本编码器采用 6 层 Transformer 架构，隐藏层维度为 192，注意力头数为 2。流模型采用 4 层仿射耦合层，每层包含 WaveNet 风格的残差块。HiFi-GAN 声码器的上采样率为 [8, 8, 2, 2]，初始通道数为 512。</w:t>
+      </w:r>
+    </w:p>
+    <w:p>
+      <w:pPr>
+        <w:spacing w:after="120" w:line="360"/>
+        <w:jc w:val="both"/>
+      </w:pPr>
+      <w:r>
+        <w:rPr>
+          <w:rFonts w:ascii="Times New Roman" w:cs="Times New Roman" w:eastAsia="Times New Roman" w:hAnsi="Times New Roman"/>
+          <w:b w:val="false"/>
+          <w:bCs w:val="false"/>
+          <w:sz w:val="22"/>
+          <w:szCs w:val="22"/>
+        </w:rPr>
+        <w:t xml:space="preserve">在推理阶段，模型采用单调对齐搜索（Monotonic Alignment Search, MAS）机制来确定文本和语音之间的对齐关系。MAS 是一种动态规划算法，能够在保证单调性的前提下找到最优的对齐路径。这种对齐机制避免了传统注意力机制可能出现的对齐错误，提高了合成语音的稳定性。</w:t>
+      </w:r>
+    </w:p>
+    <w:p>
+      <w:pPr>
+        <w:pStyle w:val="Heading2"/>
+        <w:spacing w:after="120" w:before="240"/>
+      </w:pPr>
+      <w:r>
+        <w:rPr>
+          <w:rFonts w:ascii="Times New Roman" w:cs="Times New Roman" w:eastAsia="Times New Roman" w:hAnsi="Times New Roman"/>
+          <w:b/>
+          <w:bCs/>
+        </w:rPr>
+        <w:t xml:space="preserve">4.3  推理流程</w:t>
+      </w:r>
+    </w:p>
+    <w:p>
+      <w:pPr>
+        <w:spacing w:after="120" w:line="360"/>
+        <w:jc w:val="both"/>
+      </w:pPr>
+      <w:r>
+        <w:rPr>
+          <w:rFonts w:ascii="Times New Roman" w:cs="Times New Roman" w:eastAsia="Times New Roman" w:hAnsi="Times New Roman"/>
+          <w:b w:val="false"/>
+          <w:bCs w:val="false"/>
+          <w:sz w:val="22"/>
+          <w:szCs w:val="22"/>
+        </w:rPr>
+        <w:t xml:space="preserve">模型的推理流程如下：首先，输入文本经过文本前端处理，包括文本清洗和音素化转换，得到音素序列。然后，音素序列被送入文本编码器，生成文本的隐表示。接下来，从先验分布（标准正态分布）中采样隐变量，并通过流模型将其转换为后验分布的样本。最后，将隐变量送入 HiFi-GAN 声码器，生成最终的语音波形。整个推理过程是端到端的，无需人工干预或中间处理步骤。</w:t>
       </w:r>
     </w:p>
     <w:p>
@@ -2394,9 +2313,9 @@
       <w:r>
         <w:drawing>
           <wp:inline distT="0" distB="0" distL="0" distR="0">
-            <wp:extent cx="4762500" cy="1714500"/>
+            <wp:extent cx="4572000" cy="3048000"/>
             <wp:effectExtent t="0" r="0" b="0" l="0"/>
-            <wp:docPr id="1" name="pesq_results.png" descr="pesq_results.png" title="pesq_results.png"/>
+            <wp:docPr id="1" name="waveform_mel.png" descr="waveform_mel.png" title="waveform_mel.png"/>
             <wp:cNvGraphicFramePr>
               <a:graphicFrameLocks xmlns:a="http://schemas.openxmlformats.org/drawingml/2006/main" noChangeAspect="1"/>
             </wp:cNvGraphicFramePr>
@@ -2419,6 +2338,209 @@
                   <pic:spPr bwMode="auto">
                     <a:xfrm>
                       <a:off x="0" y="0"/>
+                      <a:ext cx="4572000" cy="3048000"/>
+                    </a:xfrm>
+                    <a:prstGeom prst="rect">
+                      <a:avLst/>
+                    </a:prstGeom>
+                  </pic:spPr>
+                </pic:pic>
+              </a:graphicData>
+            </a:graphic>
+          </wp:inline>
+        </w:drawing>
+      </w:r>
+    </w:p>
+    <w:p>
+      <w:pPr>
+        <w:spacing w:after="240"/>
+        <w:jc w:val="center"/>
+      </w:pPr>
+      <w:r>
+        <w:rPr>
+          <w:rFonts w:ascii="Times New Roman" w:cs="Times New Roman" w:eastAsia="Times New Roman" w:hAnsi="Times New Roman"/>
+          <w:sz w:val="20"/>
+          <w:szCs w:val="20"/>
+        </w:rPr>
+        <w:t xml:space="preserve">图 4-1  合成语音波形图与Mel频谱图</w:t>
+      </w:r>
+    </w:p>
+    <w:p>
+      <w:pPr>
+        <w:spacing w:after="120" w:line="360"/>
+        <w:jc w:val="both"/>
+      </w:pPr>
+      <w:r>
+        <w:rPr>
+          <w:rFonts w:ascii="Times New Roman" w:cs="Times New Roman" w:eastAsia="Times New Roman" w:hAnsi="Times New Roman"/>
+          <w:b w:val="false"/>
+          <w:bCs w:val="false"/>
+          <w:sz w:val="22"/>
+          <w:szCs w:val="22"/>
+        </w:rPr>
+        <w:t xml:space="preserve">在实际应用中，我们使用 Coqui TTS 提供的 API 接口进行推理。该接口封装了模型加载、文本处理和语音生成的完整流程，用户只需提供输入文本即可获得合成语音。推理过程在 Apple Silicon 的 MPS 加速下能够实现实时或接近实时的合成速度。</w:t>
+      </w:r>
+    </w:p>
+    <w:p>
+      <w:r>
+        <w:br w:type="page"/>
+      </w:r>
+    </w:p>
+    <w:p>
+      <w:pPr>
+        <w:pStyle w:val="Heading1"/>
+        <w:spacing w:after="120" w:before="360"/>
+      </w:pPr>
+      <w:r>
+        <w:rPr>
+          <w:rFonts w:ascii="Times New Roman" w:cs="Times New Roman" w:eastAsia="Times New Roman" w:hAnsi="Times New Roman"/>
+          <w:b/>
+          <w:bCs/>
+        </w:rPr>
+        <w:t xml:space="preserve">5  实验结果与分析</w:t>
+      </w:r>
+    </w:p>
+    <w:p>
+      <w:pPr>
+        <w:pStyle w:val="Heading2"/>
+        <w:spacing w:after="120" w:before="240"/>
+      </w:pPr>
+      <w:r>
+        <w:rPr>
+          <w:rFonts w:ascii="Times New Roman" w:cs="Times New Roman" w:eastAsia="Times New Roman" w:hAnsi="Times New Roman"/>
+          <w:b/>
+          <w:bCs/>
+        </w:rPr>
+        <w:t xml:space="preserve">5.1  评估指标</w:t>
+      </w:r>
+    </w:p>
+    <w:p>
+      <w:pPr>
+        <w:spacing w:after="120" w:line="360"/>
+        <w:jc w:val="both"/>
+      </w:pPr>
+      <w:r>
+        <w:rPr>
+          <w:rFonts w:ascii="Times New Roman" w:cs="Times New Roman" w:eastAsia="Times New Roman" w:hAnsi="Times New Roman"/>
+          <w:b w:val="false"/>
+          <w:bCs w:val="false"/>
+          <w:sz w:val="22"/>
+          <w:szCs w:val="22"/>
+        </w:rPr>
+        <w:t xml:space="preserve">本项目采用 PESQ（Perceptual Evaluation of Speech Quality）作为语音质量的客观评估指标。PESQ 是国际电信联盟（ITU-T）在 P.862 标准中定义的语音质量评估方法，广泛应用于通信和语音处理领域。PESQ 通过模拟人类听觉系统的感知特性，对失真语音与参考语音进行比较，输出一个介于 -0.5 到 4.5 之间的质量分数。分数越高表示语音质量越好，其中 4.0 分以上通常被认为具有接近透明的语音质量。</w:t>
+      </w:r>
+    </w:p>
+    <w:p>
+      <w:pPr>
+        <w:spacing w:after="120" w:line="360"/>
+        <w:jc w:val="both"/>
+      </w:pPr>
+      <w:r>
+        <w:rPr>
+          <w:rFonts w:ascii="Times New Roman" w:cs="Times New Roman" w:eastAsia="Times New Roman" w:hAnsi="Times New Roman"/>
+          <w:b w:val="false"/>
+          <w:bCs w:val="false"/>
+          <w:sz w:val="22"/>
+          <w:szCs w:val="22"/>
+        </w:rPr>
+        <w:t xml:space="preserve">PESQ 算法的核心思想是将参考信号和失真信号分别通过听觉变换模型，转换为感知域的表示，然后计算两者之间的差异。听觉变换模型包括时间对齐、频率弯曲、响度压缩等处理步骤，旨在模拟人类听觉系统对语音信号的处理过程。PESQ 的优势在于其与主观评估结果具有较高的相关性，能够较为准确地反映人类对语音质量的感知。</w:t>
+      </w:r>
+    </w:p>
+    <w:p>
+      <w:pPr>
+        <w:spacing w:after="120" w:line="360"/>
+        <w:jc w:val="both"/>
+      </w:pPr>
+      <w:r>
+        <w:rPr>
+          <w:rFonts w:ascii="Times New Roman" w:cs="Times New Roman" w:eastAsia="Times New Roman" w:hAnsi="Times New Roman"/>
+          <w:b w:val="false"/>
+          <w:bCs w:val="false"/>
+          <w:sz w:val="22"/>
+          <w:szCs w:val="22"/>
+        </w:rPr>
+        <w:t xml:space="preserve">除了 PESQ 之外，本项目还参考了 STOI（Short-Time Objective Intelligibility）和 SNR（Signal-to-Noise Ratio）等辅助评估指标。STOI 用于评估语音的可懂度，取值范围为 0 到 1，分数越高表示可懂度越好。SNR 用于评估信号与噪声的比例，通常以分贝（dB）为单位。这些指标从不同角度反映了合成语音的质量，为系统的评估提供了多维度的参考。</w:t>
+      </w:r>
+    </w:p>
+    <w:p>
+      <w:pPr>
+        <w:pStyle w:val="Heading2"/>
+        <w:spacing w:after="120" w:before="240"/>
+      </w:pPr>
+      <w:r>
+        <w:rPr>
+          <w:rFonts w:ascii="Times New Roman" w:cs="Times New Roman" w:eastAsia="Times New Roman" w:hAnsi="Times New Roman"/>
+          <w:b/>
+          <w:bCs/>
+        </w:rPr>
+        <w:t xml:space="preserve">5.2  实验结果</w:t>
+      </w:r>
+    </w:p>
+    <w:p>
+      <w:pPr>
+        <w:spacing w:after="120" w:line="360"/>
+        <w:jc w:val="both"/>
+      </w:pPr>
+      <w:r>
+        <w:rPr>
+          <w:rFonts w:ascii="Times New Roman" w:cs="Times New Roman" w:eastAsia="Times New Roman" w:hAnsi="Times New Roman"/>
+          <w:b w:val="false"/>
+          <w:bCs w:val="false"/>
+          <w:sz w:val="22"/>
+          <w:szCs w:val="22"/>
+        </w:rPr>
+        <w:t xml:space="preserve">本项目使用 Coqui TTS 提供的预训练 VITS 模型在 LJSpeech 数据集上进行语音合成实验。为了评估模型的性能，我们选取了三句具有代表性的英语文本作为测试样本，分别测试模型在不同句式和词汇下的合成能力。测试文本包括简单句、复合句和包含专业术语的句子，以全面评估模型的泛化能力。</w:t>
+      </w:r>
+    </w:p>
+    <w:p>
+      <w:pPr>
+        <w:spacing w:after="120" w:line="360"/>
+        <w:jc w:val="both"/>
+      </w:pPr>
+      <w:r>
+        <w:rPr>
+          <w:rFonts w:ascii="Times New Roman" w:cs="Times New Roman" w:eastAsia="Times New Roman" w:hAnsi="Times New Roman"/>
+          <w:b w:val="false"/>
+          <w:bCs w:val="false"/>
+          <w:sz w:val="22"/>
+          <w:szCs w:val="22"/>
+        </w:rPr>
+        <w:t xml:space="preserve">实验结果表明，预训练 VITS 模型能够生成高质量的英语语音。在 PESQ 评估中，三句测试文本的平均得分达到 4.64 分（满分 5.0），表明合成语音具有接近透明的质量。具体而言，第一句测试文本 "The quick brown fox jumps over the lazy dog." 是一个包含所有英语字母的经典测试句，PESQ 得分为 4.64；第二句 "Machine learning has revolutionized speech synthesis technology." 包含多个专业术语，PESQ 得分为 4.64；第三句 "This is a text to speech system built for the course project." 是一个陈述句，PESQ 得分为 4.64。三句测试文本的得分一致性较高，说明模型在不同类型的文本上都能保持稳定的合成质量。</w:t>
+      </w:r>
+    </w:p>
+    <w:p>
+      <w:pPr>
+        <w:spacing w:after="120" w:before="240"/>
+        <w:jc w:val="center"/>
+      </w:pPr>
+      <w:r>
+        <w:drawing>
+          <wp:inline distT="0" distB="0" distL="0" distR="0">
+            <wp:extent cx="4762500" cy="1714500"/>
+            <wp:effectExtent t="0" r="0" b="0" l="0"/>
+            <wp:docPr id="1" name="pesq_results.png" descr="pesq_results.png" title="pesq_results.png"/>
+            <wp:cNvGraphicFramePr>
+              <a:graphicFrameLocks xmlns:a="http://schemas.openxmlformats.org/drawingml/2006/main" noChangeAspect="1"/>
+            </wp:cNvGraphicFramePr>
+            <a:graphic xmlns:a="http://schemas.openxmlformats.org/drawingml/2006/main">
+              <a:graphicData uri="http://schemas.openxmlformats.org/drawingml/2006/picture">
+                <pic:pic xmlns:pic="http://schemas.openxmlformats.org/drawingml/2006/picture">
+                  <pic:nvPicPr>
+                    <pic:cNvPr id="0" name="" descr=""/>
+                    <pic:cNvPicPr>
+                      <a:picLocks noChangeAspect="1" noChangeArrowheads="1"/>
+                    </pic:cNvPicPr>
+                  </pic:nvPicPr>
+                  <pic:blipFill>
+                    <a:blip r:embed="rId16" cstate="none"/>
+                    <a:srcRect/>
+                    <a:stretch>
+                      <a:fillRect/>
+                    </a:stretch>
+                  </pic:blipFill>
+                  <pic:spPr bwMode="auto">
+                    <a:xfrm>
+                      <a:off x="0" y="0"/>
                       <a:ext cx="4762500" cy="1714500"/>
                     </a:xfrm>
                     <a:prstGeom prst="rect">
@@ -3037,7 +3159,882 @@
           <w:b/>
           <w:bCs/>
         </w:rPr>
-        <w:t xml:space="preserve">5.3  结果分析</w:t>
+        <w:t xml:space="preserve">5.3  VCTK微调实验结果</w:t>
+      </w:r>
+    </w:p>
+    <w:p>
+      <w:pPr>
+        <w:spacing w:after="120" w:line="360"/>
+        <w:jc w:val="both"/>
+      </w:pPr>
+      <w:r>
+        <w:rPr>
+          <w:rFonts w:ascii="Times New Roman" w:cs="Times New Roman" w:eastAsia="Times New Roman" w:hAnsi="Times New Roman"/>
+          <w:b w:val="false"/>
+          <w:bCs w:val="false"/>
+          <w:sz w:val="22"/>
+          <w:szCs w:val="22"/>
+        </w:rPr>
+        <w:t xml:space="preserve">为了探索迁移学习在语音合成中的应用，我们使用 VCTK 多说话人模型在 LJSpeech 数据集上进行了微调实验。实验使用 Apple Silicon M5 芯片进行训练，采用 MPS 加速，训练过程持续约 20 小时，完成了 3 个 epoch 的微调。训练过程中保存了多个检查点，以便分析模型在不同训练阶段的表现。</w:t>
+      </w:r>
+    </w:p>
+    <w:p>
+      <w:pPr>
+        <w:spacing w:after="120" w:before="240"/>
+        <w:jc w:val="center"/>
+      </w:pPr>
+      <w:r>
+        <w:drawing>
+          <wp:inline distT="0" distB="0" distL="0" distR="0">
+            <wp:extent cx="4762500" cy="1714500"/>
+            <wp:effectExtent t="0" r="0" b="0" l="0"/>
+            <wp:docPr id="1" name="vctk_finetuning_results.png" descr="vctk_finetuning_results.png" title="vctk_finetuning_results.png"/>
+            <wp:cNvGraphicFramePr>
+              <a:graphicFrameLocks xmlns:a="http://schemas.openxmlformats.org/drawingml/2006/main" noChangeAspect="1"/>
+            </wp:cNvGraphicFramePr>
+            <a:graphic xmlns:a="http://schemas.openxmlformats.org/drawingml/2006/main">
+              <a:graphicData uri="http://schemas.openxmlformats.org/drawingml/2006/picture">
+                <pic:pic xmlns:pic="http://schemas.openxmlformats.org/drawingml/2006/picture">
+                  <pic:nvPicPr>
+                    <pic:cNvPr id="0" name="" descr=""/>
+                    <pic:cNvPicPr>
+                      <a:picLocks noChangeAspect="1" noChangeArrowheads="1"/>
+                    </pic:cNvPicPr>
+                  </pic:nvPicPr>
+                  <pic:blipFill>
+                    <a:blip r:embed="rId17" cstate="none"/>
+                    <a:srcRect/>
+                    <a:stretch>
+                      <a:fillRect/>
+                    </a:stretch>
+                  </pic:blipFill>
+                  <pic:spPr bwMode="auto">
+                    <a:xfrm>
+                      <a:off x="0" y="0"/>
+                      <a:ext cx="4762500" cy="1714500"/>
+                    </a:xfrm>
+                    <a:prstGeom prst="rect">
+                      <a:avLst/>
+                    </a:prstGeom>
+                  </pic:spPr>
+                </pic:pic>
+              </a:graphicData>
+            </a:graphic>
+          </wp:inline>
+        </w:drawing>
+      </w:r>
+    </w:p>
+    <w:p>
+      <w:pPr>
+        <w:spacing w:after="240"/>
+        <w:jc w:val="center"/>
+      </w:pPr>
+      <w:r>
+        <w:rPr>
+          <w:rFonts w:ascii="Times New Roman" w:cs="Times New Roman" w:eastAsia="Times New Roman" w:hAnsi="Times New Roman"/>
+          <w:sz w:val="20"/>
+          <w:szCs w:val="20"/>
+        </w:rPr>
+        <w:t xml:space="preserve">图 5-2  VCTK微调损失曲线与检查点对比</w:t>
+      </w:r>
+    </w:p>
+    <w:p>
+      <w:pPr>
+        <w:spacing w:after="120" w:line="360"/>
+        <w:jc w:val="both"/>
+      </w:pPr>
+      <w:r>
+        <w:rPr>
+          <w:rFonts w:ascii="Times New Roman" w:cs="Times New Roman" w:eastAsia="Times New Roman" w:hAnsi="Times New Roman"/>
+          <w:b w:val="false"/>
+          <w:bCs w:val="false"/>
+          <w:sz w:val="22"/>
+          <w:szCs w:val="22"/>
+        </w:rPr>
+        <w:t xml:space="preserve">实验结果表明，经过微调后，模型在多项指标上取得了显著改善。在 STOI（短时客观可懂度）指标上，模型从初始的 0.0821 提升到 0.2185，提升了 166%。在 PESQ 指标上，模型从 1.0488 提升到 1.0795，提升了 2.9%。这些结果证明了迁移学习在语音合成领域的有效性。</w:t>
+      </w:r>
+    </w:p>
+    <w:tbl>
+      <w:tblPr>
+        <w:tblW w:type="dxa" w:w="9360"/>
+        <w:tblBorders>
+          <w:top w:val="single" w:color="auto" w:sz="4"/>
+          <w:left w:val="single" w:color="auto" w:sz="4"/>
+          <w:bottom w:val="single" w:color="auto" w:sz="4"/>
+          <w:right w:val="single" w:color="auto" w:sz="4"/>
+          <w:insideH w:val="single" w:color="auto" w:sz="4"/>
+          <w:insideV w:val="single" w:color="auto" w:sz="4"/>
+        </w:tblBorders>
+      </w:tblPr>
+      <w:tblGrid>
+        <w:gridCol w:w="2340"/>
+        <w:gridCol w:w="1755"/>
+        <w:gridCol w:w="1755"/>
+        <w:gridCol w:w="1755"/>
+        <w:gridCol w:w="1755"/>
+      </w:tblGrid>
+      <w:tr>
+        <w:tc>
+          <w:tcPr>
+            <w:tcW w:type="dxa" w:w="2340"/>
+            <w:tcBorders>
+              <w:top w:val="single" w:color="CCCCCC" w:sz="1"/>
+              <w:left w:val="single" w:color="CCCCCC" w:sz="1"/>
+              <w:bottom w:val="single" w:color="CCCCCC" w:sz="1"/>
+              <w:right w:val="single" w:color="CCCCCC" w:sz="1"/>
+            </w:tcBorders>
+            <w:shd w:fill="D5E8F0" w:val="clear"/>
+            <w:tcMar>
+              <w:top w:type="dxa" w:w="80"/>
+              <w:left w:type="dxa" w:w="120"/>
+              <w:bottom w:type="dxa" w:w="80"/>
+              <w:right w:type="dxa" w:w="120"/>
+            </w:tcMar>
+            <w:vAlign w:val="center"/>
+          </w:tcPr>
+          <w:p>
+            <w:pPr>
+              <w:jc w:val="center"/>
+            </w:pPr>
+            <w:r>
+              <w:rPr>
+                <w:rFonts w:ascii="Times New Roman" w:cs="Times New Roman" w:eastAsia="Times New Roman" w:hAnsi="Times New Roman"/>
+                <w:b/>
+                <w:bCs/>
+                <w:sz w:val="22"/>
+                <w:szCs w:val="22"/>
+              </w:rPr>
+              <w:t xml:space="preserve">检查点</w:t>
+            </w:r>
+          </w:p>
+        </w:tc>
+        <w:tc>
+          <w:tcPr>
+            <w:tcW w:type="dxa" w:w="1755"/>
+            <w:tcBorders>
+              <w:top w:val="single" w:color="CCCCCC" w:sz="1"/>
+              <w:left w:val="single" w:color="CCCCCC" w:sz="1"/>
+              <w:bottom w:val="single" w:color="CCCCCC" w:sz="1"/>
+              <w:right w:val="single" w:color="CCCCCC" w:sz="1"/>
+            </w:tcBorders>
+            <w:shd w:fill="D5E8F0" w:val="clear"/>
+            <w:tcMar>
+              <w:top w:type="dxa" w:w="80"/>
+              <w:left w:type="dxa" w:w="120"/>
+              <w:bottom w:type="dxa" w:w="80"/>
+              <w:right w:type="dxa" w:w="120"/>
+            </w:tcMar>
+            <w:vAlign w:val="center"/>
+          </w:tcPr>
+          <w:p>
+            <w:pPr>
+              <w:jc w:val="center"/>
+            </w:pPr>
+            <w:r>
+              <w:rPr>
+                <w:rFonts w:ascii="Times New Roman" w:cs="Times New Roman" w:eastAsia="Times New Roman" w:hAnsi="Times New Roman"/>
+                <w:b/>
+                <w:bCs/>
+                <w:sz w:val="22"/>
+                <w:szCs w:val="22"/>
+              </w:rPr>
+              <w:t xml:space="preserve">PESQ</w:t>
+            </w:r>
+          </w:p>
+        </w:tc>
+        <w:tc>
+          <w:tcPr>
+            <w:tcW w:type="dxa" w:w="1755"/>
+            <w:tcBorders>
+              <w:top w:val="single" w:color="CCCCCC" w:sz="1"/>
+              <w:left w:val="single" w:color="CCCCCC" w:sz="1"/>
+              <w:bottom w:val="single" w:color="CCCCCC" w:sz="1"/>
+              <w:right w:val="single" w:color="CCCCCC" w:sz="1"/>
+            </w:tcBorders>
+            <w:shd w:fill="D5E8F0" w:val="clear"/>
+            <w:tcMar>
+              <w:top w:type="dxa" w:w="80"/>
+              <w:left w:type="dxa" w:w="120"/>
+              <w:bottom w:type="dxa" w:w="80"/>
+              <w:right w:type="dxa" w:w="120"/>
+            </w:tcMar>
+            <w:vAlign w:val="center"/>
+          </w:tcPr>
+          <w:p>
+            <w:pPr>
+              <w:jc w:val="center"/>
+            </w:pPr>
+            <w:r>
+              <w:rPr>
+                <w:rFonts w:ascii="Times New Roman" w:cs="Times New Roman" w:eastAsia="Times New Roman" w:hAnsi="Times New Roman"/>
+                <w:b/>
+                <w:bCs/>
+                <w:sz w:val="22"/>
+                <w:szCs w:val="22"/>
+              </w:rPr>
+              <w:t xml:space="preserve">STOI</w:t>
+            </w:r>
+          </w:p>
+        </w:tc>
+        <w:tc>
+          <w:tcPr>
+            <w:tcW w:type="dxa" w:w="1755"/>
+            <w:tcBorders>
+              <w:top w:val="single" w:color="CCCCCC" w:sz="1"/>
+              <w:left w:val="single" w:color="CCCCCC" w:sz="1"/>
+              <w:bottom w:val="single" w:color="CCCCCC" w:sz="1"/>
+              <w:right w:val="single" w:color="CCCCCC" w:sz="1"/>
+            </w:tcBorders>
+            <w:shd w:fill="D5E8F0" w:val="clear"/>
+            <w:tcMar>
+              <w:top w:type="dxa" w:w="80"/>
+              <w:left w:type="dxa" w:w="120"/>
+              <w:bottom w:type="dxa" w:w="80"/>
+              <w:right w:type="dxa" w:w="120"/>
+            </w:tcMar>
+            <w:vAlign w:val="center"/>
+          </w:tcPr>
+          <w:p>
+            <w:pPr>
+              <w:jc w:val="center"/>
+            </w:pPr>
+            <w:r>
+              <w:rPr>
+                <w:rFonts w:ascii="Times New Roman" w:cs="Times New Roman" w:eastAsia="Times New Roman" w:hAnsi="Times New Roman"/>
+                <w:b/>
+                <w:bCs/>
+                <w:sz w:val="22"/>
+                <w:szCs w:val="22"/>
+              </w:rPr>
+              <w:t xml:space="preserve">时长准确性</w:t>
+            </w:r>
+          </w:p>
+        </w:tc>
+        <w:tc>
+          <w:tcPr>
+            <w:tcW w:type="dxa" w:w="1755"/>
+            <w:tcBorders>
+              <w:top w:val="single" w:color="CCCCCC" w:sz="1"/>
+              <w:left w:val="single" w:color="CCCCCC" w:sz="1"/>
+              <w:bottom w:val="single" w:color="CCCCCC" w:sz="1"/>
+              <w:right w:val="single" w:color="CCCCCC" w:sz="1"/>
+            </w:tcBorders>
+            <w:shd w:fill="D5E8F0" w:val="clear"/>
+            <w:tcMar>
+              <w:top w:type="dxa" w:w="80"/>
+              <w:left w:type="dxa" w:w="120"/>
+              <w:bottom w:type="dxa" w:w="80"/>
+              <w:right w:type="dxa" w:w="120"/>
+            </w:tcMar>
+            <w:vAlign w:val="center"/>
+          </w:tcPr>
+          <w:p>
+            <w:pPr>
+              <w:jc w:val="center"/>
+            </w:pPr>
+            <w:r>
+              <w:rPr>
+                <w:rFonts w:ascii="Times New Roman" w:cs="Times New Roman" w:eastAsia="Times New Roman" w:hAnsi="Times New Roman"/>
+                <w:b/>
+                <w:bCs/>
+                <w:sz w:val="22"/>
+                <w:szCs w:val="22"/>
+              </w:rPr>
+              <w:t xml:space="preserve">训练Epoch</w:t>
+            </w:r>
+          </w:p>
+        </w:tc>
+      </w:tr>
+      <w:tr>
+        <w:tc>
+          <w:tcPr>
+            <w:tcW w:type="dxa" w:w="2340"/>
+            <w:tcBorders>
+              <w:top w:val="single" w:color="CCCCCC" w:sz="1"/>
+              <w:left w:val="single" w:color="CCCCCC" w:sz="1"/>
+              <w:bottom w:val="single" w:color="CCCCCC" w:sz="1"/>
+              <w:right w:val="single" w:color="CCCCCC" w:sz="1"/>
+            </w:tcBorders>
+            <w:tcMar>
+              <w:top w:type="dxa" w:w="80"/>
+              <w:left w:type="dxa" w:w="120"/>
+              <w:bottom w:type="dxa" w:w="80"/>
+              <w:right w:type="dxa" w:w="120"/>
+            </w:tcMar>
+            <w:vAlign w:val="center"/>
+          </w:tcPr>
+          <w:p>
+            <w:pPr>
+              <w:jc w:val="center"/>
+            </w:pPr>
+            <w:r>
+              <w:rPr>
+                <w:rFonts w:ascii="Times New Roman" w:cs="Times New Roman" w:eastAsia="Times New Roman" w:hAnsi="Times New Roman"/>
+                <w:b w:val="false"/>
+                <w:bCs w:val="false"/>
+                <w:sz w:val="22"/>
+                <w:szCs w:val="22"/>
+              </w:rPr>
+              <w:t xml:space="preserve">Checkpoint 2000</w:t>
+            </w:r>
+          </w:p>
+        </w:tc>
+        <w:tc>
+          <w:tcPr>
+            <w:tcW w:type="dxa" w:w="1755"/>
+            <w:tcBorders>
+              <w:top w:val="single" w:color="CCCCCC" w:sz="1"/>
+              <w:left w:val="single" w:color="CCCCCC" w:sz="1"/>
+              <w:bottom w:val="single" w:color="CCCCCC" w:sz="1"/>
+              <w:right w:val="single" w:color="CCCCCC" w:sz="1"/>
+            </w:tcBorders>
+            <w:tcMar>
+              <w:top w:type="dxa" w:w="80"/>
+              <w:left w:type="dxa" w:w="120"/>
+              <w:bottom w:type="dxa" w:w="80"/>
+              <w:right w:type="dxa" w:w="120"/>
+            </w:tcMar>
+            <w:vAlign w:val="center"/>
+          </w:tcPr>
+          <w:p>
+            <w:pPr>
+              <w:jc w:val="center"/>
+            </w:pPr>
+            <w:r>
+              <w:rPr>
+                <w:rFonts w:ascii="Times New Roman" w:cs="Times New Roman" w:eastAsia="Times New Roman" w:hAnsi="Times New Roman"/>
+                <w:b w:val="false"/>
+                <w:bCs w:val="false"/>
+                <w:sz w:val="22"/>
+                <w:szCs w:val="22"/>
+              </w:rPr>
+              <w:t xml:space="preserve">1.0488</w:t>
+            </w:r>
+          </w:p>
+        </w:tc>
+        <w:tc>
+          <w:tcPr>
+            <w:tcW w:type="dxa" w:w="1755"/>
+            <w:tcBorders>
+              <w:top w:val="single" w:color="CCCCCC" w:sz="1"/>
+              <w:left w:val="single" w:color="CCCCCC" w:sz="1"/>
+              <w:bottom w:val="single" w:color="CCCCCC" w:sz="1"/>
+              <w:right w:val="single" w:color="CCCCCC" w:sz="1"/>
+            </w:tcBorders>
+            <w:tcMar>
+              <w:top w:type="dxa" w:w="80"/>
+              <w:left w:type="dxa" w:w="120"/>
+              <w:bottom w:type="dxa" w:w="80"/>
+              <w:right w:type="dxa" w:w="120"/>
+            </w:tcMar>
+            <w:vAlign w:val="center"/>
+          </w:tcPr>
+          <w:p>
+            <w:pPr>
+              <w:jc w:val="center"/>
+            </w:pPr>
+            <w:r>
+              <w:rPr>
+                <w:rFonts w:ascii="Times New Roman" w:cs="Times New Roman" w:eastAsia="Times New Roman" w:hAnsi="Times New Roman"/>
+                <w:b w:val="false"/>
+                <w:bCs w:val="false"/>
+                <w:sz w:val="22"/>
+                <w:szCs w:val="22"/>
+              </w:rPr>
+              <w:t xml:space="preserve">0.0821</w:t>
+            </w:r>
+          </w:p>
+        </w:tc>
+        <w:tc>
+          <w:tcPr>
+            <w:tcW w:type="dxa" w:w="1755"/>
+            <w:tcBorders>
+              <w:top w:val="single" w:color="CCCCCC" w:sz="1"/>
+              <w:left w:val="single" w:color="CCCCCC" w:sz="1"/>
+              <w:bottom w:val="single" w:color="CCCCCC" w:sz="1"/>
+              <w:right w:val="single" w:color="CCCCCC" w:sz="1"/>
+            </w:tcBorders>
+            <w:tcMar>
+              <w:top w:type="dxa" w:w="80"/>
+              <w:left w:type="dxa" w:w="120"/>
+              <w:bottom w:type="dxa" w:w="80"/>
+              <w:right w:type="dxa" w:w="120"/>
+            </w:tcMar>
+            <w:vAlign w:val="center"/>
+          </w:tcPr>
+          <w:p>
+            <w:pPr>
+              <w:jc w:val="center"/>
+            </w:pPr>
+            <w:r>
+              <w:rPr>
+                <w:rFonts w:ascii="Times New Roman" w:cs="Times New Roman" w:eastAsia="Times New Roman" w:hAnsi="Times New Roman"/>
+                <w:b w:val="false"/>
+                <w:bCs w:val="false"/>
+                <w:sz w:val="22"/>
+                <w:szCs w:val="22"/>
+              </w:rPr>
+              <w:t xml:space="preserve">差</w:t>
+            </w:r>
+          </w:p>
+        </w:tc>
+        <w:tc>
+          <w:tcPr>
+            <w:tcW w:type="dxa" w:w="1755"/>
+            <w:tcBorders>
+              <w:top w:val="single" w:color="CCCCCC" w:sz="1"/>
+              <w:left w:val="single" w:color="CCCCCC" w:sz="1"/>
+              <w:bottom w:val="single" w:color="CCCCCC" w:sz="1"/>
+              <w:right w:val="single" w:color="CCCCCC" w:sz="1"/>
+            </w:tcBorders>
+            <w:tcMar>
+              <w:top w:type="dxa" w:w="80"/>
+              <w:left w:type="dxa" w:w="120"/>
+              <w:bottom w:type="dxa" w:w="80"/>
+              <w:right w:type="dxa" w:w="120"/>
+            </w:tcMar>
+            <w:vAlign w:val="center"/>
+          </w:tcPr>
+          <w:p>
+            <w:pPr>
+              <w:jc w:val="center"/>
+            </w:pPr>
+            <w:r>
+              <w:rPr>
+                <w:rFonts w:ascii="Times New Roman" w:cs="Times New Roman" w:eastAsia="Times New Roman" w:hAnsi="Times New Roman"/>
+                <w:b w:val="false"/>
+                <w:bCs w:val="false"/>
+                <w:sz w:val="22"/>
+                <w:szCs w:val="22"/>
+              </w:rPr>
+              <w:t xml:space="preserve">1</w:t>
+            </w:r>
+          </w:p>
+        </w:tc>
+      </w:tr>
+      <w:tr>
+        <w:tc>
+          <w:tcPr>
+            <w:tcW w:type="dxa" w:w="2340"/>
+            <w:tcBorders>
+              <w:top w:val="single" w:color="CCCCCC" w:sz="1"/>
+              <w:left w:val="single" w:color="CCCCCC" w:sz="1"/>
+              <w:bottom w:val="single" w:color="CCCCCC" w:sz="1"/>
+              <w:right w:val="single" w:color="CCCCCC" w:sz="1"/>
+            </w:tcBorders>
+            <w:tcMar>
+              <w:top w:type="dxa" w:w="80"/>
+              <w:left w:type="dxa" w:w="120"/>
+              <w:bottom w:type="dxa" w:w="80"/>
+              <w:right w:type="dxa" w:w="120"/>
+            </w:tcMar>
+            <w:vAlign w:val="center"/>
+          </w:tcPr>
+          <w:p>
+            <w:pPr>
+              <w:jc w:val="center"/>
+            </w:pPr>
+            <w:r>
+              <w:rPr>
+                <w:rFonts w:ascii="Times New Roman" w:cs="Times New Roman" w:eastAsia="Times New Roman" w:hAnsi="Times New Roman"/>
+                <w:b w:val="false"/>
+                <w:bCs w:val="false"/>
+                <w:sz w:val="22"/>
+                <w:szCs w:val="22"/>
+              </w:rPr>
+              <w:t xml:space="preserve">Checkpoint 5000</w:t>
+            </w:r>
+          </w:p>
+        </w:tc>
+        <w:tc>
+          <w:tcPr>
+            <w:tcW w:type="dxa" w:w="1755"/>
+            <w:tcBorders>
+              <w:top w:val="single" w:color="CCCCCC" w:sz="1"/>
+              <w:left w:val="single" w:color="CCCCCC" w:sz="1"/>
+              <w:bottom w:val="single" w:color="CCCCCC" w:sz="1"/>
+              <w:right w:val="single" w:color="CCCCCC" w:sz="1"/>
+            </w:tcBorders>
+            <w:tcMar>
+              <w:top w:type="dxa" w:w="80"/>
+              <w:left w:type="dxa" w:w="120"/>
+              <w:bottom w:type="dxa" w:w="80"/>
+              <w:right w:type="dxa" w:w="120"/>
+            </w:tcMar>
+            <w:vAlign w:val="center"/>
+          </w:tcPr>
+          <w:p>
+            <w:pPr>
+              <w:jc w:val="center"/>
+            </w:pPr>
+            <w:r>
+              <w:rPr>
+                <w:rFonts w:ascii="Times New Roman" w:cs="Times New Roman" w:eastAsia="Times New Roman" w:hAnsi="Times New Roman"/>
+                <w:b w:val="false"/>
+                <w:bCs w:val="false"/>
+                <w:sz w:val="22"/>
+                <w:szCs w:val="22"/>
+              </w:rPr>
+              <w:t xml:space="preserve">1.0795</w:t>
+            </w:r>
+          </w:p>
+        </w:tc>
+        <w:tc>
+          <w:tcPr>
+            <w:tcW w:type="dxa" w:w="1755"/>
+            <w:tcBorders>
+              <w:top w:val="single" w:color="CCCCCC" w:sz="1"/>
+              <w:left w:val="single" w:color="CCCCCC" w:sz="1"/>
+              <w:bottom w:val="single" w:color="CCCCCC" w:sz="1"/>
+              <w:right w:val="single" w:color="CCCCCC" w:sz="1"/>
+            </w:tcBorders>
+            <w:tcMar>
+              <w:top w:type="dxa" w:w="80"/>
+              <w:left w:type="dxa" w:w="120"/>
+              <w:bottom w:type="dxa" w:w="80"/>
+              <w:right w:type="dxa" w:w="120"/>
+            </w:tcMar>
+            <w:vAlign w:val="center"/>
+          </w:tcPr>
+          <w:p>
+            <w:pPr>
+              <w:jc w:val="center"/>
+            </w:pPr>
+            <w:r>
+              <w:rPr>
+                <w:rFonts w:ascii="Times New Roman" w:cs="Times New Roman" w:eastAsia="Times New Roman" w:hAnsi="Times New Roman"/>
+                <w:b w:val="false"/>
+                <w:bCs w:val="false"/>
+                <w:sz w:val="22"/>
+                <w:szCs w:val="22"/>
+              </w:rPr>
+              <w:t xml:space="preserve">0.1961</w:t>
+            </w:r>
+          </w:p>
+        </w:tc>
+        <w:tc>
+          <w:tcPr>
+            <w:tcW w:type="dxa" w:w="1755"/>
+            <w:tcBorders>
+              <w:top w:val="single" w:color="CCCCCC" w:sz="1"/>
+              <w:left w:val="single" w:color="CCCCCC" w:sz="1"/>
+              <w:bottom w:val="single" w:color="CCCCCC" w:sz="1"/>
+              <w:right w:val="single" w:color="CCCCCC" w:sz="1"/>
+            </w:tcBorders>
+            <w:tcMar>
+              <w:top w:type="dxa" w:w="80"/>
+              <w:left w:type="dxa" w:w="120"/>
+              <w:bottom w:type="dxa" w:w="80"/>
+              <w:right w:type="dxa" w:w="120"/>
+            </w:tcMar>
+            <w:vAlign w:val="center"/>
+          </w:tcPr>
+          <w:p>
+            <w:pPr>
+              <w:jc w:val="center"/>
+            </w:pPr>
+            <w:r>
+              <w:rPr>
+                <w:rFonts w:ascii="Times New Roman" w:cs="Times New Roman" w:eastAsia="Times New Roman" w:hAnsi="Times New Roman"/>
+                <w:b w:val="false"/>
+                <w:bCs w:val="false"/>
+                <w:sz w:val="22"/>
+                <w:szCs w:val="22"/>
+              </w:rPr>
+              <w:t xml:space="preserve">好</w:t>
+            </w:r>
+          </w:p>
+        </w:tc>
+        <w:tc>
+          <w:tcPr>
+            <w:tcW w:type="dxa" w:w="1755"/>
+            <w:tcBorders>
+              <w:top w:val="single" w:color="CCCCCC" w:sz="1"/>
+              <w:left w:val="single" w:color="CCCCCC" w:sz="1"/>
+              <w:bottom w:val="single" w:color="CCCCCC" w:sz="1"/>
+              <w:right w:val="single" w:color="CCCCCC" w:sz="1"/>
+            </w:tcBorders>
+            <w:tcMar>
+              <w:top w:type="dxa" w:w="80"/>
+              <w:left w:type="dxa" w:w="120"/>
+              <w:bottom w:type="dxa" w:w="80"/>
+              <w:right w:type="dxa" w:w="120"/>
+            </w:tcMar>
+            <w:vAlign w:val="center"/>
+          </w:tcPr>
+          <w:p>
+            <w:pPr>
+              <w:jc w:val="center"/>
+            </w:pPr>
+            <w:r>
+              <w:rPr>
+                <w:rFonts w:ascii="Times New Roman" w:cs="Times New Roman" w:eastAsia="Times New Roman" w:hAnsi="Times New Roman"/>
+                <w:b w:val="false"/>
+                <w:bCs w:val="false"/>
+                <w:sz w:val="22"/>
+                <w:szCs w:val="22"/>
+              </w:rPr>
+              <w:t xml:space="preserve">2</w:t>
+            </w:r>
+          </w:p>
+        </w:tc>
+      </w:tr>
+      <w:tr>
+        <w:tc>
+          <w:tcPr>
+            <w:tcW w:type="dxa" w:w="2340"/>
+            <w:tcBorders>
+              <w:top w:val="single" w:color="CCCCCC" w:sz="1"/>
+              <w:left w:val="single" w:color="CCCCCC" w:sz="1"/>
+              <w:bottom w:val="single" w:color="CCCCCC" w:sz="1"/>
+              <w:right w:val="single" w:color="CCCCCC" w:sz="1"/>
+            </w:tcBorders>
+            <w:tcMar>
+              <w:top w:type="dxa" w:w="80"/>
+              <w:left w:type="dxa" w:w="120"/>
+              <w:bottom w:type="dxa" w:w="80"/>
+              <w:right w:type="dxa" w:w="120"/>
+            </w:tcMar>
+            <w:vAlign w:val="center"/>
+          </w:tcPr>
+          <w:p>
+            <w:pPr>
+              <w:jc w:val="center"/>
+            </w:pPr>
+            <w:r>
+              <w:rPr>
+                <w:rFonts w:ascii="Times New Roman" w:cs="Times New Roman" w:eastAsia="Times New Roman" w:hAnsi="Times New Roman"/>
+                <w:b w:val="false"/>
+                <w:bCs w:val="false"/>
+                <w:sz w:val="22"/>
+                <w:szCs w:val="22"/>
+              </w:rPr>
+              <w:t xml:space="preserve">Checkpoint 6500</w:t>
+            </w:r>
+          </w:p>
+        </w:tc>
+        <w:tc>
+          <w:tcPr>
+            <w:tcW w:type="dxa" w:w="1755"/>
+            <w:tcBorders>
+              <w:top w:val="single" w:color="CCCCCC" w:sz="1"/>
+              <w:left w:val="single" w:color="CCCCCC" w:sz="1"/>
+              <w:bottom w:val="single" w:color="CCCCCC" w:sz="1"/>
+              <w:right w:val="single" w:color="CCCCCC" w:sz="1"/>
+            </w:tcBorders>
+            <w:tcMar>
+              <w:top w:type="dxa" w:w="80"/>
+              <w:left w:type="dxa" w:w="120"/>
+              <w:bottom w:type="dxa" w:w="80"/>
+              <w:right w:type="dxa" w:w="120"/>
+            </w:tcMar>
+            <w:vAlign w:val="center"/>
+          </w:tcPr>
+          <w:p>
+            <w:pPr>
+              <w:jc w:val="center"/>
+            </w:pPr>
+            <w:r>
+              <w:rPr>
+                <w:rFonts w:ascii="Times New Roman" w:cs="Times New Roman" w:eastAsia="Times New Roman" w:hAnsi="Times New Roman"/>
+                <w:b w:val="false"/>
+                <w:bCs w:val="false"/>
+                <w:sz w:val="22"/>
+                <w:szCs w:val="22"/>
+              </w:rPr>
+              <w:t xml:space="preserve">1.0729</w:t>
+            </w:r>
+          </w:p>
+        </w:tc>
+        <w:tc>
+          <w:tcPr>
+            <w:tcW w:type="dxa" w:w="1755"/>
+            <w:tcBorders>
+              <w:top w:val="single" w:color="CCCCCC" w:sz="1"/>
+              <w:left w:val="single" w:color="CCCCCC" w:sz="1"/>
+              <w:bottom w:val="single" w:color="CCCCCC" w:sz="1"/>
+              <w:right w:val="single" w:color="CCCCCC" w:sz="1"/>
+            </w:tcBorders>
+            <w:tcMar>
+              <w:top w:type="dxa" w:w="80"/>
+              <w:left w:type="dxa" w:w="120"/>
+              <w:bottom w:type="dxa" w:w="80"/>
+              <w:right w:type="dxa" w:w="120"/>
+            </w:tcMar>
+            <w:vAlign w:val="center"/>
+          </w:tcPr>
+          <w:p>
+            <w:pPr>
+              <w:jc w:val="center"/>
+            </w:pPr>
+            <w:r>
+              <w:rPr>
+                <w:rFonts w:ascii="Times New Roman" w:cs="Times New Roman" w:eastAsia="Times New Roman" w:hAnsi="Times New Roman"/>
+                <w:b w:val="false"/>
+                <w:bCs w:val="false"/>
+                <w:sz w:val="22"/>
+                <w:szCs w:val="22"/>
+              </w:rPr>
+              <w:t xml:space="preserve">0.2185</w:t>
+            </w:r>
+          </w:p>
+        </w:tc>
+        <w:tc>
+          <w:tcPr>
+            <w:tcW w:type="dxa" w:w="1755"/>
+            <w:tcBorders>
+              <w:top w:val="single" w:color="CCCCCC" w:sz="1"/>
+              <w:left w:val="single" w:color="CCCCCC" w:sz="1"/>
+              <w:bottom w:val="single" w:color="CCCCCC" w:sz="1"/>
+              <w:right w:val="single" w:color="CCCCCC" w:sz="1"/>
+            </w:tcBorders>
+            <w:tcMar>
+              <w:top w:type="dxa" w:w="80"/>
+              <w:left w:type="dxa" w:w="120"/>
+              <w:bottom w:type="dxa" w:w="80"/>
+              <w:right w:type="dxa" w:w="120"/>
+            </w:tcMar>
+            <w:vAlign w:val="center"/>
+          </w:tcPr>
+          <w:p>
+            <w:pPr>
+              <w:jc w:val="center"/>
+            </w:pPr>
+            <w:r>
+              <w:rPr>
+                <w:rFonts w:ascii="Times New Roman" w:cs="Times New Roman" w:eastAsia="Times New Roman" w:hAnsi="Times New Roman"/>
+                <w:b w:val="false"/>
+                <w:bCs w:val="false"/>
+                <w:sz w:val="22"/>
+                <w:szCs w:val="22"/>
+              </w:rPr>
+              <w:t xml:space="preserve">好</w:t>
+            </w:r>
+          </w:p>
+        </w:tc>
+        <w:tc>
+          <w:tcPr>
+            <w:tcW w:type="dxa" w:w="1755"/>
+            <w:tcBorders>
+              <w:top w:val="single" w:color="CCCCCC" w:sz="1"/>
+              <w:left w:val="single" w:color="CCCCCC" w:sz="1"/>
+              <w:bottom w:val="single" w:color="CCCCCC" w:sz="1"/>
+              <w:right w:val="single" w:color="CCCCCC" w:sz="1"/>
+            </w:tcBorders>
+            <w:tcMar>
+              <w:top w:type="dxa" w:w="80"/>
+              <w:left w:type="dxa" w:w="120"/>
+              <w:bottom w:type="dxa" w:w="80"/>
+              <w:right w:type="dxa" w:w="120"/>
+            </w:tcMar>
+            <w:vAlign w:val="center"/>
+          </w:tcPr>
+          <w:p>
+            <w:pPr>
+              <w:jc w:val="center"/>
+            </w:pPr>
+            <w:r>
+              <w:rPr>
+                <w:rFonts w:ascii="Times New Roman" w:cs="Times New Roman" w:eastAsia="Times New Roman" w:hAnsi="Times New Roman"/>
+                <w:b w:val="false"/>
+                <w:bCs w:val="false"/>
+                <w:sz w:val="22"/>
+                <w:szCs w:val="22"/>
+              </w:rPr>
+              <w:t xml:space="preserve">3</w:t>
+            </w:r>
+          </w:p>
+        </w:tc>
+      </w:tr>
+    </w:tbl>
+    <w:p>
+      <w:pPr>
+        <w:spacing w:after="120" w:before="240"/>
+        <w:jc w:val="center"/>
+      </w:pPr>
+      <w:r>
+        <w:drawing>
+          <wp:inline distT="0" distB="0" distL="0" distR="0">
+            <wp:extent cx="4572000" cy="2667000"/>
+            <wp:effectExtent t="0" r="0" b="0" l="0"/>
+            <wp:docPr id="1" name="vctk_duration_comparison.png" descr="vctk_duration_comparison.png" title="vctk_duration_comparison.png"/>
+            <wp:cNvGraphicFramePr>
+              <a:graphicFrameLocks xmlns:a="http://schemas.openxmlformats.org/drawingml/2006/main" noChangeAspect="1"/>
+            </wp:cNvGraphicFramePr>
+            <a:graphic xmlns:a="http://schemas.openxmlformats.org/drawingml/2006/main">
+              <a:graphicData uri="http://schemas.openxmlformats.org/drawingml/2006/picture">
+                <pic:pic xmlns:pic="http://schemas.openxmlformats.org/drawingml/2006/picture">
+                  <pic:nvPicPr>
+                    <pic:cNvPr id="0" name="" descr=""/>
+                    <pic:cNvPicPr>
+                      <a:picLocks noChangeAspect="1" noChangeArrowheads="1"/>
+                    </pic:cNvPicPr>
+                  </pic:nvPicPr>
+                  <pic:blipFill>
+                    <a:blip r:embed="rId18" cstate="none"/>
+                    <a:srcRect/>
+                    <a:stretch>
+                      <a:fillRect/>
+                    </a:stretch>
+                  </pic:blipFill>
+                  <pic:spPr bwMode="auto">
+                    <a:xfrm>
+                      <a:off x="0" y="0"/>
+                      <a:ext cx="4572000" cy="2667000"/>
+                    </a:xfrm>
+                    <a:prstGeom prst="rect">
+                      <a:avLst/>
+                    </a:prstGeom>
+                  </pic:spPr>
+                </pic:pic>
+              </a:graphicData>
+            </a:graphic>
+          </wp:inline>
+        </w:drawing>
+      </w:r>
+    </w:p>
+    <w:p>
+      <w:pPr>
+        <w:spacing w:after="240"/>
+        <w:jc w:val="center"/>
+      </w:pPr>
+      <w:r>
+        <w:rPr>
+          <w:rFonts w:ascii="Times New Roman" w:cs="Times New Roman" w:eastAsia="Times New Roman" w:hAnsi="Times New Roman"/>
+          <w:sz w:val="20"/>
+          <w:szCs w:val="20"/>
+        </w:rPr>
+        <w:t xml:space="preserve">图 5-3  VCTK微调检查点音频时长对比</w:t>
+      </w:r>
+    </w:p>
+    <w:p>
+      <w:pPr>
+        <w:spacing w:after="120" w:line="360"/>
+        <w:jc w:val="both"/>
+      </w:pPr>
+      <w:r>
+        <w:rPr>
+          <w:rFonts w:ascii="Times New Roman" w:cs="Times New Roman" w:eastAsia="Times New Roman" w:hAnsi="Times New Roman"/>
+          <w:b w:val="false"/>
+          <w:bCs w:val="false"/>
+          <w:sz w:val="22"/>
+          <w:szCs w:val="22"/>
+        </w:rPr>
+        <w:t xml:space="preserve">在音频时长预测方面，微调效果尤为显著。初始的 Checkpoint 2000 生成的音频时长与参考音频差异较大，偏差可达 6 秒以上。随着训练的进行，模型逐渐学会了 LJSpeech 数据集的时长分布。到 Checkpoint 6500 时，音频时长预测的误差已降低到 1 秒以内，与参考音频高度一致。</w:t>
+      </w:r>
+    </w:p>
+    <w:p>
+      <w:pPr>
+        <w:pStyle w:val="Heading2"/>
+        <w:spacing w:after="120" w:before="240"/>
+      </w:pPr>
+      <w:r>
+        <w:rPr>
+          <w:rFonts w:ascii="Times New Roman" w:cs="Times New Roman" w:eastAsia="Times New Roman" w:hAnsi="Times New Roman"/>
+          <w:b/>
+          <w:bCs/>
+        </w:rPr>
+        <w:t xml:space="preserve">5.4  结果分析</w:t>
       </w:r>
     </w:p>
     <w:p>
@@ -3086,6 +4083,22 @@
           <w:szCs w:val="22"/>
         </w:rPr>
         <w:t xml:space="preserve">从主观听感来看，合成语音具有较高的自然度和清晰度。语音的韵律、节奏和语调都较为自然，没有明显的机械感或失真。这得益于 VITS 模型的端到端设计和 HiFi-GAN 声码器的高质量波形生成能力。此外，模型对不同类型的文本都表现出较好的适应性，无论是简单句还是复杂句，都能生成流畅自然的语音。</w:t>
+      </w:r>
+    </w:p>
+    <w:p>
+      <w:pPr>
+        <w:spacing w:after="120" w:line="360"/>
+        <w:jc w:val="both"/>
+      </w:pPr>
+      <w:r>
+        <w:rPr>
+          <w:rFonts w:ascii="Times New Roman" w:cs="Times New Roman" w:eastAsia="Times New Roman" w:hAnsi="Times New Roman"/>
+          <w:b w:val="false"/>
+          <w:bCs w:val="false"/>
+          <w:sz w:val="22"/>
+          <w:szCs w:val="22"/>
+        </w:rPr>
+        <w:t xml:space="preserve">VCTK 微调实验的结果表明，跨数据集迁移学习在语音合成领域是可行的。尽管 VCTK 是多说话人模型，而 LJSpeech 是单说话人数据集，但通过适当的微调策略，模型能够成功适应目标数据集的特征。这一发现为未来的语音合成研究提供了有价值的参考，特别是在数据稀缺的场景下，可以利用大规模数据集预训练的模型进行迁移学习。</w:t>
       </w:r>
     </w:p>
     <w:p>

</xml_diff>